<commit_message>
[PLAN-github-research-graphify] Bước 3A.1: Viết bảng đề xuất cải tiến KZTEK (Mode A)
- Thêm mục §11 "Đề xuất cải tiến KZTEK (Mode A)" vào RESEARCH-graphify-2026-07-29.md
- 5 đề xuất P1–P5 với đầy đủ 7 trường: hiện trạng, nguồn học, lý do, áp dụng vào đâu, đạt được gì, rủi ro/effort
- Xuất lại DOCX (PDF thất bại do thiếu converter — không block)
- Cập nhật STEP-3A.1: status done, Handoff Log đầy đủ
- Cập nhật PLAN-MASTER: Bước 2.3 ⏭️, Bước 3A.1 ✅

Plan: docs/plans/PLAN-github-research-graphify-2026-07-29/steps/STEP-3A.1-de-xuat-cai-tien.md
</commit_message>
<xml_diff>
--- a/docs/research/RESEARCH-graphify-2026-07-29.docx
+++ b/docs/research/RESEARCH-graphify-2026-07-29.docx
@@ -4634,6 +4634,3936 @@
           <w:sz w:val="21"/>
         </w:rPr>
         <w:t>Báo cáo này thuộc Bước 3 WF-GITHUB-RESEARCH — phân tích trung lập. Đề xuất áp dụng vào KZTEK (Mode A, Bước 3A.1) sẽ được viết riêng sau khi user xác nhận tiếp tục.</w:t>
+      </w:r>
+    </w:p>
+    <w:p>
+      <w:pPr>
+        <w:pBdr>
+          <w:bottom w:val="single" w:sz="6" w:space="1" w:color="F05922"/>
+        </w:pBdr>
+        <w:spacing w:after="120"/>
+      </w:pPr>
+    </w:p>
+    <w:p>
+      <w:pPr>
+        <w:pStyle w:val="Heading2"/>
+        <w:spacing w:before="200" w:after="80"/>
+      </w:pPr>
+      <w:r>
+        <w:rPr>
+          <w:color w:val="F05922"/>
+          <w:sz w:val="28"/>
+        </w:rPr>
+        <w:t>11. Đề xuất cải tiến KZTEK (Mode A — Bước 3A.1)</w:t>
+      </w:r>
+    </w:p>
+    <w:p>
+      <w:pPr>
+        <w:spacing w:before="40" w:after="40"/>
+        <w:ind w:left="567"/>
+        <w:pBdr>
+          <w:left w:val="single" w:sz="12" w:space="10" w:color="F05922"/>
+        </w:pBdr>
+      </w:pPr>
+      <w:r>
+        <w:rPr>
+          <w:color w:val="4A3F8C"/>
+        </w:rPr>
+        <w:t xml:space="preserve">Dựa trên phân tích ở các mục trên. Mỗi đề xuất độc lập — user có thể chọn 0, 1, hoặc nhiều đề xuất để áp dụng ở bước tiếp theo (Bước 3A.2). </w:t>
+      </w:r>
+      <w:r>
+        <w:rPr>
+          <w:b/>
+          <w:color w:val="4A3F8C"/>
+        </w:rPr>
+        <w:t>CHƯA áp dụng bất kỳ thay đổi nào vào codebase KZTEK ở bước này.</w:t>
+      </w:r>
+    </w:p>
+    <w:p>
+      <w:pPr>
+        <w:pStyle w:val="Heading3"/>
+        <w:spacing w:before="160" w:after="60"/>
+      </w:pPr>
+      <w:r>
+        <w:rPr>
+          <w:color w:val="4A3F8C"/>
+          <w:sz w:val="24"/>
+        </w:rPr>
+        <w:t>Bảng tổng quan nhanh</w:t>
+      </w:r>
+    </w:p>
+    <w:tbl>
+      <w:tblPr>
+        <w:tblStyle w:val="TableGrid"/>
+        <w:tblW w:type="auto" w:w="0"/>
+        <w:tblLook w:firstColumn="1" w:firstRow="1" w:lastColumn="0" w:lastRow="0" w:noHBand="0" w:noVBand="1" w:val="04A0"/>
+      </w:tblPr>
+      <w:tblGrid>
+        <w:gridCol w:w="1938"/>
+        <w:gridCol w:w="1938"/>
+        <w:gridCol w:w="1938"/>
+        <w:gridCol w:w="1938"/>
+        <w:gridCol w:w="1938"/>
+      </w:tblGrid>
+      <w:tr>
+        <w:tc>
+          <w:tcPr>
+            <w:tcW w:type="dxa" w:w="1938"/>
+            <w:shd w:val="clear" w:color="auto" w:fill="251C53"/>
+            <w:tcBorders>
+              <w:top w:val="single" w:sz="4" w:space="0" w:color="251C53"/>
+              <w:left w:val="single" w:sz="4" w:space="0" w:color="251C53"/>
+              <w:bottom w:val="single" w:sz="4" w:space="0" w:color="251C53"/>
+              <w:right w:val="single" w:sz="4" w:space="0" w:color="251C53"/>
+            </w:tcBorders>
+          </w:tcPr>
+          <w:p>
+            <w:r>
+              <w:rPr>
+                <w:b/>
+                <w:color w:val="FFFFFF"/>
+                <w:sz w:val="20"/>
+              </w:rPr>
+              <w:t>#</w:t>
+            </w:r>
+          </w:p>
+        </w:tc>
+        <w:tc>
+          <w:tcPr>
+            <w:tcW w:type="dxa" w:w="1938"/>
+            <w:shd w:val="clear" w:color="auto" w:fill="251C53"/>
+            <w:tcBorders>
+              <w:top w:val="single" w:sz="4" w:space="0" w:color="251C53"/>
+              <w:left w:val="single" w:sz="4" w:space="0" w:color="251C53"/>
+              <w:bottom w:val="single" w:sz="4" w:space="0" w:color="251C53"/>
+              <w:right w:val="single" w:sz="4" w:space="0" w:color="251C53"/>
+            </w:tcBorders>
+          </w:tcPr>
+          <w:p>
+            <w:r>
+              <w:rPr>
+                <w:b/>
+                <w:color w:val="FFFFFF"/>
+                <w:sz w:val="20"/>
+              </w:rPr>
+              <w:t>Đề xuất</w:t>
+            </w:r>
+          </w:p>
+        </w:tc>
+        <w:tc>
+          <w:tcPr>
+            <w:tcW w:type="dxa" w:w="1938"/>
+            <w:shd w:val="clear" w:color="auto" w:fill="251C53"/>
+            <w:tcBorders>
+              <w:top w:val="single" w:sz="4" w:space="0" w:color="251C53"/>
+              <w:left w:val="single" w:sz="4" w:space="0" w:color="251C53"/>
+              <w:bottom w:val="single" w:sz="4" w:space="0" w:color="251C53"/>
+              <w:right w:val="single" w:sz="4" w:space="0" w:color="251C53"/>
+            </w:tcBorders>
+          </w:tcPr>
+          <w:p>
+            <w:r>
+              <w:rPr>
+                <w:b/>
+                <w:color w:val="FFFFFF"/>
+                <w:sz w:val="20"/>
+              </w:rPr>
+              <w:t>Effort</w:t>
+            </w:r>
+          </w:p>
+        </w:tc>
+        <w:tc>
+          <w:tcPr>
+            <w:tcW w:type="dxa" w:w="1938"/>
+            <w:shd w:val="clear" w:color="auto" w:fill="251C53"/>
+            <w:tcBorders>
+              <w:top w:val="single" w:sz="4" w:space="0" w:color="251C53"/>
+              <w:left w:val="single" w:sz="4" w:space="0" w:color="251C53"/>
+              <w:bottom w:val="single" w:sz="4" w:space="0" w:color="251C53"/>
+              <w:right w:val="single" w:sz="4" w:space="0" w:color="251C53"/>
+            </w:tcBorders>
+          </w:tcPr>
+          <w:p>
+            <w:r>
+              <w:rPr>
+                <w:b/>
+                <w:color w:val="FFFFFF"/>
+                <w:sz w:val="20"/>
+              </w:rPr>
+              <w:t>Phụ thuộc ngoài</w:t>
+            </w:r>
+          </w:p>
+        </w:tc>
+        <w:tc>
+          <w:tcPr>
+            <w:tcW w:type="dxa" w:w="1938"/>
+            <w:shd w:val="clear" w:color="auto" w:fill="251C53"/>
+            <w:tcBorders>
+              <w:top w:val="single" w:sz="4" w:space="0" w:color="251C53"/>
+              <w:left w:val="single" w:sz="4" w:space="0" w:color="251C53"/>
+              <w:bottom w:val="single" w:sz="4" w:space="0" w:color="251C53"/>
+              <w:right w:val="single" w:sz="4" w:space="0" w:color="251C53"/>
+            </w:tcBorders>
+          </w:tcPr>
+          <w:p>
+            <w:r>
+              <w:rPr>
+                <w:b/>
+                <w:color w:val="FFFFFF"/>
+                <w:sz w:val="20"/>
+              </w:rPr>
+              <w:t>Áp dụng ngay?</w:t>
+            </w:r>
+          </w:p>
+        </w:tc>
+      </w:tr>
+      <w:tr>
+        <w:tc>
+          <w:tcPr>
+            <w:tcW w:type="dxa" w:w="1938"/>
+            <w:tcBorders>
+              <w:top w:val="single" w:sz="4" w:space="0" w:color="CBCBCB"/>
+              <w:left w:val="single" w:sz="4" w:space="0" w:color="CBCBCB"/>
+              <w:bottom w:val="single" w:sz="4" w:space="0" w:color="CBCBCB"/>
+              <w:right w:val="single" w:sz="4" w:space="0" w:color="CBCBCB"/>
+            </w:tcBorders>
+          </w:tcPr>
+          <w:p>
+            <w:r>
+              <w:rPr>
+                <w:sz w:val="20"/>
+              </w:rPr>
+              <w:t>---</w:t>
+            </w:r>
+          </w:p>
+        </w:tc>
+        <w:tc>
+          <w:tcPr>
+            <w:tcW w:type="dxa" w:w="1938"/>
+            <w:tcBorders>
+              <w:top w:val="single" w:sz="4" w:space="0" w:color="CBCBCB"/>
+              <w:left w:val="single" w:sz="4" w:space="0" w:color="CBCBCB"/>
+              <w:bottom w:val="single" w:sz="4" w:space="0" w:color="CBCBCB"/>
+              <w:right w:val="single" w:sz="4" w:space="0" w:color="CBCBCB"/>
+            </w:tcBorders>
+          </w:tcPr>
+          <w:p>
+            <w:r>
+              <w:rPr>
+                <w:sz w:val="20"/>
+              </w:rPr>
+              <w:t>---------</w:t>
+            </w:r>
+          </w:p>
+        </w:tc>
+        <w:tc>
+          <w:tcPr>
+            <w:tcW w:type="dxa" w:w="1938"/>
+            <w:tcBorders>
+              <w:top w:val="single" w:sz="4" w:space="0" w:color="CBCBCB"/>
+              <w:left w:val="single" w:sz="4" w:space="0" w:color="CBCBCB"/>
+              <w:bottom w:val="single" w:sz="4" w:space="0" w:color="CBCBCB"/>
+              <w:right w:val="single" w:sz="4" w:space="0" w:color="CBCBCB"/>
+            </w:tcBorders>
+          </w:tcPr>
+          <w:p>
+            <w:r>
+              <w:rPr>
+                <w:sz w:val="20"/>
+              </w:rPr>
+              <w:t>--------</w:t>
+            </w:r>
+          </w:p>
+        </w:tc>
+        <w:tc>
+          <w:tcPr>
+            <w:tcW w:type="dxa" w:w="1938"/>
+            <w:tcBorders>
+              <w:top w:val="single" w:sz="4" w:space="0" w:color="CBCBCB"/>
+              <w:left w:val="single" w:sz="4" w:space="0" w:color="CBCBCB"/>
+              <w:bottom w:val="single" w:sz="4" w:space="0" w:color="CBCBCB"/>
+              <w:right w:val="single" w:sz="4" w:space="0" w:color="CBCBCB"/>
+            </w:tcBorders>
+          </w:tcPr>
+          <w:p>
+            <w:r>
+              <w:rPr>
+                <w:sz w:val="20"/>
+              </w:rPr>
+              <w:t>-----------------</w:t>
+            </w:r>
+          </w:p>
+        </w:tc>
+        <w:tc>
+          <w:tcPr>
+            <w:tcW w:type="dxa" w:w="1938"/>
+            <w:tcBorders>
+              <w:top w:val="single" w:sz="4" w:space="0" w:color="CBCBCB"/>
+              <w:left w:val="single" w:sz="4" w:space="0" w:color="CBCBCB"/>
+              <w:bottom w:val="single" w:sz="4" w:space="0" w:color="CBCBCB"/>
+              <w:right w:val="single" w:sz="4" w:space="0" w:color="CBCBCB"/>
+            </w:tcBorders>
+          </w:tcPr>
+          <w:p>
+            <w:r>
+              <w:rPr>
+                <w:sz w:val="20"/>
+              </w:rPr>
+              <w:t>---------------</w:t>
+            </w:r>
+          </w:p>
+        </w:tc>
+      </w:tr>
+      <w:tr>
+        <w:tc>
+          <w:tcPr>
+            <w:tcW w:type="dxa" w:w="1938"/>
+            <w:shd w:val="clear" w:color="auto" w:fill="B8B3D6"/>
+            <w:tcBorders>
+              <w:top w:val="single" w:sz="4" w:space="0" w:color="CBCBCB"/>
+              <w:left w:val="single" w:sz="4" w:space="0" w:color="CBCBCB"/>
+              <w:bottom w:val="single" w:sz="4" w:space="0" w:color="CBCBCB"/>
+              <w:right w:val="single" w:sz="4" w:space="0" w:color="CBCBCB"/>
+            </w:tcBorders>
+          </w:tcPr>
+          <w:p>
+            <w:r>
+              <w:rPr>
+                <w:sz w:val="20"/>
+              </w:rPr>
+              <w:t>P1</w:t>
+            </w:r>
+          </w:p>
+        </w:tc>
+        <w:tc>
+          <w:tcPr>
+            <w:tcW w:type="dxa" w:w="1938"/>
+            <w:shd w:val="clear" w:color="auto" w:fill="B8B3D6"/>
+            <w:tcBorders>
+              <w:top w:val="single" w:sz="4" w:space="0" w:color="CBCBCB"/>
+              <w:left w:val="single" w:sz="4" w:space="0" w:color="CBCBCB"/>
+              <w:bottom w:val="single" w:sz="4" w:space="0" w:color="CBCBCB"/>
+              <w:right w:val="single" w:sz="4" w:space="0" w:color="CBCBCB"/>
+            </w:tcBorders>
+          </w:tcPr>
+          <w:p>
+            <w:r>
+              <w:rPr>
+                <w:sz w:val="20"/>
+              </w:rPr>
+              <w:t>Tích hợp Graphify CLI vào workflow coding</w:t>
+            </w:r>
+          </w:p>
+        </w:tc>
+        <w:tc>
+          <w:tcPr>
+            <w:tcW w:type="dxa" w:w="1938"/>
+            <w:shd w:val="clear" w:color="auto" w:fill="B8B3D6"/>
+            <w:tcBorders>
+              <w:top w:val="single" w:sz="4" w:space="0" w:color="CBCBCB"/>
+              <w:left w:val="single" w:sz="4" w:space="0" w:color="CBCBCB"/>
+              <w:bottom w:val="single" w:sz="4" w:space="0" w:color="CBCBCB"/>
+              <w:right w:val="single" w:sz="4" w:space="0" w:color="CBCBCB"/>
+            </w:tcBorders>
+          </w:tcPr>
+          <w:p>
+            <w:r>
+              <w:rPr>
+                <w:sz w:val="20"/>
+              </w:rPr>
+              <w:t>Trung bình (1–2 ngày)</w:t>
+            </w:r>
+          </w:p>
+        </w:tc>
+        <w:tc>
+          <w:tcPr>
+            <w:tcW w:type="dxa" w:w="1938"/>
+            <w:shd w:val="clear" w:color="auto" w:fill="B8B3D6"/>
+            <w:tcBorders>
+              <w:top w:val="single" w:sz="4" w:space="0" w:color="CBCBCB"/>
+              <w:left w:val="single" w:sz="4" w:space="0" w:color="CBCBCB"/>
+              <w:bottom w:val="single" w:sz="4" w:space="0" w:color="CBCBCB"/>
+              <w:right w:val="single" w:sz="4" w:space="0" w:color="CBCBCB"/>
+            </w:tcBorders>
+          </w:tcPr>
+          <w:p>
+            <w:r>
+              <w:rPr>
+                <w:sz w:val="20"/>
+              </w:rPr>
+              <w:t xml:space="preserve">Python 3.10+, </w:t>
+            </w:r>
+            <w:r>
+              <w:rPr>
+                <w:rFonts w:ascii="Courier New" w:hAnsi="Courier New"/>
+                <w:color w:val="F05922"/>
+                <w:sz w:val="20"/>
+              </w:rPr>
+              <w:t>pip install graphify</w:t>
+            </w:r>
+          </w:p>
+        </w:tc>
+        <w:tc>
+          <w:tcPr>
+            <w:tcW w:type="dxa" w:w="1938"/>
+            <w:shd w:val="clear" w:color="auto" w:fill="B8B3D6"/>
+            <w:tcBorders>
+              <w:top w:val="single" w:sz="4" w:space="0" w:color="CBCBCB"/>
+              <w:left w:val="single" w:sz="4" w:space="0" w:color="CBCBCB"/>
+              <w:bottom w:val="single" w:sz="4" w:space="0" w:color="CBCBCB"/>
+              <w:right w:val="single" w:sz="4" w:space="0" w:color="CBCBCB"/>
+            </w:tcBorders>
+          </w:tcPr>
+          <w:p>
+            <w:r>
+              <w:rPr>
+                <w:sz w:val="20"/>
+              </w:rPr>
+              <w:t>Khi có C# product codebase</w:t>
+            </w:r>
+          </w:p>
+        </w:tc>
+      </w:tr>
+      <w:tr>
+        <w:tc>
+          <w:tcPr>
+            <w:tcW w:type="dxa" w:w="1938"/>
+            <w:tcBorders>
+              <w:top w:val="single" w:sz="4" w:space="0" w:color="CBCBCB"/>
+              <w:left w:val="single" w:sz="4" w:space="0" w:color="CBCBCB"/>
+              <w:bottom w:val="single" w:sz="4" w:space="0" w:color="CBCBCB"/>
+              <w:right w:val="single" w:sz="4" w:space="0" w:color="CBCBCB"/>
+            </w:tcBorders>
+          </w:tcPr>
+          <w:p>
+            <w:r>
+              <w:rPr>
+                <w:sz w:val="20"/>
+              </w:rPr>
+              <w:t>P2</w:t>
+            </w:r>
+          </w:p>
+        </w:tc>
+        <w:tc>
+          <w:tcPr>
+            <w:tcW w:type="dxa" w:w="1938"/>
+            <w:tcBorders>
+              <w:top w:val="single" w:sz="4" w:space="0" w:color="CBCBCB"/>
+              <w:left w:val="single" w:sz="4" w:space="0" w:color="CBCBCB"/>
+              <w:bottom w:val="single" w:sz="4" w:space="0" w:color="CBCBCB"/>
+              <w:right w:val="single" w:sz="4" w:space="0" w:color="CBCBCB"/>
+            </w:tcBorders>
+          </w:tcPr>
+          <w:p>
+            <w:r>
+              <w:rPr>
+                <w:sz w:val="20"/>
+              </w:rPr>
+              <w:t>Cải tiến §17: "Query-first checklist" có cấu trúc</w:t>
+            </w:r>
+          </w:p>
+        </w:tc>
+        <w:tc>
+          <w:tcPr>
+            <w:tcW w:type="dxa" w:w="1938"/>
+            <w:tcBorders>
+              <w:top w:val="single" w:sz="4" w:space="0" w:color="CBCBCB"/>
+              <w:left w:val="single" w:sz="4" w:space="0" w:color="CBCBCB"/>
+              <w:bottom w:val="single" w:sz="4" w:space="0" w:color="CBCBCB"/>
+              <w:right w:val="single" w:sz="4" w:space="0" w:color="CBCBCB"/>
+            </w:tcBorders>
+          </w:tcPr>
+          <w:p>
+            <w:r>
+              <w:rPr>
+                <w:sz w:val="20"/>
+              </w:rPr>
+              <w:t>Thấp (2–4 giờ)</w:t>
+            </w:r>
+          </w:p>
+        </w:tc>
+        <w:tc>
+          <w:tcPr>
+            <w:tcW w:type="dxa" w:w="1938"/>
+            <w:tcBorders>
+              <w:top w:val="single" w:sz="4" w:space="0" w:color="CBCBCB"/>
+              <w:left w:val="single" w:sz="4" w:space="0" w:color="CBCBCB"/>
+              <w:bottom w:val="single" w:sz="4" w:space="0" w:color="CBCBCB"/>
+              <w:right w:val="single" w:sz="4" w:space="0" w:color="CBCBCB"/>
+            </w:tcBorders>
+          </w:tcPr>
+          <w:p>
+            <w:r>
+              <w:rPr>
+                <w:sz w:val="20"/>
+              </w:rPr>
+              <w:t>Không có</w:t>
+            </w:r>
+          </w:p>
+        </w:tc>
+        <w:tc>
+          <w:tcPr>
+            <w:tcW w:type="dxa" w:w="1938"/>
+            <w:tcBorders>
+              <w:top w:val="single" w:sz="4" w:space="0" w:color="CBCBCB"/>
+              <w:left w:val="single" w:sz="4" w:space="0" w:color="CBCBCB"/>
+              <w:bottom w:val="single" w:sz="4" w:space="0" w:color="CBCBCB"/>
+              <w:right w:val="single" w:sz="4" w:space="0" w:color="CBCBCB"/>
+            </w:tcBorders>
+          </w:tcPr>
+          <w:p>
+            <w:r>
+              <w:rPr>
+                <w:sz w:val="20"/>
+              </w:rPr>
+              <w:t>Ngay — với cả markdown codebase hiện tại</w:t>
+            </w:r>
+          </w:p>
+        </w:tc>
+      </w:tr>
+      <w:tr>
+        <w:tc>
+          <w:tcPr>
+            <w:tcW w:type="dxa" w:w="1938"/>
+            <w:shd w:val="clear" w:color="auto" w:fill="B8B3D6"/>
+            <w:tcBorders>
+              <w:top w:val="single" w:sz="4" w:space="0" w:color="CBCBCB"/>
+              <w:left w:val="single" w:sz="4" w:space="0" w:color="CBCBCB"/>
+              <w:bottom w:val="single" w:sz="4" w:space="0" w:color="CBCBCB"/>
+              <w:right w:val="single" w:sz="4" w:space="0" w:color="CBCBCB"/>
+            </w:tcBorders>
+          </w:tcPr>
+          <w:p>
+            <w:r>
+              <w:rPr>
+                <w:sz w:val="20"/>
+              </w:rPr>
+              <w:t>P3</w:t>
+            </w:r>
+          </w:p>
+        </w:tc>
+        <w:tc>
+          <w:tcPr>
+            <w:tcW w:type="dxa" w:w="1938"/>
+            <w:shd w:val="clear" w:color="auto" w:fill="B8B3D6"/>
+            <w:tcBorders>
+              <w:top w:val="single" w:sz="4" w:space="0" w:color="CBCBCB"/>
+              <w:left w:val="single" w:sz="4" w:space="0" w:color="CBCBCB"/>
+              <w:bottom w:val="single" w:sz="4" w:space="0" w:color="CBCBCB"/>
+              <w:right w:val="single" w:sz="4" w:space="0" w:color="CBCBCB"/>
+            </w:tcBorders>
+          </w:tcPr>
+          <w:p>
+            <w:r>
+              <w:rPr>
+                <w:sz w:val="20"/>
+              </w:rPr>
+              <w:t>Confidence labels trong CODE-GRAPH.md</w:t>
+            </w:r>
+          </w:p>
+        </w:tc>
+        <w:tc>
+          <w:tcPr>
+            <w:tcW w:type="dxa" w:w="1938"/>
+            <w:shd w:val="clear" w:color="auto" w:fill="B8B3D6"/>
+            <w:tcBorders>
+              <w:top w:val="single" w:sz="4" w:space="0" w:color="CBCBCB"/>
+              <w:left w:val="single" w:sz="4" w:space="0" w:color="CBCBCB"/>
+              <w:bottom w:val="single" w:sz="4" w:space="0" w:color="CBCBCB"/>
+              <w:right w:val="single" w:sz="4" w:space="0" w:color="CBCBCB"/>
+            </w:tcBorders>
+          </w:tcPr>
+          <w:p>
+            <w:r>
+              <w:rPr>
+                <w:sz w:val="20"/>
+              </w:rPr>
+              <w:t>Thấp (4–8 giờ)</w:t>
+            </w:r>
+          </w:p>
+        </w:tc>
+        <w:tc>
+          <w:tcPr>
+            <w:tcW w:type="dxa" w:w="1938"/>
+            <w:shd w:val="clear" w:color="auto" w:fill="B8B3D6"/>
+            <w:tcBorders>
+              <w:top w:val="single" w:sz="4" w:space="0" w:color="CBCBCB"/>
+              <w:left w:val="single" w:sz="4" w:space="0" w:color="CBCBCB"/>
+              <w:bottom w:val="single" w:sz="4" w:space="0" w:color="CBCBCB"/>
+              <w:right w:val="single" w:sz="4" w:space="0" w:color="CBCBCB"/>
+            </w:tcBorders>
+          </w:tcPr>
+          <w:p>
+            <w:r>
+              <w:rPr>
+                <w:sz w:val="20"/>
+              </w:rPr>
+              <w:t>Không có</w:t>
+            </w:r>
+          </w:p>
+        </w:tc>
+        <w:tc>
+          <w:tcPr>
+            <w:tcW w:type="dxa" w:w="1938"/>
+            <w:shd w:val="clear" w:color="auto" w:fill="B8B3D6"/>
+            <w:tcBorders>
+              <w:top w:val="single" w:sz="4" w:space="0" w:color="CBCBCB"/>
+              <w:left w:val="single" w:sz="4" w:space="0" w:color="CBCBCB"/>
+              <w:bottom w:val="single" w:sz="4" w:space="0" w:color="CBCBCB"/>
+              <w:right w:val="single" w:sz="4" w:space="0" w:color="CBCBCB"/>
+            </w:tcBorders>
+          </w:tcPr>
+          <w:p>
+            <w:r>
+              <w:rPr>
+                <w:sz w:val="20"/>
+              </w:rPr>
+              <w:t>Ngay</w:t>
+            </w:r>
+          </w:p>
+        </w:tc>
+      </w:tr>
+      <w:tr>
+        <w:tc>
+          <w:tcPr>
+            <w:tcW w:type="dxa" w:w="1938"/>
+            <w:tcBorders>
+              <w:top w:val="single" w:sz="4" w:space="0" w:color="CBCBCB"/>
+              <w:left w:val="single" w:sz="4" w:space="0" w:color="CBCBCB"/>
+              <w:bottom w:val="single" w:sz="4" w:space="0" w:color="CBCBCB"/>
+              <w:right w:val="single" w:sz="4" w:space="0" w:color="CBCBCB"/>
+            </w:tcBorders>
+          </w:tcPr>
+          <w:p>
+            <w:r>
+              <w:rPr>
+                <w:sz w:val="20"/>
+              </w:rPr>
+              <w:t>P4</w:t>
+            </w:r>
+          </w:p>
+        </w:tc>
+        <w:tc>
+          <w:tcPr>
+            <w:tcW w:type="dxa" w:w="1938"/>
+            <w:tcBorders>
+              <w:top w:val="single" w:sz="4" w:space="0" w:color="CBCBCB"/>
+              <w:left w:val="single" w:sz="4" w:space="0" w:color="CBCBCB"/>
+              <w:bottom w:val="single" w:sz="4" w:space="0" w:color="CBCBCB"/>
+              <w:right w:val="single" w:sz="4" w:space="0" w:color="CBCBCB"/>
+            </w:tcBorders>
+          </w:tcPr>
+          <w:p>
+            <w:r>
+              <w:rPr>
+                <w:sz w:val="20"/>
+              </w:rPr>
+              <w:t>"CODE-GRAPH impact" field trong PR checklist §15.3</w:t>
+            </w:r>
+          </w:p>
+        </w:tc>
+        <w:tc>
+          <w:tcPr>
+            <w:tcW w:type="dxa" w:w="1938"/>
+            <w:tcBorders>
+              <w:top w:val="single" w:sz="4" w:space="0" w:color="CBCBCB"/>
+              <w:left w:val="single" w:sz="4" w:space="0" w:color="CBCBCB"/>
+              <w:bottom w:val="single" w:sz="4" w:space="0" w:color="CBCBCB"/>
+              <w:right w:val="single" w:sz="4" w:space="0" w:color="CBCBCB"/>
+            </w:tcBorders>
+          </w:tcPr>
+          <w:p>
+            <w:r>
+              <w:rPr>
+                <w:sz w:val="20"/>
+              </w:rPr>
+              <w:t>Rất thấp (1–2 giờ)</w:t>
+            </w:r>
+          </w:p>
+        </w:tc>
+        <w:tc>
+          <w:tcPr>
+            <w:tcW w:type="dxa" w:w="1938"/>
+            <w:tcBorders>
+              <w:top w:val="single" w:sz="4" w:space="0" w:color="CBCBCB"/>
+              <w:left w:val="single" w:sz="4" w:space="0" w:color="CBCBCB"/>
+              <w:bottom w:val="single" w:sz="4" w:space="0" w:color="CBCBCB"/>
+              <w:right w:val="single" w:sz="4" w:space="0" w:color="CBCBCB"/>
+            </w:tcBorders>
+          </w:tcPr>
+          <w:p>
+            <w:r>
+              <w:rPr>
+                <w:sz w:val="20"/>
+              </w:rPr>
+              <w:t>Không có</w:t>
+            </w:r>
+          </w:p>
+        </w:tc>
+        <w:tc>
+          <w:tcPr>
+            <w:tcW w:type="dxa" w:w="1938"/>
+            <w:tcBorders>
+              <w:top w:val="single" w:sz="4" w:space="0" w:color="CBCBCB"/>
+              <w:left w:val="single" w:sz="4" w:space="0" w:color="CBCBCB"/>
+              <w:bottom w:val="single" w:sz="4" w:space="0" w:color="CBCBCB"/>
+              <w:right w:val="single" w:sz="4" w:space="0" w:color="CBCBCB"/>
+            </w:tcBorders>
+          </w:tcPr>
+          <w:p>
+            <w:r>
+              <w:rPr>
+                <w:sz w:val="20"/>
+              </w:rPr>
+              <w:t>Ngay</w:t>
+            </w:r>
+          </w:p>
+        </w:tc>
+      </w:tr>
+      <w:tr>
+        <w:tc>
+          <w:tcPr>
+            <w:tcW w:type="dxa" w:w="1938"/>
+            <w:shd w:val="clear" w:color="auto" w:fill="B8B3D6"/>
+            <w:tcBorders>
+              <w:top w:val="single" w:sz="4" w:space="0" w:color="CBCBCB"/>
+              <w:left w:val="single" w:sz="4" w:space="0" w:color="CBCBCB"/>
+              <w:bottom w:val="single" w:sz="4" w:space="0" w:color="CBCBCB"/>
+              <w:right w:val="single" w:sz="4" w:space="0" w:color="CBCBCB"/>
+            </w:tcBorders>
+          </w:tcPr>
+          <w:p>
+            <w:r>
+              <w:rPr>
+                <w:sz w:val="20"/>
+              </w:rPr>
+              <w:t>P5</w:t>
+            </w:r>
+          </w:p>
+        </w:tc>
+        <w:tc>
+          <w:tcPr>
+            <w:tcW w:type="dxa" w:w="1938"/>
+            <w:shd w:val="clear" w:color="auto" w:fill="B8B3D6"/>
+            <w:tcBorders>
+              <w:top w:val="single" w:sz="4" w:space="0" w:color="CBCBCB"/>
+              <w:left w:val="single" w:sz="4" w:space="0" w:color="CBCBCB"/>
+              <w:bottom w:val="single" w:sz="4" w:space="0" w:color="CBCBCB"/>
+              <w:right w:val="single" w:sz="4" w:space="0" w:color="CBCBCB"/>
+            </w:tcBorders>
+          </w:tcPr>
+          <w:p>
+            <w:r>
+              <w:rPr>
+                <w:sz w:val="20"/>
+              </w:rPr>
+              <w:t>LESSONS.md — Tích lũy institutional knowledge</w:t>
+            </w:r>
+          </w:p>
+        </w:tc>
+        <w:tc>
+          <w:tcPr>
+            <w:tcW w:type="dxa" w:w="1938"/>
+            <w:shd w:val="clear" w:color="auto" w:fill="B8B3D6"/>
+            <w:tcBorders>
+              <w:top w:val="single" w:sz="4" w:space="0" w:color="CBCBCB"/>
+              <w:left w:val="single" w:sz="4" w:space="0" w:color="CBCBCB"/>
+              <w:bottom w:val="single" w:sz="4" w:space="0" w:color="CBCBCB"/>
+              <w:right w:val="single" w:sz="4" w:space="0" w:color="CBCBCB"/>
+            </w:tcBorders>
+          </w:tcPr>
+          <w:p>
+            <w:r>
+              <w:rPr>
+                <w:sz w:val="20"/>
+              </w:rPr>
+              <w:t>Thấp (4–6 giờ)</w:t>
+            </w:r>
+          </w:p>
+        </w:tc>
+        <w:tc>
+          <w:tcPr>
+            <w:tcW w:type="dxa" w:w="1938"/>
+            <w:shd w:val="clear" w:color="auto" w:fill="B8B3D6"/>
+            <w:tcBorders>
+              <w:top w:val="single" w:sz="4" w:space="0" w:color="CBCBCB"/>
+              <w:left w:val="single" w:sz="4" w:space="0" w:color="CBCBCB"/>
+              <w:bottom w:val="single" w:sz="4" w:space="0" w:color="CBCBCB"/>
+              <w:right w:val="single" w:sz="4" w:space="0" w:color="CBCBCB"/>
+            </w:tcBorders>
+          </w:tcPr>
+          <w:p>
+            <w:r>
+              <w:rPr>
+                <w:sz w:val="20"/>
+              </w:rPr>
+              <w:t>Không có</w:t>
+            </w:r>
+          </w:p>
+        </w:tc>
+        <w:tc>
+          <w:tcPr>
+            <w:tcW w:type="dxa" w:w="1938"/>
+            <w:shd w:val="clear" w:color="auto" w:fill="B8B3D6"/>
+            <w:tcBorders>
+              <w:top w:val="single" w:sz="4" w:space="0" w:color="CBCBCB"/>
+              <w:left w:val="single" w:sz="4" w:space="0" w:color="CBCBCB"/>
+              <w:bottom w:val="single" w:sz="4" w:space="0" w:color="CBCBCB"/>
+              <w:right w:val="single" w:sz="4" w:space="0" w:color="CBCBCB"/>
+            </w:tcBorders>
+          </w:tcPr>
+          <w:p>
+            <w:r>
+              <w:rPr>
+                <w:sz w:val="20"/>
+              </w:rPr>
+              <w:t>Ngay</w:t>
+            </w:r>
+          </w:p>
+        </w:tc>
+      </w:tr>
+    </w:tbl>
+    <w:p/>
+    <w:p>
+      <w:pPr>
+        <w:pBdr>
+          <w:bottom w:val="single" w:sz="6" w:space="1" w:color="F05922"/>
+        </w:pBdr>
+        <w:spacing w:after="120"/>
+      </w:pPr>
+    </w:p>
+    <w:p>
+      <w:pPr>
+        <w:pStyle w:val="Heading3"/>
+        <w:spacing w:before="160" w:after="60"/>
+      </w:pPr>
+      <w:r>
+        <w:rPr>
+          <w:color w:val="4A3F8C"/>
+          <w:sz w:val="24"/>
+        </w:rPr>
+        <w:t>P1 — Tích hợp Graphify CLI vào quy trình coding</w:t>
+      </w:r>
+    </w:p>
+    <w:tbl>
+      <w:tblPr>
+        <w:tblStyle w:val="TableGrid"/>
+        <w:tblW w:type="auto" w:w="0"/>
+        <w:tblLook w:firstColumn="1" w:firstRow="1" w:lastColumn="0" w:lastRow="0" w:noHBand="0" w:noVBand="1" w:val="04A0"/>
+      </w:tblPr>
+      <w:tblGrid>
+        <w:gridCol w:w="4844"/>
+        <w:gridCol w:w="4844"/>
+      </w:tblGrid>
+      <w:tr>
+        <w:tc>
+          <w:tcPr>
+            <w:tcW w:type="dxa" w:w="4844"/>
+            <w:shd w:val="clear" w:color="auto" w:fill="251C53"/>
+            <w:tcBorders>
+              <w:top w:val="single" w:sz="4" w:space="0" w:color="251C53"/>
+              <w:left w:val="single" w:sz="4" w:space="0" w:color="251C53"/>
+              <w:bottom w:val="single" w:sz="4" w:space="0" w:color="251C53"/>
+              <w:right w:val="single" w:sz="4" w:space="0" w:color="251C53"/>
+            </w:tcBorders>
+          </w:tcPr>
+          <w:p>
+            <w:r>
+              <w:rPr>
+                <w:b/>
+                <w:color w:val="FFFFFF"/>
+                <w:sz w:val="20"/>
+              </w:rPr>
+              <w:t>Trường</w:t>
+            </w:r>
+          </w:p>
+        </w:tc>
+        <w:tc>
+          <w:tcPr>
+            <w:tcW w:type="dxa" w:w="4844"/>
+            <w:shd w:val="clear" w:color="auto" w:fill="251C53"/>
+            <w:tcBorders>
+              <w:top w:val="single" w:sz="4" w:space="0" w:color="251C53"/>
+              <w:left w:val="single" w:sz="4" w:space="0" w:color="251C53"/>
+              <w:bottom w:val="single" w:sz="4" w:space="0" w:color="251C53"/>
+              <w:right w:val="single" w:sz="4" w:space="0" w:color="251C53"/>
+            </w:tcBorders>
+          </w:tcPr>
+          <w:p>
+            <w:r>
+              <w:rPr>
+                <w:b/>
+                <w:color w:val="FFFFFF"/>
+                <w:sz w:val="20"/>
+              </w:rPr>
+              <w:t>Nội dung</w:t>
+            </w:r>
+          </w:p>
+        </w:tc>
+      </w:tr>
+      <w:tr>
+        <w:tc>
+          <w:tcPr>
+            <w:tcW w:type="dxa" w:w="4844"/>
+            <w:tcBorders>
+              <w:top w:val="single" w:sz="4" w:space="0" w:color="CBCBCB"/>
+              <w:left w:val="single" w:sz="4" w:space="0" w:color="CBCBCB"/>
+              <w:bottom w:val="single" w:sz="4" w:space="0" w:color="CBCBCB"/>
+              <w:right w:val="single" w:sz="4" w:space="0" w:color="CBCBCB"/>
+            </w:tcBorders>
+          </w:tcPr>
+          <w:p>
+            <w:r>
+              <w:rPr>
+                <w:sz w:val="20"/>
+              </w:rPr>
+              <w:t>--------</w:t>
+            </w:r>
+          </w:p>
+        </w:tc>
+        <w:tc>
+          <w:tcPr>
+            <w:tcW w:type="dxa" w:w="4844"/>
+            <w:tcBorders>
+              <w:top w:val="single" w:sz="4" w:space="0" w:color="CBCBCB"/>
+              <w:left w:val="single" w:sz="4" w:space="0" w:color="CBCBCB"/>
+              <w:bottom w:val="single" w:sz="4" w:space="0" w:color="CBCBCB"/>
+              <w:right w:val="single" w:sz="4" w:space="0" w:color="CBCBCB"/>
+            </w:tcBorders>
+          </w:tcPr>
+          <w:p>
+            <w:r>
+              <w:rPr>
+                <w:sz w:val="20"/>
+              </w:rPr>
+              <w:t>---------</w:t>
+            </w:r>
+          </w:p>
+        </w:tc>
+      </w:tr>
+      <w:tr>
+        <w:tc>
+          <w:tcPr>
+            <w:tcW w:type="dxa" w:w="4844"/>
+            <w:shd w:val="clear" w:color="auto" w:fill="B8B3D6"/>
+            <w:tcBorders>
+              <w:top w:val="single" w:sz="4" w:space="0" w:color="CBCBCB"/>
+              <w:left w:val="single" w:sz="4" w:space="0" w:color="CBCBCB"/>
+              <w:bottom w:val="single" w:sz="4" w:space="0" w:color="CBCBCB"/>
+              <w:right w:val="single" w:sz="4" w:space="0" w:color="CBCBCB"/>
+            </w:tcBorders>
+          </w:tcPr>
+          <w:p>
+            <w:r>
+              <w:rPr>
+                <w:b/>
+                <w:sz w:val="20"/>
+              </w:rPr>
+              <w:t>Hiện trạng KZTEK</w:t>
+            </w:r>
+          </w:p>
+        </w:tc>
+        <w:tc>
+          <w:tcPr>
+            <w:tcW w:type="dxa" w:w="4844"/>
+            <w:shd w:val="clear" w:color="auto" w:fill="B8B3D6"/>
+            <w:tcBorders>
+              <w:top w:val="single" w:sz="4" w:space="0" w:color="CBCBCB"/>
+              <w:left w:val="single" w:sz="4" w:space="0" w:color="CBCBCB"/>
+              <w:bottom w:val="single" w:sz="4" w:space="0" w:color="CBCBCB"/>
+              <w:right w:val="single" w:sz="4" w:space="0" w:color="CBCBCB"/>
+            </w:tcBorders>
+          </w:tcPr>
+          <w:p>
+            <w:r>
+              <w:rPr>
+                <w:rFonts w:ascii="Courier New" w:hAnsi="Courier New"/>
+                <w:color w:val="F05922"/>
+                <w:sz w:val="20"/>
+              </w:rPr>
+              <w:t>code-graph/CODE-GRAPH.md</w:t>
+            </w:r>
+            <w:r>
+              <w:rPr>
+                <w:sz w:val="20"/>
+              </w:rPr>
+              <w:t xml:space="preserve"> là file Markdown phẳng, cập nhật thủ công bởi agents (CLAUDE.md §17). Agents phải đọc toàn bộ file để lấy context — tốn context window. Không có call graph (ai gọi ai), không query được. Workspace hiện chưa có C# product codebase.</w:t>
+            </w:r>
+          </w:p>
+        </w:tc>
+      </w:tr>
+      <w:tr>
+        <w:tc>
+          <w:tcPr>
+            <w:tcW w:type="dxa" w:w="4844"/>
+            <w:tcBorders>
+              <w:top w:val="single" w:sz="4" w:space="0" w:color="CBCBCB"/>
+              <w:left w:val="single" w:sz="4" w:space="0" w:color="CBCBCB"/>
+              <w:bottom w:val="single" w:sz="4" w:space="0" w:color="CBCBCB"/>
+              <w:right w:val="single" w:sz="4" w:space="0" w:color="CBCBCB"/>
+            </w:tcBorders>
+          </w:tcPr>
+          <w:p>
+            <w:r>
+              <w:rPr>
+                <w:b/>
+                <w:sz w:val="20"/>
+              </w:rPr>
+              <w:t>Học từ đâu</w:t>
+            </w:r>
+          </w:p>
+        </w:tc>
+        <w:tc>
+          <w:tcPr>
+            <w:tcW w:type="dxa" w:w="4844"/>
+            <w:tcBorders>
+              <w:top w:val="single" w:sz="4" w:space="0" w:color="CBCBCB"/>
+              <w:left w:val="single" w:sz="4" w:space="0" w:color="CBCBCB"/>
+              <w:bottom w:val="single" w:sz="4" w:space="0" w:color="CBCBCB"/>
+              <w:right w:val="single" w:sz="4" w:space="0" w:color="CBCBCB"/>
+            </w:tcBorders>
+          </w:tcPr>
+          <w:p>
+            <w:r>
+              <w:rPr>
+                <w:sz w:val="20"/>
+              </w:rPr>
+              <w:t xml:space="preserve">Pipeline </w:t>
+            </w:r>
+            <w:r>
+              <w:rPr>
+                <w:rFonts w:ascii="Courier New" w:hAnsi="Courier New"/>
+                <w:color w:val="F05922"/>
+                <w:sz w:val="20"/>
+              </w:rPr>
+              <w:t>detect() → extract() → build_graph()</w:t>
+            </w:r>
+            <w:r>
+              <w:rPr>
+                <w:sz w:val="20"/>
+              </w:rPr>
+              <w:t xml:space="preserve"> (</w:t>
+            </w:r>
+            <w:r>
+              <w:rPr>
+                <w:rFonts w:ascii="Courier New" w:hAnsi="Courier New"/>
+                <w:color w:val="F05922"/>
+                <w:sz w:val="20"/>
+              </w:rPr>
+              <w:t>extract.py</w:t>
+            </w:r>
+            <w:r>
+              <w:rPr>
+                <w:sz w:val="20"/>
+              </w:rPr>
+              <w:t xml:space="preserve">, </w:t>
+            </w:r>
+            <w:r>
+              <w:rPr>
+                <w:rFonts w:ascii="Courier New" w:hAnsi="Courier New"/>
+                <w:color w:val="F05922"/>
+                <w:sz w:val="20"/>
+              </w:rPr>
+              <w:t>build.py</w:t>
+            </w:r>
+            <w:r>
+              <w:rPr>
+                <w:sz w:val="20"/>
+              </w:rPr>
+              <w:t xml:space="preserve">, </w:t>
+            </w:r>
+            <w:r>
+              <w:rPr>
+                <w:rFonts w:ascii="Courier New" w:hAnsi="Courier New"/>
+                <w:color w:val="F05922"/>
+                <w:sz w:val="20"/>
+              </w:rPr>
+              <w:t>extractors/csharp.py</w:t>
+            </w:r>
+            <w:r>
+              <w:rPr>
+                <w:sz w:val="20"/>
+              </w:rPr>
+              <w:t xml:space="preserve">); lệnh </w:t>
+            </w:r>
+            <w:r>
+              <w:rPr>
+                <w:rFonts w:ascii="Courier New" w:hAnsi="Courier New"/>
+                <w:color w:val="F05922"/>
+                <w:sz w:val="20"/>
+              </w:rPr>
+              <w:t>graphify update .</w:t>
+            </w:r>
+            <w:r>
+              <w:rPr>
+                <w:sz w:val="20"/>
+              </w:rPr>
+              <w:t xml:space="preserve"> (incremental re-extract chỉ file đã đổi); lệnh </w:t>
+            </w:r>
+            <w:r>
+              <w:rPr>
+                <w:rFonts w:ascii="Courier New" w:hAnsi="Courier New"/>
+                <w:color w:val="F05922"/>
+                <w:sz w:val="20"/>
+              </w:rPr>
+              <w:t>graphify query "..."</w:t>
+            </w:r>
+            <w:r>
+              <w:rPr>
+                <w:sz w:val="20"/>
+              </w:rPr>
+              <w:t xml:space="preserve">, </w:t>
+            </w:r>
+            <w:r>
+              <w:rPr>
+                <w:rFonts w:ascii="Courier New" w:hAnsi="Courier New"/>
+                <w:color w:val="F05922"/>
+                <w:sz w:val="20"/>
+              </w:rPr>
+              <w:t>graphify path A B</w:t>
+            </w:r>
+            <w:r>
+              <w:rPr>
+                <w:sz w:val="20"/>
+              </w:rPr>
+              <w:t xml:space="preserve">, </w:t>
+            </w:r>
+            <w:r>
+              <w:rPr>
+                <w:rFonts w:ascii="Courier New" w:hAnsi="Courier New"/>
+                <w:color w:val="F05922"/>
+                <w:sz w:val="20"/>
+              </w:rPr>
+              <w:t>graphify explain X</w:t>
+            </w:r>
+            <w:r>
+              <w:rPr>
+                <w:sz w:val="20"/>
+              </w:rPr>
+              <w:t xml:space="preserve"> (graph traversal); </w:t>
+            </w:r>
+            <w:r>
+              <w:rPr>
+                <w:rFonts w:ascii="Courier New" w:hAnsi="Courier New"/>
+                <w:color w:val="F05922"/>
+                <w:sz w:val="20"/>
+              </w:rPr>
+              <w:t>always_on/claude-md.md</w:t>
+            </w:r>
+            <w:r>
+              <w:rPr>
+                <w:sz w:val="20"/>
+              </w:rPr>
+              <w:t xml:space="preserve"> (injection buộc query-first behavior).</w:t>
+            </w:r>
+          </w:p>
+        </w:tc>
+      </w:tr>
+      <w:tr>
+        <w:tc>
+          <w:tcPr>
+            <w:tcW w:type="dxa" w:w="4844"/>
+            <w:shd w:val="clear" w:color="auto" w:fill="B8B3D6"/>
+            <w:tcBorders>
+              <w:top w:val="single" w:sz="4" w:space="0" w:color="CBCBCB"/>
+              <w:left w:val="single" w:sz="4" w:space="0" w:color="CBCBCB"/>
+              <w:bottom w:val="single" w:sz="4" w:space="0" w:color="CBCBCB"/>
+              <w:right w:val="single" w:sz="4" w:space="0" w:color="CBCBCB"/>
+            </w:tcBorders>
+          </w:tcPr>
+          <w:p>
+            <w:r>
+              <w:rPr>
+                <w:b/>
+                <w:sz w:val="20"/>
+              </w:rPr>
+              <w:t>Lý do thay đổi</w:t>
+            </w:r>
+          </w:p>
+        </w:tc>
+        <w:tc>
+          <w:tcPr>
+            <w:tcW w:type="dxa" w:w="4844"/>
+            <w:shd w:val="clear" w:color="auto" w:fill="B8B3D6"/>
+            <w:tcBorders>
+              <w:top w:val="single" w:sz="4" w:space="0" w:color="CBCBCB"/>
+              <w:left w:val="single" w:sz="4" w:space="0" w:color="CBCBCB"/>
+              <w:bottom w:val="single" w:sz="4" w:space="0" w:color="CBCBCB"/>
+              <w:right w:val="single" w:sz="4" w:space="0" w:color="CBCBCB"/>
+            </w:tcBorders>
+          </w:tcPr>
+          <w:p>
+            <w:r>
+              <w:rPr>
+                <w:sz w:val="20"/>
+              </w:rPr>
+              <w:t xml:space="preserve">Agents đọc CODE-GRAPH.md như formality rồi vẫn Glob toàn bộ </w:t>
+            </w:r>
+            <w:r>
+              <w:rPr>
+                <w:rFonts w:ascii="Courier New" w:hAnsi="Courier New"/>
+                <w:color w:val="F05922"/>
+                <w:sz w:val="20"/>
+              </w:rPr>
+              <w:t>src/</w:t>
+            </w:r>
+            <w:r>
+              <w:rPr>
+                <w:sz w:val="20"/>
+              </w:rPr>
+              <w:t xml:space="preserve"> để "chắc chắn". Không có call graph → Senior Dev phải grep nhiều file để hiểu dependency. Update thủ công không đủ chính xác (agent suy đoán từ tên file, không từ AST).</w:t>
+            </w:r>
+          </w:p>
+        </w:tc>
+      </w:tr>
+      <w:tr>
+        <w:tc>
+          <w:tcPr>
+            <w:tcW w:type="dxa" w:w="4844"/>
+            <w:tcBorders>
+              <w:top w:val="single" w:sz="4" w:space="0" w:color="CBCBCB"/>
+              <w:left w:val="single" w:sz="4" w:space="0" w:color="CBCBCB"/>
+              <w:bottom w:val="single" w:sz="4" w:space="0" w:color="CBCBCB"/>
+              <w:right w:val="single" w:sz="4" w:space="0" w:color="CBCBCB"/>
+            </w:tcBorders>
+          </w:tcPr>
+          <w:p>
+            <w:r>
+              <w:rPr>
+                <w:b/>
+                <w:sz w:val="20"/>
+              </w:rPr>
+              <w:t>Áp dụng vào đâu</w:t>
+            </w:r>
+          </w:p>
+        </w:tc>
+        <w:tc>
+          <w:tcPr>
+            <w:tcW w:type="dxa" w:w="4844"/>
+            <w:tcBorders>
+              <w:top w:val="single" w:sz="4" w:space="0" w:color="CBCBCB"/>
+              <w:left w:val="single" w:sz="4" w:space="0" w:color="CBCBCB"/>
+              <w:bottom w:val="single" w:sz="4" w:space="0" w:color="CBCBCB"/>
+              <w:right w:val="single" w:sz="4" w:space="0" w:color="CBCBCB"/>
+            </w:tcBorders>
+          </w:tcPr>
+          <w:p>
+            <w:r>
+              <w:rPr>
+                <w:sz w:val="20"/>
+              </w:rPr>
+              <w:t xml:space="preserve">(1) CLAUDE.md §17.1 — thay "đọc CODE-GRAPH.md trước" bằng "chạy </w:t>
+            </w:r>
+            <w:r>
+              <w:rPr>
+                <w:rFonts w:ascii="Courier New" w:hAnsi="Courier New"/>
+                <w:color w:val="F05922"/>
+                <w:sz w:val="20"/>
+              </w:rPr>
+              <w:t>graphify query</w:t>
+            </w:r>
+            <w:r>
+              <w:rPr>
+                <w:sz w:val="20"/>
+              </w:rPr>
+              <w:t xml:space="preserve"> trước khi đọc source file". (2) WF-FEATURE Bước 8/9 (Senior/Junior Dev) — thêm bước bắt buộc chạy </w:t>
+            </w:r>
+            <w:r>
+              <w:rPr>
+                <w:rFonts w:ascii="Courier New" w:hAnsi="Courier New"/>
+                <w:color w:val="F05922"/>
+                <w:sz w:val="20"/>
+              </w:rPr>
+              <w:t>graphify update .</w:t>
+            </w:r>
+            <w:r>
+              <w:rPr>
+                <w:sz w:val="20"/>
+              </w:rPr>
+              <w:t xml:space="preserve"> sau khi sửa code, trước khi tạo PR. (3) </w:t>
+            </w:r>
+            <w:r>
+              <w:rPr>
+                <w:rFonts w:ascii="Courier New" w:hAnsi="Courier New"/>
+                <w:color w:val="F05922"/>
+                <w:sz w:val="20"/>
+              </w:rPr>
+              <w:t>.claude/shared/CORE.md</w:t>
+            </w:r>
+            <w:r>
+              <w:rPr>
+                <w:sz w:val="20"/>
+              </w:rPr>
+              <w:t xml:space="preserve"> §coding-protocol — đồng bộ.</w:t>
+            </w:r>
+          </w:p>
+        </w:tc>
+      </w:tr>
+      <w:tr>
+        <w:tc>
+          <w:tcPr>
+            <w:tcW w:type="dxa" w:w="4844"/>
+            <w:shd w:val="clear" w:color="auto" w:fill="B8B3D6"/>
+            <w:tcBorders>
+              <w:top w:val="single" w:sz="4" w:space="0" w:color="CBCBCB"/>
+              <w:left w:val="single" w:sz="4" w:space="0" w:color="CBCBCB"/>
+              <w:bottom w:val="single" w:sz="4" w:space="0" w:color="CBCBCB"/>
+              <w:right w:val="single" w:sz="4" w:space="0" w:color="CBCBCB"/>
+            </w:tcBorders>
+          </w:tcPr>
+          <w:p>
+            <w:r>
+              <w:rPr>
+                <w:b/>
+                <w:sz w:val="20"/>
+              </w:rPr>
+              <w:t>Đạt được gì</w:t>
+            </w:r>
+          </w:p>
+        </w:tc>
+        <w:tc>
+          <w:tcPr>
+            <w:tcW w:type="dxa" w:w="4844"/>
+            <w:shd w:val="clear" w:color="auto" w:fill="B8B3D6"/>
+            <w:tcBorders>
+              <w:top w:val="single" w:sz="4" w:space="0" w:color="CBCBCB"/>
+              <w:left w:val="single" w:sz="4" w:space="0" w:color="CBCBCB"/>
+              <w:bottom w:val="single" w:sz="4" w:space="0" w:color="CBCBCB"/>
+              <w:right w:val="single" w:sz="4" w:space="0" w:color="CBCBCB"/>
+            </w:tcBorders>
+          </w:tcPr>
+          <w:p>
+            <w:r>
+              <w:rPr>
+                <w:sz w:val="20"/>
+              </w:rPr>
+              <w:t xml:space="preserve">(a) Agent tra cứu </w:t>
+            </w:r>
+            <w:r>
+              <w:rPr>
+                <w:rFonts w:ascii="Courier New" w:hAnsi="Courier New"/>
+                <w:color w:val="F05922"/>
+                <w:sz w:val="20"/>
+              </w:rPr>
+              <w:t>graphify query "where is KzButton used?"</w:t>
+            </w:r>
+            <w:r>
+              <w:rPr>
+                <w:sz w:val="20"/>
+              </w:rPr>
+              <w:t xml:space="preserve"> nhận subgraph trong &lt;2 giây thay vì grep 10+ file — giảm từ ~5 lần Read tool xuống 1 lần query per context question. (b) CODE-GRAPH không bao giờ stale: </w:t>
+            </w:r>
+            <w:r>
+              <w:rPr>
+                <w:rFonts w:ascii="Courier New" w:hAnsi="Courier New"/>
+                <w:color w:val="F05922"/>
+                <w:sz w:val="20"/>
+              </w:rPr>
+              <w:t>graphify update .</w:t>
+            </w:r>
+            <w:r>
+              <w:rPr>
+                <w:sz w:val="20"/>
+              </w:rPr>
+              <w:t xml:space="preserve"> dùng AST (tree-sitter, zero LLM cost) chỉ re-extract file đã đổi. (c) C# cross-file dependency (</w:t>
+            </w:r>
+            <w:r>
+              <w:rPr>
+                <w:rFonts w:ascii="Courier New" w:hAnsi="Courier New"/>
+                <w:color w:val="F05922"/>
+                <w:sz w:val="20"/>
+              </w:rPr>
+              <w:t>extractors/csharp.py</w:t>
+            </w:r>
+            <w:r>
+              <w:rPr>
+                <w:sz w:val="20"/>
+              </w:rPr>
+              <w:t>) phát hiện namespace/inheritance mà Markdown thủ công không capture được.</w:t>
+            </w:r>
+          </w:p>
+        </w:tc>
+      </w:tr>
+      <w:tr>
+        <w:tc>
+          <w:tcPr>
+            <w:tcW w:type="dxa" w:w="4844"/>
+            <w:tcBorders>
+              <w:top w:val="single" w:sz="4" w:space="0" w:color="CBCBCB"/>
+              <w:left w:val="single" w:sz="4" w:space="0" w:color="CBCBCB"/>
+              <w:bottom w:val="single" w:sz="4" w:space="0" w:color="CBCBCB"/>
+              <w:right w:val="single" w:sz="4" w:space="0" w:color="CBCBCB"/>
+            </w:tcBorders>
+          </w:tcPr>
+          <w:p>
+            <w:r>
+              <w:rPr>
+                <w:b/>
+                <w:sz w:val="20"/>
+              </w:rPr>
+              <w:t>Rủi ro / Effort</w:t>
+            </w:r>
+          </w:p>
+        </w:tc>
+        <w:tc>
+          <w:tcPr>
+            <w:tcW w:type="dxa" w:w="4844"/>
+            <w:tcBorders>
+              <w:top w:val="single" w:sz="4" w:space="0" w:color="CBCBCB"/>
+              <w:left w:val="single" w:sz="4" w:space="0" w:color="CBCBCB"/>
+              <w:bottom w:val="single" w:sz="4" w:space="0" w:color="CBCBCB"/>
+              <w:right w:val="single" w:sz="4" w:space="0" w:color="CBCBCB"/>
+            </w:tcBorders>
+          </w:tcPr>
+          <w:p>
+            <w:r>
+              <w:rPr>
+                <w:sz w:val="20"/>
+              </w:rPr>
+              <w:t xml:space="preserve">Rủi ro: (1) Pre-1.0 software — API có thể thay đổi giữa minor releases → cần pin version cụ thể. (2) Cần Python 3.10+ trong môi trường dev/CI. (3) Giá trị thực tế chỉ cao khi có C# product codebase — áp dụng ngay bây giờ lợi ích hạn chế. Effort: </w:t>
+            </w:r>
+            <w:r>
+              <w:rPr>
+                <w:b/>
+                <w:sz w:val="20"/>
+              </w:rPr>
+              <w:t>Trung bình</w:t>
+            </w:r>
+            <w:r>
+              <w:rPr>
+                <w:sz w:val="20"/>
+              </w:rPr>
+              <w:t xml:space="preserve"> — 1–2 ngày (setup, integration vào workflow instructions, test với C# sample).</w:t>
+            </w:r>
+          </w:p>
+        </w:tc>
+      </w:tr>
+    </w:tbl>
+    <w:p/>
+    <w:p>
+      <w:pPr>
+        <w:pBdr>
+          <w:bottom w:val="single" w:sz="6" w:space="1" w:color="F05922"/>
+        </w:pBdr>
+        <w:spacing w:after="120"/>
+      </w:pPr>
+    </w:p>
+    <w:p>
+      <w:pPr>
+        <w:pStyle w:val="Heading3"/>
+        <w:spacing w:before="160" w:after="60"/>
+      </w:pPr>
+      <w:r>
+        <w:rPr>
+          <w:color w:val="4A3F8C"/>
+          <w:sz w:val="24"/>
+        </w:rPr>
+        <w:t>P2 — Cải tiến CLAUDE.md §17: "Query-first checklist" có cấu trúc</w:t>
+      </w:r>
+    </w:p>
+    <w:tbl>
+      <w:tblPr>
+        <w:tblStyle w:val="TableGrid"/>
+        <w:tblW w:type="auto" w:w="0"/>
+        <w:tblLook w:firstColumn="1" w:firstRow="1" w:lastColumn="0" w:lastRow="0" w:noHBand="0" w:noVBand="1" w:val="04A0"/>
+      </w:tblPr>
+      <w:tblGrid>
+        <w:gridCol w:w="4844"/>
+        <w:gridCol w:w="4844"/>
+      </w:tblGrid>
+      <w:tr>
+        <w:tc>
+          <w:tcPr>
+            <w:tcW w:type="dxa" w:w="4844"/>
+            <w:shd w:val="clear" w:color="auto" w:fill="251C53"/>
+            <w:tcBorders>
+              <w:top w:val="single" w:sz="4" w:space="0" w:color="251C53"/>
+              <w:left w:val="single" w:sz="4" w:space="0" w:color="251C53"/>
+              <w:bottom w:val="single" w:sz="4" w:space="0" w:color="251C53"/>
+              <w:right w:val="single" w:sz="4" w:space="0" w:color="251C53"/>
+            </w:tcBorders>
+          </w:tcPr>
+          <w:p>
+            <w:r>
+              <w:rPr>
+                <w:b/>
+                <w:color w:val="FFFFFF"/>
+                <w:sz w:val="20"/>
+              </w:rPr>
+              <w:t>Trường</w:t>
+            </w:r>
+          </w:p>
+        </w:tc>
+        <w:tc>
+          <w:tcPr>
+            <w:tcW w:type="dxa" w:w="4844"/>
+            <w:shd w:val="clear" w:color="auto" w:fill="251C53"/>
+            <w:tcBorders>
+              <w:top w:val="single" w:sz="4" w:space="0" w:color="251C53"/>
+              <w:left w:val="single" w:sz="4" w:space="0" w:color="251C53"/>
+              <w:bottom w:val="single" w:sz="4" w:space="0" w:color="251C53"/>
+              <w:right w:val="single" w:sz="4" w:space="0" w:color="251C53"/>
+            </w:tcBorders>
+          </w:tcPr>
+          <w:p>
+            <w:r>
+              <w:rPr>
+                <w:b/>
+                <w:color w:val="FFFFFF"/>
+                <w:sz w:val="20"/>
+              </w:rPr>
+              <w:t>Nội dung</w:t>
+            </w:r>
+          </w:p>
+        </w:tc>
+      </w:tr>
+      <w:tr>
+        <w:tc>
+          <w:tcPr>
+            <w:tcW w:type="dxa" w:w="4844"/>
+            <w:tcBorders>
+              <w:top w:val="single" w:sz="4" w:space="0" w:color="CBCBCB"/>
+              <w:left w:val="single" w:sz="4" w:space="0" w:color="CBCBCB"/>
+              <w:bottom w:val="single" w:sz="4" w:space="0" w:color="CBCBCB"/>
+              <w:right w:val="single" w:sz="4" w:space="0" w:color="CBCBCB"/>
+            </w:tcBorders>
+          </w:tcPr>
+          <w:p>
+            <w:r>
+              <w:rPr>
+                <w:sz w:val="20"/>
+              </w:rPr>
+              <w:t>--------</w:t>
+            </w:r>
+          </w:p>
+        </w:tc>
+        <w:tc>
+          <w:tcPr>
+            <w:tcW w:type="dxa" w:w="4844"/>
+            <w:tcBorders>
+              <w:top w:val="single" w:sz="4" w:space="0" w:color="CBCBCB"/>
+              <w:left w:val="single" w:sz="4" w:space="0" w:color="CBCBCB"/>
+              <w:bottom w:val="single" w:sz="4" w:space="0" w:color="CBCBCB"/>
+              <w:right w:val="single" w:sz="4" w:space="0" w:color="CBCBCB"/>
+            </w:tcBorders>
+          </w:tcPr>
+          <w:p>
+            <w:r>
+              <w:rPr>
+                <w:sz w:val="20"/>
+              </w:rPr>
+              <w:t>---------</w:t>
+            </w:r>
+          </w:p>
+        </w:tc>
+      </w:tr>
+      <w:tr>
+        <w:tc>
+          <w:tcPr>
+            <w:tcW w:type="dxa" w:w="4844"/>
+            <w:shd w:val="clear" w:color="auto" w:fill="B8B3D6"/>
+            <w:tcBorders>
+              <w:top w:val="single" w:sz="4" w:space="0" w:color="CBCBCB"/>
+              <w:left w:val="single" w:sz="4" w:space="0" w:color="CBCBCB"/>
+              <w:bottom w:val="single" w:sz="4" w:space="0" w:color="CBCBCB"/>
+              <w:right w:val="single" w:sz="4" w:space="0" w:color="CBCBCB"/>
+            </w:tcBorders>
+          </w:tcPr>
+          <w:p>
+            <w:r>
+              <w:rPr>
+                <w:b/>
+                <w:sz w:val="20"/>
+              </w:rPr>
+              <w:t>Hiện trạng KZTEK</w:t>
+            </w:r>
+          </w:p>
+        </w:tc>
+        <w:tc>
+          <w:tcPr>
+            <w:tcW w:type="dxa" w:w="4844"/>
+            <w:shd w:val="clear" w:color="auto" w:fill="B8B3D6"/>
+            <w:tcBorders>
+              <w:top w:val="single" w:sz="4" w:space="0" w:color="CBCBCB"/>
+              <w:left w:val="single" w:sz="4" w:space="0" w:color="CBCBCB"/>
+              <w:bottom w:val="single" w:sz="4" w:space="0" w:color="CBCBCB"/>
+              <w:right w:val="single" w:sz="4" w:space="0" w:color="CBCBCB"/>
+            </w:tcBorders>
+          </w:tcPr>
+          <w:p>
+            <w:r>
+              <w:rPr>
+                <w:sz w:val="20"/>
+              </w:rPr>
+              <w:t>CLAUDE.md §17.1 yêu cầu agents "Read code-graph/CODE-GRAPH.md TRƯỚC" nhưng không có hướng dẫn cụ thể về việc phải trả lời những câu hỏi gì từ CODE-GRAPH trước khi mở source file. Không có checklist hay protocol.</w:t>
+            </w:r>
+          </w:p>
+        </w:tc>
+      </w:tr>
+      <w:tr>
+        <w:tc>
+          <w:tcPr>
+            <w:tcW w:type="dxa" w:w="4844"/>
+            <w:tcBorders>
+              <w:top w:val="single" w:sz="4" w:space="0" w:color="CBCBCB"/>
+              <w:left w:val="single" w:sz="4" w:space="0" w:color="CBCBCB"/>
+              <w:bottom w:val="single" w:sz="4" w:space="0" w:color="CBCBCB"/>
+              <w:right w:val="single" w:sz="4" w:space="0" w:color="CBCBCB"/>
+            </w:tcBorders>
+          </w:tcPr>
+          <w:p>
+            <w:r>
+              <w:rPr>
+                <w:b/>
+                <w:sz w:val="20"/>
+              </w:rPr>
+              <w:t>Học từ đâu</w:t>
+            </w:r>
+          </w:p>
+        </w:tc>
+        <w:tc>
+          <w:tcPr>
+            <w:tcW w:type="dxa" w:w="4844"/>
+            <w:tcBorders>
+              <w:top w:val="single" w:sz="4" w:space="0" w:color="CBCBCB"/>
+              <w:left w:val="single" w:sz="4" w:space="0" w:color="CBCBCB"/>
+              <w:bottom w:val="single" w:sz="4" w:space="0" w:color="CBCBCB"/>
+              <w:right w:val="single" w:sz="4" w:space="0" w:color="CBCBCB"/>
+            </w:tcBorders>
+          </w:tcPr>
+          <w:p>
+            <w:r>
+              <w:rPr>
+                <w:rFonts w:ascii="Courier New" w:hAnsi="Courier New"/>
+                <w:color w:val="F05922"/>
+                <w:sz w:val="20"/>
+              </w:rPr>
+              <w:t>always_on/claude-md.md</w:t>
+            </w:r>
+            <w:r>
+              <w:rPr>
+                <w:sz w:val="20"/>
+              </w:rPr>
+              <w:t xml:space="preserve"> — đoạn text inject vào CLAUDE.md với danh sách câu hỏi cụ thể cần trả lời từ graph trước khi đọc raw file: "For codebase questions, first run </w:t>
+            </w:r>
+            <w:r>
+              <w:rPr>
+                <w:rFonts w:ascii="Courier New" w:hAnsi="Courier New"/>
+                <w:color w:val="F05922"/>
+                <w:sz w:val="20"/>
+              </w:rPr>
+              <w:t>graphify query</w:t>
+            </w:r>
+            <w:r>
+              <w:rPr>
+                <w:sz w:val="20"/>
+              </w:rPr>
+              <w:t xml:space="preserve">..."; "After modifying code, run </w:t>
+            </w:r>
+            <w:r>
+              <w:rPr>
+                <w:rFonts w:ascii="Courier New" w:hAnsi="Courier New"/>
+                <w:color w:val="F05922"/>
+                <w:sz w:val="20"/>
+              </w:rPr>
+              <w:t>graphify update .</w:t>
+            </w:r>
+            <w:r>
+              <w:rPr>
+                <w:sz w:val="20"/>
+              </w:rPr>
+              <w:t>...". Pattern: biến guidance mơ hồ thành constraint có checklist cụ thể.</w:t>
+            </w:r>
+          </w:p>
+        </w:tc>
+      </w:tr>
+      <w:tr>
+        <w:tc>
+          <w:tcPr>
+            <w:tcW w:type="dxa" w:w="4844"/>
+            <w:shd w:val="clear" w:color="auto" w:fill="B8B3D6"/>
+            <w:tcBorders>
+              <w:top w:val="single" w:sz="4" w:space="0" w:color="CBCBCB"/>
+              <w:left w:val="single" w:sz="4" w:space="0" w:color="CBCBCB"/>
+              <w:bottom w:val="single" w:sz="4" w:space="0" w:color="CBCBCB"/>
+              <w:right w:val="single" w:sz="4" w:space="0" w:color="CBCBCB"/>
+            </w:tcBorders>
+          </w:tcPr>
+          <w:p>
+            <w:r>
+              <w:rPr>
+                <w:b/>
+                <w:sz w:val="20"/>
+              </w:rPr>
+              <w:t>Lý do thay đổi</w:t>
+            </w:r>
+          </w:p>
+        </w:tc>
+        <w:tc>
+          <w:tcPr>
+            <w:tcW w:type="dxa" w:w="4844"/>
+            <w:shd w:val="clear" w:color="auto" w:fill="B8B3D6"/>
+            <w:tcBorders>
+              <w:top w:val="single" w:sz="4" w:space="0" w:color="CBCBCB"/>
+              <w:left w:val="single" w:sz="4" w:space="0" w:color="CBCBCB"/>
+              <w:bottom w:val="single" w:sz="4" w:space="0" w:color="CBCBCB"/>
+              <w:right w:val="single" w:sz="4" w:space="0" w:color="CBCBCB"/>
+            </w:tcBorders>
+          </w:tcPr>
+          <w:p>
+            <w:r>
+              <w:rPr>
+                <w:sz w:val="20"/>
+              </w:rPr>
+              <w:t>§17 hiện tại nói "đọc trước" nhưng không định nghĩa "đọc để trả lời câu hỏi gì". Agents đọc qua CODE-GRAPH rồi vẫn mở toàn bộ src/ vì không biết khi nào "đã đủ" — tốn 3–5 lần Read tool redundant mỗi task.</w:t>
+            </w:r>
+          </w:p>
+        </w:tc>
+      </w:tr>
+      <w:tr>
+        <w:tc>
+          <w:tcPr>
+            <w:tcW w:type="dxa" w:w="4844"/>
+            <w:tcBorders>
+              <w:top w:val="single" w:sz="4" w:space="0" w:color="CBCBCB"/>
+              <w:left w:val="single" w:sz="4" w:space="0" w:color="CBCBCB"/>
+              <w:bottom w:val="single" w:sz="4" w:space="0" w:color="CBCBCB"/>
+              <w:right w:val="single" w:sz="4" w:space="0" w:color="CBCBCB"/>
+            </w:tcBorders>
+          </w:tcPr>
+          <w:p>
+            <w:r>
+              <w:rPr>
+                <w:b/>
+                <w:sz w:val="20"/>
+              </w:rPr>
+              <w:t>Áp dụng vào đâu</w:t>
+            </w:r>
+          </w:p>
+        </w:tc>
+        <w:tc>
+          <w:tcPr>
+            <w:tcW w:type="dxa" w:w="4844"/>
+            <w:tcBorders>
+              <w:top w:val="single" w:sz="4" w:space="0" w:color="CBCBCB"/>
+              <w:left w:val="single" w:sz="4" w:space="0" w:color="CBCBCB"/>
+              <w:bottom w:val="single" w:sz="4" w:space="0" w:color="CBCBCB"/>
+              <w:right w:val="single" w:sz="4" w:space="0" w:color="CBCBCB"/>
+            </w:tcBorders>
+          </w:tcPr>
+          <w:p>
+            <w:r>
+              <w:rPr>
+                <w:sz w:val="20"/>
+              </w:rPr>
+              <w:t xml:space="preserve">CLAUDE.md §17.1 — thêm mục "Query Checklist bắt buộc": danh sách 4–5 câu hỏi agents PHẢI cố gắng trả lời từ CODE-GRAPH trước khi mở source file (ví dụ: "Module X nằm ở file nào?", "X phụ thuộc vào những module nào?", "Ai gọi X?", "X expose interface/API nào?"). Chỉ khi CODE-GRAPH không trả lời được mới mở source file. </w:t>
+            </w:r>
+            <w:r>
+              <w:rPr>
+                <w:rFonts w:ascii="Courier New" w:hAnsi="Courier New"/>
+                <w:color w:val="F05922"/>
+                <w:sz w:val="20"/>
+              </w:rPr>
+              <w:t>.claude/shared/CORE.md</w:t>
+            </w:r>
+            <w:r>
+              <w:rPr>
+                <w:sz w:val="20"/>
+              </w:rPr>
+              <w:t xml:space="preserve"> §coding-protocol — đồng bộ.</w:t>
+            </w:r>
+          </w:p>
+        </w:tc>
+      </w:tr>
+      <w:tr>
+        <w:tc>
+          <w:tcPr>
+            <w:tcW w:type="dxa" w:w="4844"/>
+            <w:shd w:val="clear" w:color="auto" w:fill="B8B3D6"/>
+            <w:tcBorders>
+              <w:top w:val="single" w:sz="4" w:space="0" w:color="CBCBCB"/>
+              <w:left w:val="single" w:sz="4" w:space="0" w:color="CBCBCB"/>
+              <w:bottom w:val="single" w:sz="4" w:space="0" w:color="CBCBCB"/>
+              <w:right w:val="single" w:sz="4" w:space="0" w:color="CBCBCB"/>
+            </w:tcBorders>
+          </w:tcPr>
+          <w:p>
+            <w:r>
+              <w:rPr>
+                <w:b/>
+                <w:sz w:val="20"/>
+              </w:rPr>
+              <w:t>Đạt được gì</w:t>
+            </w:r>
+          </w:p>
+        </w:tc>
+        <w:tc>
+          <w:tcPr>
+            <w:tcW w:type="dxa" w:w="4844"/>
+            <w:shd w:val="clear" w:color="auto" w:fill="B8B3D6"/>
+            <w:tcBorders>
+              <w:top w:val="single" w:sz="4" w:space="0" w:color="CBCBCB"/>
+              <w:left w:val="single" w:sz="4" w:space="0" w:color="CBCBCB"/>
+              <w:bottom w:val="single" w:sz="4" w:space="0" w:color="CBCBCB"/>
+              <w:right w:val="single" w:sz="4" w:space="0" w:color="CBCBCB"/>
+            </w:tcBorders>
+          </w:tcPr>
+          <w:p>
+            <w:r>
+              <w:rPr>
+                <w:sz w:val="20"/>
+              </w:rPr>
+              <w:t>Agents khai thác CODE-GRAPH có chủ đích thay vì đọc formality → ước tính giảm 2–4 lần Read/Glob tool redundant per coding task quen thuộc. Mỗi task tiết kiệm ~500–1000 tokens context. Sau 10 WF-BUGFIX cycles, tiết kiệm đáng kể tổng token.</w:t>
+            </w:r>
+          </w:p>
+        </w:tc>
+      </w:tr>
+      <w:tr>
+        <w:tc>
+          <w:tcPr>
+            <w:tcW w:type="dxa" w:w="4844"/>
+            <w:tcBorders>
+              <w:top w:val="single" w:sz="4" w:space="0" w:color="CBCBCB"/>
+              <w:left w:val="single" w:sz="4" w:space="0" w:color="CBCBCB"/>
+              <w:bottom w:val="single" w:sz="4" w:space="0" w:color="CBCBCB"/>
+              <w:right w:val="single" w:sz="4" w:space="0" w:color="CBCBCB"/>
+            </w:tcBorders>
+          </w:tcPr>
+          <w:p>
+            <w:r>
+              <w:rPr>
+                <w:b/>
+                <w:sz w:val="20"/>
+              </w:rPr>
+              <w:t>Rủi ro / Effort</w:t>
+            </w:r>
+          </w:p>
+        </w:tc>
+        <w:tc>
+          <w:tcPr>
+            <w:tcW w:type="dxa" w:w="4844"/>
+            <w:tcBorders>
+              <w:top w:val="single" w:sz="4" w:space="0" w:color="CBCBCB"/>
+              <w:left w:val="single" w:sz="4" w:space="0" w:color="CBCBCB"/>
+              <w:bottom w:val="single" w:sz="4" w:space="0" w:color="CBCBCB"/>
+              <w:right w:val="single" w:sz="4" w:space="0" w:color="CBCBCB"/>
+            </w:tcBorders>
+          </w:tcPr>
+          <w:p>
+            <w:r>
+              <w:rPr>
+                <w:sz w:val="20"/>
+              </w:rPr>
+              <w:t xml:space="preserve">Rủi ro: Rất thấp — chỉ là text change trong CLAUDE.md và CORE.md, không thêm dependency, không thay đổi code. Effort: </w:t>
+            </w:r>
+            <w:r>
+              <w:rPr>
+                <w:b/>
+                <w:sz w:val="20"/>
+              </w:rPr>
+              <w:t>Thấp</w:t>
+            </w:r>
+            <w:r>
+              <w:rPr>
+                <w:sz w:val="20"/>
+              </w:rPr>
+              <w:t xml:space="preserve"> — 2–4 giờ (edit §17, viết ví dụ checklist, đồng bộ CORE.md).</w:t>
+            </w:r>
+          </w:p>
+        </w:tc>
+      </w:tr>
+    </w:tbl>
+    <w:p/>
+    <w:p>
+      <w:pPr>
+        <w:pBdr>
+          <w:bottom w:val="single" w:sz="6" w:space="1" w:color="F05922"/>
+        </w:pBdr>
+        <w:spacing w:after="120"/>
+      </w:pPr>
+    </w:p>
+    <w:p>
+      <w:pPr>
+        <w:pStyle w:val="Heading3"/>
+        <w:spacing w:before="160" w:after="60"/>
+      </w:pPr>
+      <w:r>
+        <w:rPr>
+          <w:color w:val="4A3F8C"/>
+          <w:sz w:val="24"/>
+        </w:rPr>
+        <w:t>P3 — Confidence labels trong CODE-GRAPH.md</w:t>
+      </w:r>
+    </w:p>
+    <w:tbl>
+      <w:tblPr>
+        <w:tblStyle w:val="TableGrid"/>
+        <w:tblW w:type="auto" w:w="0"/>
+        <w:tblLook w:firstColumn="1" w:firstRow="1" w:lastColumn="0" w:lastRow="0" w:noHBand="0" w:noVBand="1" w:val="04A0"/>
+      </w:tblPr>
+      <w:tblGrid>
+        <w:gridCol w:w="2422"/>
+        <w:gridCol w:w="2422"/>
+        <w:gridCol w:w="2422"/>
+        <w:gridCol w:w="2422"/>
+      </w:tblGrid>
+      <w:tr>
+        <w:tc>
+          <w:tcPr>
+            <w:tcW w:type="dxa" w:w="2422"/>
+            <w:shd w:val="clear" w:color="auto" w:fill="251C53"/>
+            <w:tcBorders>
+              <w:top w:val="single" w:sz="4" w:space="0" w:color="251C53"/>
+              <w:left w:val="single" w:sz="4" w:space="0" w:color="251C53"/>
+              <w:bottom w:val="single" w:sz="4" w:space="0" w:color="251C53"/>
+              <w:right w:val="single" w:sz="4" w:space="0" w:color="251C53"/>
+            </w:tcBorders>
+          </w:tcPr>
+          <w:p>
+            <w:r>
+              <w:rPr>
+                <w:b/>
+                <w:color w:val="FFFFFF"/>
+                <w:sz w:val="20"/>
+              </w:rPr>
+              <w:t>Trường</w:t>
+            </w:r>
+          </w:p>
+        </w:tc>
+        <w:tc>
+          <w:tcPr>
+            <w:tcW w:type="dxa" w:w="2422"/>
+            <w:shd w:val="clear" w:color="auto" w:fill="251C53"/>
+            <w:tcBorders>
+              <w:top w:val="single" w:sz="4" w:space="0" w:color="251C53"/>
+              <w:left w:val="single" w:sz="4" w:space="0" w:color="251C53"/>
+              <w:bottom w:val="single" w:sz="4" w:space="0" w:color="251C53"/>
+              <w:right w:val="single" w:sz="4" w:space="0" w:color="251C53"/>
+            </w:tcBorders>
+          </w:tcPr>
+          <w:p>
+            <w:r>
+              <w:rPr>
+                <w:b/>
+                <w:color w:val="FFFFFF"/>
+                <w:sz w:val="20"/>
+              </w:rPr>
+              <w:t>Nội dung</w:t>
+            </w:r>
+          </w:p>
+        </w:tc>
+        <w:tc>
+          <w:tcPr>
+            <w:tcW w:type="dxa" w:w="2422"/>
+            <w:shd w:val="clear" w:color="auto" w:fill="251C53"/>
+            <w:tcBorders>
+              <w:top w:val="single" w:sz="4" w:space="0" w:color="251C53"/>
+              <w:left w:val="single" w:sz="4" w:space="0" w:color="251C53"/>
+              <w:bottom w:val="single" w:sz="4" w:space="0" w:color="251C53"/>
+              <w:right w:val="single" w:sz="4" w:space="0" w:color="251C53"/>
+            </w:tcBorders>
+          </w:tcPr>
+          <w:p>
+            <w:r>
+              <w:rPr>
+                <w:b/>
+                <w:color w:val="FFFFFF"/>
+                <w:sz w:val="20"/>
+              </w:rPr>
+            </w:r>
+          </w:p>
+        </w:tc>
+        <w:tc>
+          <w:tcPr>
+            <w:tcW w:type="dxa" w:w="2422"/>
+            <w:shd w:val="clear" w:color="auto" w:fill="251C53"/>
+            <w:tcBorders>
+              <w:top w:val="single" w:sz="4" w:space="0" w:color="251C53"/>
+              <w:left w:val="single" w:sz="4" w:space="0" w:color="251C53"/>
+              <w:bottom w:val="single" w:sz="4" w:space="0" w:color="251C53"/>
+              <w:right w:val="single" w:sz="4" w:space="0" w:color="251C53"/>
+            </w:tcBorders>
+          </w:tcPr>
+          <w:p>
+            <w:r>
+              <w:rPr>
+                <w:b/>
+                <w:color w:val="FFFFFF"/>
+                <w:sz w:val="20"/>
+              </w:rPr>
+            </w:r>
+          </w:p>
+        </w:tc>
+      </w:tr>
+      <w:tr>
+        <w:tc>
+          <w:tcPr>
+            <w:tcW w:type="dxa" w:w="2422"/>
+            <w:tcBorders>
+              <w:top w:val="single" w:sz="4" w:space="0" w:color="CBCBCB"/>
+              <w:left w:val="single" w:sz="4" w:space="0" w:color="CBCBCB"/>
+              <w:bottom w:val="single" w:sz="4" w:space="0" w:color="CBCBCB"/>
+              <w:right w:val="single" w:sz="4" w:space="0" w:color="CBCBCB"/>
+            </w:tcBorders>
+          </w:tcPr>
+          <w:p>
+            <w:r>
+              <w:rPr>
+                <w:sz w:val="20"/>
+              </w:rPr>
+              <w:t>--------</w:t>
+            </w:r>
+          </w:p>
+        </w:tc>
+        <w:tc>
+          <w:tcPr>
+            <w:tcW w:type="dxa" w:w="2422"/>
+            <w:tcBorders>
+              <w:top w:val="single" w:sz="4" w:space="0" w:color="CBCBCB"/>
+              <w:left w:val="single" w:sz="4" w:space="0" w:color="CBCBCB"/>
+              <w:bottom w:val="single" w:sz="4" w:space="0" w:color="CBCBCB"/>
+              <w:right w:val="single" w:sz="4" w:space="0" w:color="CBCBCB"/>
+            </w:tcBorders>
+          </w:tcPr>
+          <w:p>
+            <w:r>
+              <w:rPr>
+                <w:sz w:val="20"/>
+              </w:rPr>
+              <w:t>---------</w:t>
+            </w:r>
+          </w:p>
+        </w:tc>
+        <w:tc>
+          <w:tcPr>
+            <w:tcW w:type="dxa" w:w="2422"/>
+            <w:tcBorders>
+              <w:top w:val="single" w:sz="4" w:space="0" w:color="CBCBCB"/>
+              <w:left w:val="single" w:sz="4" w:space="0" w:color="CBCBCB"/>
+              <w:bottom w:val="single" w:sz="4" w:space="0" w:color="CBCBCB"/>
+              <w:right w:val="single" w:sz="4" w:space="0" w:color="CBCBCB"/>
+            </w:tcBorders>
+          </w:tcPr>
+          <w:p/>
+        </w:tc>
+        <w:tc>
+          <w:tcPr>
+            <w:tcW w:type="dxa" w:w="2422"/>
+            <w:tcBorders>
+              <w:top w:val="single" w:sz="4" w:space="0" w:color="CBCBCB"/>
+              <w:left w:val="single" w:sz="4" w:space="0" w:color="CBCBCB"/>
+              <w:bottom w:val="single" w:sz="4" w:space="0" w:color="CBCBCB"/>
+              <w:right w:val="single" w:sz="4" w:space="0" w:color="CBCBCB"/>
+            </w:tcBorders>
+          </w:tcPr>
+          <w:p/>
+        </w:tc>
+      </w:tr>
+      <w:tr>
+        <w:tc>
+          <w:tcPr>
+            <w:tcW w:type="dxa" w:w="2422"/>
+            <w:shd w:val="clear" w:color="auto" w:fill="B8B3D6"/>
+            <w:tcBorders>
+              <w:top w:val="single" w:sz="4" w:space="0" w:color="CBCBCB"/>
+              <w:left w:val="single" w:sz="4" w:space="0" w:color="CBCBCB"/>
+              <w:bottom w:val="single" w:sz="4" w:space="0" w:color="CBCBCB"/>
+              <w:right w:val="single" w:sz="4" w:space="0" w:color="CBCBCB"/>
+            </w:tcBorders>
+          </w:tcPr>
+          <w:p>
+            <w:r>
+              <w:rPr>
+                <w:b/>
+                <w:sz w:val="20"/>
+              </w:rPr>
+              <w:t>Hiện trạng KZTEK</w:t>
+            </w:r>
+          </w:p>
+        </w:tc>
+        <w:tc>
+          <w:tcPr>
+            <w:tcW w:type="dxa" w:w="2422"/>
+            <w:shd w:val="clear" w:color="auto" w:fill="B8B3D6"/>
+            <w:tcBorders>
+              <w:top w:val="single" w:sz="4" w:space="0" w:color="CBCBCB"/>
+              <w:left w:val="single" w:sz="4" w:space="0" w:color="CBCBCB"/>
+              <w:bottom w:val="single" w:sz="4" w:space="0" w:color="CBCBCB"/>
+              <w:right w:val="single" w:sz="4" w:space="0" w:color="CBCBCB"/>
+            </w:tcBorders>
+          </w:tcPr>
+          <w:p>
+            <w:r>
+              <w:rPr>
+                <w:sz w:val="20"/>
+              </w:rPr>
+              <w:t xml:space="preserve">CODE-GRAPH.md không có cơ chế phân biệt giữa relationship "đã verify qua code thực tế" và "agent infer từ tên file/convention" và "không chắc chắn". Template </w:t>
+            </w:r>
+            <w:r>
+              <w:rPr>
+                <w:rFonts w:ascii="Courier New" w:hAnsi="Courier New"/>
+                <w:color w:val="F05922"/>
+                <w:sz w:val="20"/>
+              </w:rPr>
+              <w:t>.claude/templates/CODE-GRAPH-template.md</w:t>
+            </w:r>
+            <w:r>
+              <w:rPr>
+                <w:sz w:val="20"/>
+              </w:rPr>
+              <w:t xml:space="preserve"> không có trường confidence.</w:t>
+            </w:r>
+          </w:p>
+        </w:tc>
+        <w:tc>
+          <w:tcPr>
+            <w:tcW w:type="dxa" w:w="2422"/>
+            <w:shd w:val="clear" w:color="auto" w:fill="B8B3D6"/>
+            <w:tcBorders>
+              <w:top w:val="single" w:sz="4" w:space="0" w:color="CBCBCB"/>
+              <w:left w:val="single" w:sz="4" w:space="0" w:color="CBCBCB"/>
+              <w:bottom w:val="single" w:sz="4" w:space="0" w:color="CBCBCB"/>
+              <w:right w:val="single" w:sz="4" w:space="0" w:color="CBCBCB"/>
+            </w:tcBorders>
+          </w:tcPr>
+          <w:p/>
+        </w:tc>
+        <w:tc>
+          <w:tcPr>
+            <w:tcW w:type="dxa" w:w="2422"/>
+            <w:shd w:val="clear" w:color="auto" w:fill="B8B3D6"/>
+            <w:tcBorders>
+              <w:top w:val="single" w:sz="4" w:space="0" w:color="CBCBCB"/>
+              <w:left w:val="single" w:sz="4" w:space="0" w:color="CBCBCB"/>
+              <w:bottom w:val="single" w:sz="4" w:space="0" w:color="CBCBCB"/>
+              <w:right w:val="single" w:sz="4" w:space="0" w:color="CBCBCB"/>
+            </w:tcBorders>
+          </w:tcPr>
+          <w:p/>
+        </w:tc>
+      </w:tr>
+      <w:tr>
+        <w:tc>
+          <w:tcPr>
+            <w:tcW w:type="dxa" w:w="2422"/>
+            <w:tcBorders>
+              <w:top w:val="single" w:sz="4" w:space="0" w:color="CBCBCB"/>
+              <w:left w:val="single" w:sz="4" w:space="0" w:color="CBCBCB"/>
+              <w:bottom w:val="single" w:sz="4" w:space="0" w:color="CBCBCB"/>
+              <w:right w:val="single" w:sz="4" w:space="0" w:color="CBCBCB"/>
+            </w:tcBorders>
+          </w:tcPr>
+          <w:p>
+            <w:r>
+              <w:rPr>
+                <w:b/>
+                <w:sz w:val="20"/>
+              </w:rPr>
+              <w:t>Học từ đâu</w:t>
+            </w:r>
+          </w:p>
+        </w:tc>
+        <w:tc>
+          <w:tcPr>
+            <w:tcW w:type="dxa" w:w="2422"/>
+            <w:tcBorders>
+              <w:top w:val="single" w:sz="4" w:space="0" w:color="CBCBCB"/>
+              <w:left w:val="single" w:sz="4" w:space="0" w:color="CBCBCB"/>
+              <w:bottom w:val="single" w:sz="4" w:space="0" w:color="CBCBCB"/>
+              <w:right w:val="single" w:sz="4" w:space="0" w:color="CBCBCB"/>
+            </w:tcBorders>
+          </w:tcPr>
+          <w:p>
+            <w:r>
+              <w:rPr>
+                <w:sz w:val="20"/>
+              </w:rPr>
+              <w:t>Extraction output schema (</w:t>
+            </w:r>
+            <w:r>
+              <w:rPr>
+                <w:rFonts w:ascii="Courier New" w:hAnsi="Courier New"/>
+                <w:color w:val="F05922"/>
+                <w:sz w:val="20"/>
+              </w:rPr>
+              <w:t>extract.py</w:t>
+            </w:r>
+            <w:r>
+              <w:rPr>
+                <w:sz w:val="20"/>
+              </w:rPr>
+              <w:t xml:space="preserve">, </w:t>
+            </w:r>
+            <w:r>
+              <w:rPr>
+                <w:rFonts w:ascii="Courier New" w:hAnsi="Courier New"/>
+                <w:color w:val="F05922"/>
+                <w:sz w:val="20"/>
+              </w:rPr>
+              <w:t>validate.py</w:t>
+            </w:r>
+            <w:r>
+              <w:rPr>
+                <w:sz w:val="20"/>
+              </w:rPr>
+              <w:t>) — trường `"confidence": "EXTRACTED</w:t>
+            </w:r>
+          </w:p>
+        </w:tc>
+        <w:tc>
+          <w:tcPr>
+            <w:tcW w:type="dxa" w:w="2422"/>
+            <w:tcBorders>
+              <w:top w:val="single" w:sz="4" w:space="0" w:color="CBCBCB"/>
+              <w:left w:val="single" w:sz="4" w:space="0" w:color="CBCBCB"/>
+              <w:bottom w:val="single" w:sz="4" w:space="0" w:color="CBCBCB"/>
+              <w:right w:val="single" w:sz="4" w:space="0" w:color="CBCBCB"/>
+            </w:tcBorders>
+          </w:tcPr>
+          <w:p>
+            <w:r>
+              <w:rPr>
+                <w:sz w:val="20"/>
+              </w:rPr>
+              <w:t>INFERRED</w:t>
+            </w:r>
+          </w:p>
+        </w:tc>
+        <w:tc>
+          <w:tcPr>
+            <w:tcW w:type="dxa" w:w="2422"/>
+            <w:tcBorders>
+              <w:top w:val="single" w:sz="4" w:space="0" w:color="CBCBCB"/>
+              <w:left w:val="single" w:sz="4" w:space="0" w:color="CBCBCB"/>
+              <w:bottom w:val="single" w:sz="4" w:space="0" w:color="CBCBCB"/>
+              <w:right w:val="single" w:sz="4" w:space="0" w:color="CBCBCB"/>
+            </w:tcBorders>
+          </w:tcPr>
+          <w:p>
+            <w:r>
+              <w:rPr>
+                <w:sz w:val="20"/>
+              </w:rPr>
+              <w:t>AMBIGUOUS"</w:t>
+            </w:r>
+            <w:r>
+              <w:rPr>
+                <w:rFonts w:ascii="Courier New" w:hAnsi="Courier New"/>
+                <w:color w:val="F05922"/>
+                <w:sz w:val="20"/>
+              </w:rPr>
+              <w:t xml:space="preserve"> cho mỗi edge. </w:t>
+            </w:r>
+            <w:r>
+              <w:rPr>
+                <w:sz w:val="20"/>
+              </w:rPr>
+              <w:t>EXTRACTED</w:t>
+            </w:r>
+            <w:r>
+              <w:rPr>
+                <w:rFonts w:ascii="Courier New" w:hAnsi="Courier New"/>
+                <w:color w:val="F05922"/>
+                <w:sz w:val="20"/>
+              </w:rPr>
+              <w:t xml:space="preserve"> = explicit trong source code; </w:t>
+            </w:r>
+            <w:r>
+              <w:rPr>
+                <w:sz w:val="20"/>
+              </w:rPr>
+              <w:t>INFERRED</w:t>
+            </w:r>
+            <w:r>
+              <w:rPr>
+                <w:rFonts w:ascii="Courier New" w:hAnsi="Courier New"/>
+                <w:color w:val="F05922"/>
+                <w:sz w:val="20"/>
+              </w:rPr>
+              <w:t xml:space="preserve"> = suy diễn từ call-graph second pass; </w:t>
+            </w:r>
+            <w:r>
+              <w:rPr>
+                <w:sz w:val="20"/>
+              </w:rPr>
+              <w:t>AMBIGUOUS` = không chắc, flagged cho human review.</w:t>
+            </w:r>
+          </w:p>
+        </w:tc>
+      </w:tr>
+      <w:tr>
+        <w:tc>
+          <w:tcPr>
+            <w:tcW w:type="dxa" w:w="2422"/>
+            <w:shd w:val="clear" w:color="auto" w:fill="B8B3D6"/>
+            <w:tcBorders>
+              <w:top w:val="single" w:sz="4" w:space="0" w:color="CBCBCB"/>
+              <w:left w:val="single" w:sz="4" w:space="0" w:color="CBCBCB"/>
+              <w:bottom w:val="single" w:sz="4" w:space="0" w:color="CBCBCB"/>
+              <w:right w:val="single" w:sz="4" w:space="0" w:color="CBCBCB"/>
+            </w:tcBorders>
+          </w:tcPr>
+          <w:p>
+            <w:r>
+              <w:rPr>
+                <w:b/>
+                <w:sz w:val="20"/>
+              </w:rPr>
+              <w:t>Lý do thay đổi</w:t>
+            </w:r>
+          </w:p>
+        </w:tc>
+        <w:tc>
+          <w:tcPr>
+            <w:tcW w:type="dxa" w:w="2422"/>
+            <w:shd w:val="clear" w:color="auto" w:fill="B8B3D6"/>
+            <w:tcBorders>
+              <w:top w:val="single" w:sz="4" w:space="0" w:color="CBCBCB"/>
+              <w:left w:val="single" w:sz="4" w:space="0" w:color="CBCBCB"/>
+              <w:bottom w:val="single" w:sz="4" w:space="0" w:color="CBCBCB"/>
+              <w:right w:val="single" w:sz="4" w:space="0" w:color="CBCBCB"/>
+            </w:tcBorders>
+          </w:tcPr>
+          <w:p>
+            <w:r>
+              <w:rPr>
+                <w:sz w:val="20"/>
+              </w:rPr>
+              <w:t>Agents đọc CODE-GRAPH thấy "module A gọi module B" không biết liệu đây là verified từ code review hay bước trước đoán dựa trên naming convention — có thể đưa ra assumption sai, dẫn đến bug hoặc phải verify lại từ đầu.</w:t>
+            </w:r>
+          </w:p>
+        </w:tc>
+        <w:tc>
+          <w:tcPr>
+            <w:tcW w:type="dxa" w:w="2422"/>
+            <w:shd w:val="clear" w:color="auto" w:fill="B8B3D6"/>
+            <w:tcBorders>
+              <w:top w:val="single" w:sz="4" w:space="0" w:color="CBCBCB"/>
+              <w:left w:val="single" w:sz="4" w:space="0" w:color="CBCBCB"/>
+              <w:bottom w:val="single" w:sz="4" w:space="0" w:color="CBCBCB"/>
+              <w:right w:val="single" w:sz="4" w:space="0" w:color="CBCBCB"/>
+            </w:tcBorders>
+          </w:tcPr>
+          <w:p/>
+        </w:tc>
+        <w:tc>
+          <w:tcPr>
+            <w:tcW w:type="dxa" w:w="2422"/>
+            <w:shd w:val="clear" w:color="auto" w:fill="B8B3D6"/>
+            <w:tcBorders>
+              <w:top w:val="single" w:sz="4" w:space="0" w:color="CBCBCB"/>
+              <w:left w:val="single" w:sz="4" w:space="0" w:color="CBCBCB"/>
+              <w:bottom w:val="single" w:sz="4" w:space="0" w:color="CBCBCB"/>
+              <w:right w:val="single" w:sz="4" w:space="0" w:color="CBCBCB"/>
+            </w:tcBorders>
+          </w:tcPr>
+          <w:p/>
+        </w:tc>
+      </w:tr>
+      <w:tr>
+        <w:tc>
+          <w:tcPr>
+            <w:tcW w:type="dxa" w:w="2422"/>
+            <w:tcBorders>
+              <w:top w:val="single" w:sz="4" w:space="0" w:color="CBCBCB"/>
+              <w:left w:val="single" w:sz="4" w:space="0" w:color="CBCBCB"/>
+              <w:bottom w:val="single" w:sz="4" w:space="0" w:color="CBCBCB"/>
+              <w:right w:val="single" w:sz="4" w:space="0" w:color="CBCBCB"/>
+            </w:tcBorders>
+          </w:tcPr>
+          <w:p>
+            <w:r>
+              <w:rPr>
+                <w:b/>
+                <w:sz w:val="20"/>
+              </w:rPr>
+              <w:t>Áp dụng vào đâu</w:t>
+            </w:r>
+          </w:p>
+        </w:tc>
+        <w:tc>
+          <w:tcPr>
+            <w:tcW w:type="dxa" w:w="2422"/>
+            <w:tcBorders>
+              <w:top w:val="single" w:sz="4" w:space="0" w:color="CBCBCB"/>
+              <w:left w:val="single" w:sz="4" w:space="0" w:color="CBCBCB"/>
+              <w:bottom w:val="single" w:sz="4" w:space="0" w:color="CBCBCB"/>
+              <w:right w:val="single" w:sz="4" w:space="0" w:color="CBCBCB"/>
+            </w:tcBorders>
+          </w:tcPr>
+          <w:p>
+            <w:r>
+              <w:rPr>
+                <w:rFonts w:ascii="Courier New" w:hAnsi="Courier New"/>
+                <w:color w:val="F05922"/>
+                <w:sz w:val="20"/>
+              </w:rPr>
+              <w:t>.claude/templates/CODE-GRAPH-template.md</w:t>
+            </w:r>
+            <w:r>
+              <w:rPr>
+                <w:sz w:val="20"/>
+              </w:rPr>
+              <w:t xml:space="preserve"> — thêm cột </w:t>
+            </w:r>
+            <w:r>
+              <w:rPr>
+                <w:rFonts w:ascii="Courier New" w:hAnsi="Courier New"/>
+                <w:color w:val="F05922"/>
+                <w:sz w:val="20"/>
+              </w:rPr>
+              <w:t>Confidence</w:t>
+            </w:r>
+            <w:r>
+              <w:rPr>
+                <w:sz w:val="20"/>
+              </w:rPr>
+              <w:t xml:space="preserve"> (CONFIRMED / INFERRED / UNCERTAIN) cho relationship entries. CLAUDE.md §17.2 — thêm quy tắc: "Khi edit CODE-GRAPH, đánh dấu confidence cho mỗi relationship entry: CONFIRMED (đọc code trực tiếp), INFERRED (suy luận từ cấu trúc), UNCERTAIN (cần verify)."</w:t>
+            </w:r>
+          </w:p>
+        </w:tc>
+        <w:tc>
+          <w:tcPr>
+            <w:tcW w:type="dxa" w:w="2422"/>
+            <w:tcBorders>
+              <w:top w:val="single" w:sz="4" w:space="0" w:color="CBCBCB"/>
+              <w:left w:val="single" w:sz="4" w:space="0" w:color="CBCBCB"/>
+              <w:bottom w:val="single" w:sz="4" w:space="0" w:color="CBCBCB"/>
+              <w:right w:val="single" w:sz="4" w:space="0" w:color="CBCBCB"/>
+            </w:tcBorders>
+          </w:tcPr>
+          <w:p/>
+        </w:tc>
+        <w:tc>
+          <w:tcPr>
+            <w:tcW w:type="dxa" w:w="2422"/>
+            <w:tcBorders>
+              <w:top w:val="single" w:sz="4" w:space="0" w:color="CBCBCB"/>
+              <w:left w:val="single" w:sz="4" w:space="0" w:color="CBCBCB"/>
+              <w:bottom w:val="single" w:sz="4" w:space="0" w:color="CBCBCB"/>
+              <w:right w:val="single" w:sz="4" w:space="0" w:color="CBCBCB"/>
+            </w:tcBorders>
+          </w:tcPr>
+          <w:p/>
+        </w:tc>
+      </w:tr>
+      <w:tr>
+        <w:tc>
+          <w:tcPr>
+            <w:tcW w:type="dxa" w:w="2422"/>
+            <w:shd w:val="clear" w:color="auto" w:fill="B8B3D6"/>
+            <w:tcBorders>
+              <w:top w:val="single" w:sz="4" w:space="0" w:color="CBCBCB"/>
+              <w:left w:val="single" w:sz="4" w:space="0" w:color="CBCBCB"/>
+              <w:bottom w:val="single" w:sz="4" w:space="0" w:color="CBCBCB"/>
+              <w:right w:val="single" w:sz="4" w:space="0" w:color="CBCBCB"/>
+            </w:tcBorders>
+          </w:tcPr>
+          <w:p>
+            <w:r>
+              <w:rPr>
+                <w:b/>
+                <w:sz w:val="20"/>
+              </w:rPr>
+              <w:t>Đạt được gì</w:t>
+            </w:r>
+          </w:p>
+        </w:tc>
+        <w:tc>
+          <w:tcPr>
+            <w:tcW w:type="dxa" w:w="2422"/>
+            <w:shd w:val="clear" w:color="auto" w:fill="B8B3D6"/>
+            <w:tcBorders>
+              <w:top w:val="single" w:sz="4" w:space="0" w:color="CBCBCB"/>
+              <w:left w:val="single" w:sz="4" w:space="0" w:color="CBCBCB"/>
+              <w:bottom w:val="single" w:sz="4" w:space="0" w:color="CBCBCB"/>
+              <w:right w:val="single" w:sz="4" w:space="0" w:color="CBCBCB"/>
+            </w:tcBorders>
+          </w:tcPr>
+          <w:p>
+            <w:r>
+              <w:rPr>
+                <w:sz w:val="20"/>
+              </w:rPr>
+              <w:t>(a) Agents xử lý CONFIRMED relationships như ground truth, UNCERTAIN như "cần verify trước khi dùng" → giảm bug từ incorrect assumption. (b) Tech Lead review CODE-GRAPH có thể filter UNCERTAIN entries và ưu tiên verify trong code review — không bỏ sót relationship không chắc.</w:t>
+            </w:r>
+          </w:p>
+        </w:tc>
+        <w:tc>
+          <w:tcPr>
+            <w:tcW w:type="dxa" w:w="2422"/>
+            <w:shd w:val="clear" w:color="auto" w:fill="B8B3D6"/>
+            <w:tcBorders>
+              <w:top w:val="single" w:sz="4" w:space="0" w:color="CBCBCB"/>
+              <w:left w:val="single" w:sz="4" w:space="0" w:color="CBCBCB"/>
+              <w:bottom w:val="single" w:sz="4" w:space="0" w:color="CBCBCB"/>
+              <w:right w:val="single" w:sz="4" w:space="0" w:color="CBCBCB"/>
+            </w:tcBorders>
+          </w:tcPr>
+          <w:p/>
+        </w:tc>
+        <w:tc>
+          <w:tcPr>
+            <w:tcW w:type="dxa" w:w="2422"/>
+            <w:shd w:val="clear" w:color="auto" w:fill="B8B3D6"/>
+            <w:tcBorders>
+              <w:top w:val="single" w:sz="4" w:space="0" w:color="CBCBCB"/>
+              <w:left w:val="single" w:sz="4" w:space="0" w:color="CBCBCB"/>
+              <w:bottom w:val="single" w:sz="4" w:space="0" w:color="CBCBCB"/>
+              <w:right w:val="single" w:sz="4" w:space="0" w:color="CBCBCB"/>
+            </w:tcBorders>
+          </w:tcPr>
+          <w:p/>
+        </w:tc>
+      </w:tr>
+      <w:tr>
+        <w:tc>
+          <w:tcPr>
+            <w:tcW w:type="dxa" w:w="2422"/>
+            <w:tcBorders>
+              <w:top w:val="single" w:sz="4" w:space="0" w:color="CBCBCB"/>
+              <w:left w:val="single" w:sz="4" w:space="0" w:color="CBCBCB"/>
+              <w:bottom w:val="single" w:sz="4" w:space="0" w:color="CBCBCB"/>
+              <w:right w:val="single" w:sz="4" w:space="0" w:color="CBCBCB"/>
+            </w:tcBorders>
+          </w:tcPr>
+          <w:p>
+            <w:r>
+              <w:rPr>
+                <w:b/>
+                <w:sz w:val="20"/>
+              </w:rPr>
+              <w:t>Rủi ro / Effort</w:t>
+            </w:r>
+          </w:p>
+        </w:tc>
+        <w:tc>
+          <w:tcPr>
+            <w:tcW w:type="dxa" w:w="2422"/>
+            <w:tcBorders>
+              <w:top w:val="single" w:sz="4" w:space="0" w:color="CBCBCB"/>
+              <w:left w:val="single" w:sz="4" w:space="0" w:color="CBCBCB"/>
+              <w:bottom w:val="single" w:sz="4" w:space="0" w:color="CBCBCB"/>
+              <w:right w:val="single" w:sz="4" w:space="0" w:color="CBCBCB"/>
+            </w:tcBorders>
+          </w:tcPr>
+          <w:p>
+            <w:r>
+              <w:rPr>
+                <w:sz w:val="20"/>
+              </w:rPr>
+              <w:t xml:space="preserve">Rủi ro: Thấp. Agents phải thêm 1 trường khi edit CODE-GRAPH — tăng nhẹ effort viết. Risk: agents lười ghi "CONFIRMED" hết mà không verify thực tế → cần TL spot-check. Effort: </w:t>
+            </w:r>
+            <w:r>
+              <w:rPr>
+                <w:b/>
+                <w:sz w:val="20"/>
+              </w:rPr>
+              <w:t>Thấp</w:t>
+            </w:r>
+            <w:r>
+              <w:rPr>
+                <w:sz w:val="20"/>
+              </w:rPr>
+              <w:t xml:space="preserve"> — 4–8 giờ (edit template + §17 + viết ví dụ trong template).</w:t>
+            </w:r>
+          </w:p>
+        </w:tc>
+        <w:tc>
+          <w:tcPr>
+            <w:tcW w:type="dxa" w:w="2422"/>
+            <w:tcBorders>
+              <w:top w:val="single" w:sz="4" w:space="0" w:color="CBCBCB"/>
+              <w:left w:val="single" w:sz="4" w:space="0" w:color="CBCBCB"/>
+              <w:bottom w:val="single" w:sz="4" w:space="0" w:color="CBCBCB"/>
+              <w:right w:val="single" w:sz="4" w:space="0" w:color="CBCBCB"/>
+            </w:tcBorders>
+          </w:tcPr>
+          <w:p/>
+        </w:tc>
+        <w:tc>
+          <w:tcPr>
+            <w:tcW w:type="dxa" w:w="2422"/>
+            <w:tcBorders>
+              <w:top w:val="single" w:sz="4" w:space="0" w:color="CBCBCB"/>
+              <w:left w:val="single" w:sz="4" w:space="0" w:color="CBCBCB"/>
+              <w:bottom w:val="single" w:sz="4" w:space="0" w:color="CBCBCB"/>
+              <w:right w:val="single" w:sz="4" w:space="0" w:color="CBCBCB"/>
+            </w:tcBorders>
+          </w:tcPr>
+          <w:p/>
+        </w:tc>
+      </w:tr>
+    </w:tbl>
+    <w:p/>
+    <w:p>
+      <w:pPr>
+        <w:pBdr>
+          <w:bottom w:val="single" w:sz="6" w:space="1" w:color="F05922"/>
+        </w:pBdr>
+        <w:spacing w:after="120"/>
+      </w:pPr>
+    </w:p>
+    <w:p>
+      <w:pPr>
+        <w:pStyle w:val="Heading3"/>
+        <w:spacing w:before="160" w:after="60"/>
+      </w:pPr>
+      <w:r>
+        <w:rPr>
+          <w:color w:val="4A3F8C"/>
+          <w:sz w:val="24"/>
+        </w:rPr>
+        <w:t>P4 — "CODE-GRAPH impact" field trong PR checklist §15.3</w:t>
+      </w:r>
+    </w:p>
+    <w:tbl>
+      <w:tblPr>
+        <w:tblStyle w:val="TableGrid"/>
+        <w:tblW w:type="auto" w:w="0"/>
+        <w:tblLook w:firstColumn="1" w:firstRow="1" w:lastColumn="0" w:lastRow="0" w:noHBand="0" w:noVBand="1" w:val="04A0"/>
+      </w:tblPr>
+      <w:tblGrid>
+        <w:gridCol w:w="4844"/>
+        <w:gridCol w:w="4844"/>
+      </w:tblGrid>
+      <w:tr>
+        <w:tc>
+          <w:tcPr>
+            <w:tcW w:type="dxa" w:w="4844"/>
+            <w:shd w:val="clear" w:color="auto" w:fill="251C53"/>
+            <w:tcBorders>
+              <w:top w:val="single" w:sz="4" w:space="0" w:color="251C53"/>
+              <w:left w:val="single" w:sz="4" w:space="0" w:color="251C53"/>
+              <w:bottom w:val="single" w:sz="4" w:space="0" w:color="251C53"/>
+              <w:right w:val="single" w:sz="4" w:space="0" w:color="251C53"/>
+            </w:tcBorders>
+          </w:tcPr>
+          <w:p>
+            <w:r>
+              <w:rPr>
+                <w:b/>
+                <w:color w:val="FFFFFF"/>
+                <w:sz w:val="20"/>
+              </w:rPr>
+              <w:t>Trường</w:t>
+            </w:r>
+          </w:p>
+        </w:tc>
+        <w:tc>
+          <w:tcPr>
+            <w:tcW w:type="dxa" w:w="4844"/>
+            <w:shd w:val="clear" w:color="auto" w:fill="251C53"/>
+            <w:tcBorders>
+              <w:top w:val="single" w:sz="4" w:space="0" w:color="251C53"/>
+              <w:left w:val="single" w:sz="4" w:space="0" w:color="251C53"/>
+              <w:bottom w:val="single" w:sz="4" w:space="0" w:color="251C53"/>
+              <w:right w:val="single" w:sz="4" w:space="0" w:color="251C53"/>
+            </w:tcBorders>
+          </w:tcPr>
+          <w:p>
+            <w:r>
+              <w:rPr>
+                <w:b/>
+                <w:color w:val="FFFFFF"/>
+                <w:sz w:val="20"/>
+              </w:rPr>
+              <w:t>Nội dung</w:t>
+            </w:r>
+          </w:p>
+        </w:tc>
+      </w:tr>
+      <w:tr>
+        <w:tc>
+          <w:tcPr>
+            <w:tcW w:type="dxa" w:w="4844"/>
+            <w:tcBorders>
+              <w:top w:val="single" w:sz="4" w:space="0" w:color="CBCBCB"/>
+              <w:left w:val="single" w:sz="4" w:space="0" w:color="CBCBCB"/>
+              <w:bottom w:val="single" w:sz="4" w:space="0" w:color="CBCBCB"/>
+              <w:right w:val="single" w:sz="4" w:space="0" w:color="CBCBCB"/>
+            </w:tcBorders>
+          </w:tcPr>
+          <w:p>
+            <w:r>
+              <w:rPr>
+                <w:sz w:val="20"/>
+              </w:rPr>
+              <w:t>--------</w:t>
+            </w:r>
+          </w:p>
+        </w:tc>
+        <w:tc>
+          <w:tcPr>
+            <w:tcW w:type="dxa" w:w="4844"/>
+            <w:tcBorders>
+              <w:top w:val="single" w:sz="4" w:space="0" w:color="CBCBCB"/>
+              <w:left w:val="single" w:sz="4" w:space="0" w:color="CBCBCB"/>
+              <w:bottom w:val="single" w:sz="4" w:space="0" w:color="CBCBCB"/>
+              <w:right w:val="single" w:sz="4" w:space="0" w:color="CBCBCB"/>
+            </w:tcBorders>
+          </w:tcPr>
+          <w:p>
+            <w:r>
+              <w:rPr>
+                <w:sz w:val="20"/>
+              </w:rPr>
+              <w:t>---------</w:t>
+            </w:r>
+          </w:p>
+        </w:tc>
+      </w:tr>
+      <w:tr>
+        <w:tc>
+          <w:tcPr>
+            <w:tcW w:type="dxa" w:w="4844"/>
+            <w:shd w:val="clear" w:color="auto" w:fill="B8B3D6"/>
+            <w:tcBorders>
+              <w:top w:val="single" w:sz="4" w:space="0" w:color="CBCBCB"/>
+              <w:left w:val="single" w:sz="4" w:space="0" w:color="CBCBCB"/>
+              <w:bottom w:val="single" w:sz="4" w:space="0" w:color="CBCBCB"/>
+              <w:right w:val="single" w:sz="4" w:space="0" w:color="CBCBCB"/>
+            </w:tcBorders>
+          </w:tcPr>
+          <w:p>
+            <w:r>
+              <w:rPr>
+                <w:b/>
+                <w:sz w:val="20"/>
+              </w:rPr>
+              <w:t>Hiện trạng KZTEK</w:t>
+            </w:r>
+          </w:p>
+        </w:tc>
+        <w:tc>
+          <w:tcPr>
+            <w:tcW w:type="dxa" w:w="4844"/>
+            <w:shd w:val="clear" w:color="auto" w:fill="B8B3D6"/>
+            <w:tcBorders>
+              <w:top w:val="single" w:sz="4" w:space="0" w:color="CBCBCB"/>
+              <w:left w:val="single" w:sz="4" w:space="0" w:color="CBCBCB"/>
+              <w:bottom w:val="single" w:sz="4" w:space="0" w:color="CBCBCB"/>
+              <w:right w:val="single" w:sz="4" w:space="0" w:color="CBCBCB"/>
+            </w:tcBorders>
+          </w:tcPr>
+          <w:p>
+            <w:r>
+              <w:rPr>
+                <w:sz w:val="20"/>
+              </w:rPr>
+              <w:t>CLAUDE.md §15.3 PR checklist có dòng "CODE-GRAPH cập nhật (nếu thay đổi structure/API)" — chỉ là Yes/No. Không yêu cầu liệt kê cụ thể module/node nào bị ảnh hưởng.</w:t>
+            </w:r>
+          </w:p>
+        </w:tc>
+      </w:tr>
+      <w:tr>
+        <w:tc>
+          <w:tcPr>
+            <w:tcW w:type="dxa" w:w="4844"/>
+            <w:tcBorders>
+              <w:top w:val="single" w:sz="4" w:space="0" w:color="CBCBCB"/>
+              <w:left w:val="single" w:sz="4" w:space="0" w:color="CBCBCB"/>
+              <w:bottom w:val="single" w:sz="4" w:space="0" w:color="CBCBCB"/>
+              <w:right w:val="single" w:sz="4" w:space="0" w:color="CBCBCB"/>
+            </w:tcBorders>
+          </w:tcPr>
+          <w:p>
+            <w:r>
+              <w:rPr>
+                <w:b/>
+                <w:sz w:val="20"/>
+              </w:rPr>
+              <w:t>Học từ đâu</w:t>
+            </w:r>
+          </w:p>
+        </w:tc>
+        <w:tc>
+          <w:tcPr>
+            <w:tcW w:type="dxa" w:w="4844"/>
+            <w:tcBorders>
+              <w:top w:val="single" w:sz="4" w:space="0" w:color="CBCBCB"/>
+              <w:left w:val="single" w:sz="4" w:space="0" w:color="CBCBCB"/>
+              <w:bottom w:val="single" w:sz="4" w:space="0" w:color="CBCBCB"/>
+              <w:right w:val="single" w:sz="4" w:space="0" w:color="CBCBCB"/>
+            </w:tcBorders>
+          </w:tcPr>
+          <w:p>
+            <w:r>
+              <w:rPr>
+                <w:rFonts w:ascii="Courier New" w:hAnsi="Courier New"/>
+                <w:color w:val="F05922"/>
+                <w:sz w:val="20"/>
+              </w:rPr>
+              <w:t>prs.py</w:t>
+            </w:r>
+            <w:r>
+              <w:rPr>
+                <w:sz w:val="20"/>
+              </w:rPr>
+              <w:t xml:space="preserve"> — </w:t>
+            </w:r>
+            <w:r>
+              <w:rPr>
+                <w:rFonts w:ascii="Courier New" w:hAnsi="Courier New"/>
+                <w:color w:val="F05922"/>
+                <w:sz w:val="20"/>
+              </w:rPr>
+              <w:t>graphify prs &lt;N&gt;</w:t>
+            </w:r>
+            <w:r>
+              <w:rPr>
+                <w:sz w:val="20"/>
+              </w:rPr>
+              <w:t xml:space="preserve"> hiển thị graph impact: node/edge nào bị ảnh hưởng bởi PR đó, kết nối git history với graph. Nguyên lý: reviewer cần biết structural impact ngay trong PR description, không phải sau khi mở CODE-GRAPH riêng.</w:t>
+            </w:r>
+          </w:p>
+        </w:tc>
+      </w:tr>
+      <w:tr>
+        <w:tc>
+          <w:tcPr>
+            <w:tcW w:type="dxa" w:w="4844"/>
+            <w:shd w:val="clear" w:color="auto" w:fill="B8B3D6"/>
+            <w:tcBorders>
+              <w:top w:val="single" w:sz="4" w:space="0" w:color="CBCBCB"/>
+              <w:left w:val="single" w:sz="4" w:space="0" w:color="CBCBCB"/>
+              <w:bottom w:val="single" w:sz="4" w:space="0" w:color="CBCBCB"/>
+              <w:right w:val="single" w:sz="4" w:space="0" w:color="CBCBCB"/>
+            </w:tcBorders>
+          </w:tcPr>
+          <w:p>
+            <w:r>
+              <w:rPr>
+                <w:b/>
+                <w:sz w:val="20"/>
+              </w:rPr>
+              <w:t>Lý do thay đổi</w:t>
+            </w:r>
+          </w:p>
+        </w:tc>
+        <w:tc>
+          <w:tcPr>
+            <w:tcW w:type="dxa" w:w="4844"/>
+            <w:shd w:val="clear" w:color="auto" w:fill="B8B3D6"/>
+            <w:tcBorders>
+              <w:top w:val="single" w:sz="4" w:space="0" w:color="CBCBCB"/>
+              <w:left w:val="single" w:sz="4" w:space="0" w:color="CBCBCB"/>
+              <w:bottom w:val="single" w:sz="4" w:space="0" w:color="CBCBCB"/>
+              <w:right w:val="single" w:sz="4" w:space="0" w:color="CBCBCB"/>
+            </w:tcBorders>
+          </w:tcPr>
+          <w:p>
+            <w:r>
+              <w:rPr>
+                <w:sz w:val="20"/>
+              </w:rPr>
+              <w:t>Tech Lead review PR phải cross-reference changed files với CODE-GRAPH thủ công để đánh giá structural impact — mất 5–10 phút. Nếu bỏ qua, có thể không nhận ra module downstream bị ảnh hưởng gián tiếp.</w:t>
+            </w:r>
+          </w:p>
+        </w:tc>
+      </w:tr>
+      <w:tr>
+        <w:tc>
+          <w:tcPr>
+            <w:tcW w:type="dxa" w:w="4844"/>
+            <w:tcBorders>
+              <w:top w:val="single" w:sz="4" w:space="0" w:color="CBCBCB"/>
+              <w:left w:val="single" w:sz="4" w:space="0" w:color="CBCBCB"/>
+              <w:bottom w:val="single" w:sz="4" w:space="0" w:color="CBCBCB"/>
+              <w:right w:val="single" w:sz="4" w:space="0" w:color="CBCBCB"/>
+            </w:tcBorders>
+          </w:tcPr>
+          <w:p>
+            <w:r>
+              <w:rPr>
+                <w:b/>
+                <w:sz w:val="20"/>
+              </w:rPr>
+              <w:t>Áp dụng vào đâu</w:t>
+            </w:r>
+          </w:p>
+        </w:tc>
+        <w:tc>
+          <w:tcPr>
+            <w:tcW w:type="dxa" w:w="4844"/>
+            <w:tcBorders>
+              <w:top w:val="single" w:sz="4" w:space="0" w:color="CBCBCB"/>
+              <w:left w:val="single" w:sz="4" w:space="0" w:color="CBCBCB"/>
+              <w:bottom w:val="single" w:sz="4" w:space="0" w:color="CBCBCB"/>
+              <w:right w:val="single" w:sz="4" w:space="0" w:color="CBCBCB"/>
+            </w:tcBorders>
+          </w:tcPr>
+          <w:p>
+            <w:r>
+              <w:rPr>
+                <w:sz w:val="20"/>
+              </w:rPr>
+              <w:t xml:space="preserve">CLAUDE.md §15.3 PR checklist — thêm field: </w:t>
+            </w:r>
+            <w:r>
+              <w:rPr>
+                <w:rFonts w:ascii="Courier New" w:hAnsi="Courier New"/>
+                <w:color w:val="F05922"/>
+                <w:sz w:val="20"/>
+              </w:rPr>
+              <w:t>CODE-GRAPH impact: [liệt kê modules/nodes bị ảnh hưởng — VD: "KzButton (interface đổi), LoginForm (thêm dependency mới)"]</w:t>
+            </w:r>
+            <w:r>
+              <w:rPr>
+                <w:sz w:val="20"/>
+              </w:rPr>
+              <w:t>. Senior/Junior Dev điền khi tạo PR. Tech Lead check field này khi review.</w:t>
+            </w:r>
+          </w:p>
+        </w:tc>
+      </w:tr>
+      <w:tr>
+        <w:tc>
+          <w:tcPr>
+            <w:tcW w:type="dxa" w:w="4844"/>
+            <w:shd w:val="clear" w:color="auto" w:fill="B8B3D6"/>
+            <w:tcBorders>
+              <w:top w:val="single" w:sz="4" w:space="0" w:color="CBCBCB"/>
+              <w:left w:val="single" w:sz="4" w:space="0" w:color="CBCBCB"/>
+              <w:bottom w:val="single" w:sz="4" w:space="0" w:color="CBCBCB"/>
+              <w:right w:val="single" w:sz="4" w:space="0" w:color="CBCBCB"/>
+            </w:tcBorders>
+          </w:tcPr>
+          <w:p>
+            <w:r>
+              <w:rPr>
+                <w:b/>
+                <w:sz w:val="20"/>
+              </w:rPr>
+              <w:t>Đạt được gì</w:t>
+            </w:r>
+          </w:p>
+        </w:tc>
+        <w:tc>
+          <w:tcPr>
+            <w:tcW w:type="dxa" w:w="4844"/>
+            <w:shd w:val="clear" w:color="auto" w:fill="B8B3D6"/>
+            <w:tcBorders>
+              <w:top w:val="single" w:sz="4" w:space="0" w:color="CBCBCB"/>
+              <w:left w:val="single" w:sz="4" w:space="0" w:color="CBCBCB"/>
+              <w:bottom w:val="single" w:sz="4" w:space="0" w:color="CBCBCB"/>
+              <w:right w:val="single" w:sz="4" w:space="0" w:color="CBCBCB"/>
+            </w:tcBorders>
+          </w:tcPr>
+          <w:p>
+            <w:r>
+              <w:rPr>
+                <w:sz w:val="20"/>
+              </w:rPr>
+              <w:t>Tech Lead đọc PR description và thấy ngay "PR này ảnh hưởng module X (interface đổi), module Y (thêm dependency mới)" — không cần mở CODE-GRAPH.md và grep manually. Review time giảm ước tính 5–10 phút/PR có structural change (quan sát được: Tech Lead không cần mở CODE-GRAPH tab riêng khi review).</w:t>
+            </w:r>
+          </w:p>
+        </w:tc>
+      </w:tr>
+      <w:tr>
+        <w:tc>
+          <w:tcPr>
+            <w:tcW w:type="dxa" w:w="4844"/>
+            <w:tcBorders>
+              <w:top w:val="single" w:sz="4" w:space="0" w:color="CBCBCB"/>
+              <w:left w:val="single" w:sz="4" w:space="0" w:color="CBCBCB"/>
+              <w:bottom w:val="single" w:sz="4" w:space="0" w:color="CBCBCB"/>
+              <w:right w:val="single" w:sz="4" w:space="0" w:color="CBCBCB"/>
+            </w:tcBorders>
+          </w:tcPr>
+          <w:p>
+            <w:r>
+              <w:rPr>
+                <w:b/>
+                <w:sz w:val="20"/>
+              </w:rPr>
+              <w:t>Rủi ro / Effort</w:t>
+            </w:r>
+          </w:p>
+        </w:tc>
+        <w:tc>
+          <w:tcPr>
+            <w:tcW w:type="dxa" w:w="4844"/>
+            <w:tcBorders>
+              <w:top w:val="single" w:sz="4" w:space="0" w:color="CBCBCB"/>
+              <w:left w:val="single" w:sz="4" w:space="0" w:color="CBCBCB"/>
+              <w:bottom w:val="single" w:sz="4" w:space="0" w:color="CBCBCB"/>
+              <w:right w:val="single" w:sz="4" w:space="0" w:color="CBCBCB"/>
+            </w:tcBorders>
+          </w:tcPr>
+          <w:p>
+            <w:r>
+              <w:rPr>
+                <w:sz w:val="20"/>
+              </w:rPr>
+              <w:t xml:space="preserve">Rủi ro: Rất thấp. Developer phải thêm 1–2 dòng vào PR description — nếu không điền, Tech Lead có thể request changes. Effort: </w:t>
+            </w:r>
+            <w:r>
+              <w:rPr>
+                <w:b/>
+                <w:sz w:val="20"/>
+              </w:rPr>
+              <w:t>Rất thấp</w:t>
+            </w:r>
+            <w:r>
+              <w:rPr>
+                <w:sz w:val="20"/>
+              </w:rPr>
+              <w:t xml:space="preserve"> — 1–2 giờ (edit CLAUDE.md §15.3 + ví dụ).</w:t>
+            </w:r>
+          </w:p>
+        </w:tc>
+      </w:tr>
+    </w:tbl>
+    <w:p/>
+    <w:p>
+      <w:pPr>
+        <w:pBdr>
+          <w:bottom w:val="single" w:sz="6" w:space="1" w:color="F05922"/>
+        </w:pBdr>
+        <w:spacing w:after="120"/>
+      </w:pPr>
+    </w:p>
+    <w:p>
+      <w:pPr>
+        <w:pStyle w:val="Heading3"/>
+        <w:spacing w:before="160" w:after="60"/>
+      </w:pPr>
+      <w:r>
+        <w:rPr>
+          <w:color w:val="4A3F8C"/>
+          <w:sz w:val="24"/>
+        </w:rPr>
+        <w:t>P5 — LESSONS.md: Tích lũy institutional knowledge</w:t>
+      </w:r>
+    </w:p>
+    <w:tbl>
+      <w:tblPr>
+        <w:tblStyle w:val="TableGrid"/>
+        <w:tblW w:type="auto" w:w="0"/>
+        <w:tblLook w:firstColumn="1" w:firstRow="1" w:lastColumn="0" w:lastRow="0" w:noHBand="0" w:noVBand="1" w:val="04A0"/>
+      </w:tblPr>
+      <w:tblGrid>
+        <w:gridCol w:w="1938"/>
+        <w:gridCol w:w="1938"/>
+        <w:gridCol w:w="1938"/>
+        <w:gridCol w:w="1938"/>
+        <w:gridCol w:w="1938"/>
+      </w:tblGrid>
+      <w:tr>
+        <w:tc>
+          <w:tcPr>
+            <w:tcW w:type="dxa" w:w="1938"/>
+            <w:shd w:val="clear" w:color="auto" w:fill="251C53"/>
+            <w:tcBorders>
+              <w:top w:val="single" w:sz="4" w:space="0" w:color="251C53"/>
+              <w:left w:val="single" w:sz="4" w:space="0" w:color="251C53"/>
+              <w:bottom w:val="single" w:sz="4" w:space="0" w:color="251C53"/>
+              <w:right w:val="single" w:sz="4" w:space="0" w:color="251C53"/>
+            </w:tcBorders>
+          </w:tcPr>
+          <w:p>
+            <w:r>
+              <w:rPr>
+                <w:b/>
+                <w:color w:val="FFFFFF"/>
+                <w:sz w:val="20"/>
+              </w:rPr>
+              <w:t>Trường</w:t>
+            </w:r>
+          </w:p>
+        </w:tc>
+        <w:tc>
+          <w:tcPr>
+            <w:tcW w:type="dxa" w:w="1938"/>
+            <w:shd w:val="clear" w:color="auto" w:fill="251C53"/>
+            <w:tcBorders>
+              <w:top w:val="single" w:sz="4" w:space="0" w:color="251C53"/>
+              <w:left w:val="single" w:sz="4" w:space="0" w:color="251C53"/>
+              <w:bottom w:val="single" w:sz="4" w:space="0" w:color="251C53"/>
+              <w:right w:val="single" w:sz="4" w:space="0" w:color="251C53"/>
+            </w:tcBorders>
+          </w:tcPr>
+          <w:p>
+            <w:r>
+              <w:rPr>
+                <w:b/>
+                <w:color w:val="FFFFFF"/>
+                <w:sz w:val="20"/>
+              </w:rPr>
+              <w:t>Nội dung</w:t>
+            </w:r>
+          </w:p>
+        </w:tc>
+        <w:tc>
+          <w:tcPr>
+            <w:tcW w:type="dxa" w:w="1938"/>
+            <w:shd w:val="clear" w:color="auto" w:fill="251C53"/>
+            <w:tcBorders>
+              <w:top w:val="single" w:sz="4" w:space="0" w:color="251C53"/>
+              <w:left w:val="single" w:sz="4" w:space="0" w:color="251C53"/>
+              <w:bottom w:val="single" w:sz="4" w:space="0" w:color="251C53"/>
+              <w:right w:val="single" w:sz="4" w:space="0" w:color="251C53"/>
+            </w:tcBorders>
+          </w:tcPr>
+          <w:p>
+            <w:r>
+              <w:rPr>
+                <w:b/>
+                <w:color w:val="FFFFFF"/>
+                <w:sz w:val="20"/>
+              </w:rPr>
+            </w:r>
+          </w:p>
+        </w:tc>
+        <w:tc>
+          <w:tcPr>
+            <w:tcW w:type="dxa" w:w="1938"/>
+            <w:shd w:val="clear" w:color="auto" w:fill="251C53"/>
+            <w:tcBorders>
+              <w:top w:val="single" w:sz="4" w:space="0" w:color="251C53"/>
+              <w:left w:val="single" w:sz="4" w:space="0" w:color="251C53"/>
+              <w:bottom w:val="single" w:sz="4" w:space="0" w:color="251C53"/>
+              <w:right w:val="single" w:sz="4" w:space="0" w:color="251C53"/>
+            </w:tcBorders>
+          </w:tcPr>
+          <w:p>
+            <w:r>
+              <w:rPr>
+                <w:b/>
+                <w:color w:val="FFFFFF"/>
+                <w:sz w:val="20"/>
+              </w:rPr>
+            </w:r>
+          </w:p>
+        </w:tc>
+        <w:tc>
+          <w:tcPr>
+            <w:tcW w:type="dxa" w:w="1938"/>
+            <w:shd w:val="clear" w:color="auto" w:fill="251C53"/>
+            <w:tcBorders>
+              <w:top w:val="single" w:sz="4" w:space="0" w:color="251C53"/>
+              <w:left w:val="single" w:sz="4" w:space="0" w:color="251C53"/>
+              <w:bottom w:val="single" w:sz="4" w:space="0" w:color="251C53"/>
+              <w:right w:val="single" w:sz="4" w:space="0" w:color="251C53"/>
+            </w:tcBorders>
+          </w:tcPr>
+          <w:p>
+            <w:r>
+              <w:rPr>
+                <w:b/>
+                <w:color w:val="FFFFFF"/>
+                <w:sz w:val="20"/>
+              </w:rPr>
+            </w:r>
+          </w:p>
+        </w:tc>
+      </w:tr>
+      <w:tr>
+        <w:tc>
+          <w:tcPr>
+            <w:tcW w:type="dxa" w:w="1938"/>
+            <w:tcBorders>
+              <w:top w:val="single" w:sz="4" w:space="0" w:color="CBCBCB"/>
+              <w:left w:val="single" w:sz="4" w:space="0" w:color="CBCBCB"/>
+              <w:bottom w:val="single" w:sz="4" w:space="0" w:color="CBCBCB"/>
+              <w:right w:val="single" w:sz="4" w:space="0" w:color="CBCBCB"/>
+            </w:tcBorders>
+          </w:tcPr>
+          <w:p>
+            <w:r>
+              <w:rPr>
+                <w:sz w:val="20"/>
+              </w:rPr>
+              <w:t>--------</w:t>
+            </w:r>
+          </w:p>
+        </w:tc>
+        <w:tc>
+          <w:tcPr>
+            <w:tcW w:type="dxa" w:w="1938"/>
+            <w:tcBorders>
+              <w:top w:val="single" w:sz="4" w:space="0" w:color="CBCBCB"/>
+              <w:left w:val="single" w:sz="4" w:space="0" w:color="CBCBCB"/>
+              <w:bottom w:val="single" w:sz="4" w:space="0" w:color="CBCBCB"/>
+              <w:right w:val="single" w:sz="4" w:space="0" w:color="CBCBCB"/>
+            </w:tcBorders>
+          </w:tcPr>
+          <w:p>
+            <w:r>
+              <w:rPr>
+                <w:sz w:val="20"/>
+              </w:rPr>
+              <w:t>---------</w:t>
+            </w:r>
+          </w:p>
+        </w:tc>
+        <w:tc>
+          <w:tcPr>
+            <w:tcW w:type="dxa" w:w="1938"/>
+            <w:tcBorders>
+              <w:top w:val="single" w:sz="4" w:space="0" w:color="CBCBCB"/>
+              <w:left w:val="single" w:sz="4" w:space="0" w:color="CBCBCB"/>
+              <w:bottom w:val="single" w:sz="4" w:space="0" w:color="CBCBCB"/>
+              <w:right w:val="single" w:sz="4" w:space="0" w:color="CBCBCB"/>
+            </w:tcBorders>
+          </w:tcPr>
+          <w:p/>
+        </w:tc>
+        <w:tc>
+          <w:tcPr>
+            <w:tcW w:type="dxa" w:w="1938"/>
+            <w:tcBorders>
+              <w:top w:val="single" w:sz="4" w:space="0" w:color="CBCBCB"/>
+              <w:left w:val="single" w:sz="4" w:space="0" w:color="CBCBCB"/>
+              <w:bottom w:val="single" w:sz="4" w:space="0" w:color="CBCBCB"/>
+              <w:right w:val="single" w:sz="4" w:space="0" w:color="CBCBCB"/>
+            </w:tcBorders>
+          </w:tcPr>
+          <w:p/>
+        </w:tc>
+        <w:tc>
+          <w:tcPr>
+            <w:tcW w:type="dxa" w:w="1938"/>
+            <w:tcBorders>
+              <w:top w:val="single" w:sz="4" w:space="0" w:color="CBCBCB"/>
+              <w:left w:val="single" w:sz="4" w:space="0" w:color="CBCBCB"/>
+              <w:bottom w:val="single" w:sz="4" w:space="0" w:color="CBCBCB"/>
+              <w:right w:val="single" w:sz="4" w:space="0" w:color="CBCBCB"/>
+            </w:tcBorders>
+          </w:tcPr>
+          <w:p/>
+        </w:tc>
+      </w:tr>
+      <w:tr>
+        <w:tc>
+          <w:tcPr>
+            <w:tcW w:type="dxa" w:w="1938"/>
+            <w:shd w:val="clear" w:color="auto" w:fill="B8B3D6"/>
+            <w:tcBorders>
+              <w:top w:val="single" w:sz="4" w:space="0" w:color="CBCBCB"/>
+              <w:left w:val="single" w:sz="4" w:space="0" w:color="CBCBCB"/>
+              <w:bottom w:val="single" w:sz="4" w:space="0" w:color="CBCBCB"/>
+              <w:right w:val="single" w:sz="4" w:space="0" w:color="CBCBCB"/>
+            </w:tcBorders>
+          </w:tcPr>
+          <w:p>
+            <w:r>
+              <w:rPr>
+                <w:b/>
+                <w:sz w:val="20"/>
+              </w:rPr>
+              <w:t>Hiện trạng KZTEK</w:t>
+            </w:r>
+          </w:p>
+        </w:tc>
+        <w:tc>
+          <w:tcPr>
+            <w:tcW w:type="dxa" w:w="1938"/>
+            <w:shd w:val="clear" w:color="auto" w:fill="B8B3D6"/>
+            <w:tcBorders>
+              <w:top w:val="single" w:sz="4" w:space="0" w:color="CBCBCB"/>
+              <w:left w:val="single" w:sz="4" w:space="0" w:color="CBCBCB"/>
+              <w:bottom w:val="single" w:sz="4" w:space="0" w:color="CBCBCB"/>
+              <w:right w:val="single" w:sz="4" w:space="0" w:color="CBCBCB"/>
+            </w:tcBorders>
+          </w:tcPr>
+          <w:p>
+            <w:r>
+              <w:rPr>
+                <w:sz w:val="20"/>
+              </w:rPr>
+              <w:t>Sau mỗi WF hoàn thành, không có cơ chế lưu "bài học" từ workflow đó. Plan files (</w:t>
+            </w:r>
+            <w:r>
+              <w:rPr>
+                <w:rFonts w:ascii="Courier New" w:hAnsi="Courier New"/>
+                <w:color w:val="F05922"/>
+                <w:sz w:val="20"/>
+              </w:rPr>
+              <w:t>docs/plans/</w:t>
+            </w:r>
+            <w:r>
+              <w:rPr>
+                <w:sz w:val="20"/>
+              </w:rPr>
+              <w:t>) lưu chi tiết nhưng dài, khó search cross-workflow. GOTCHAS.md (</w:t>
+            </w:r>
+            <w:r>
+              <w:rPr>
+                <w:rFonts w:ascii="Courier New" w:hAnsi="Courier New"/>
+                <w:color w:val="F05922"/>
+                <w:sz w:val="20"/>
+              </w:rPr>
+              <w:t>.claude/shared/</w:t>
+            </w:r>
+            <w:r>
+              <w:rPr>
+                <w:sz w:val="20"/>
+              </w:rPr>
+              <w:t xml:space="preserve">) ghi lỗi kỹ thuật ngầm nhưng không ghi lesson nghiệp vụ/workflow. Chưa có </w:t>
+            </w:r>
+            <w:r>
+              <w:rPr>
+                <w:rFonts w:ascii="Courier New" w:hAnsi="Courier New"/>
+                <w:color w:val="F05922"/>
+                <w:sz w:val="20"/>
+              </w:rPr>
+              <w:t>docs/LESSONS.md</w:t>
+            </w:r>
+            <w:r>
+              <w:rPr>
+                <w:sz w:val="20"/>
+              </w:rPr>
+              <w:t>.</w:t>
+            </w:r>
+          </w:p>
+        </w:tc>
+        <w:tc>
+          <w:tcPr>
+            <w:tcW w:type="dxa" w:w="1938"/>
+            <w:shd w:val="clear" w:color="auto" w:fill="B8B3D6"/>
+            <w:tcBorders>
+              <w:top w:val="single" w:sz="4" w:space="0" w:color="CBCBCB"/>
+              <w:left w:val="single" w:sz="4" w:space="0" w:color="CBCBCB"/>
+              <w:bottom w:val="single" w:sz="4" w:space="0" w:color="CBCBCB"/>
+              <w:right w:val="single" w:sz="4" w:space="0" w:color="CBCBCB"/>
+            </w:tcBorders>
+          </w:tcPr>
+          <w:p/>
+        </w:tc>
+        <w:tc>
+          <w:tcPr>
+            <w:tcW w:type="dxa" w:w="1938"/>
+            <w:shd w:val="clear" w:color="auto" w:fill="B8B3D6"/>
+            <w:tcBorders>
+              <w:top w:val="single" w:sz="4" w:space="0" w:color="CBCBCB"/>
+              <w:left w:val="single" w:sz="4" w:space="0" w:color="CBCBCB"/>
+              <w:bottom w:val="single" w:sz="4" w:space="0" w:color="CBCBCB"/>
+              <w:right w:val="single" w:sz="4" w:space="0" w:color="CBCBCB"/>
+            </w:tcBorders>
+          </w:tcPr>
+          <w:p/>
+        </w:tc>
+        <w:tc>
+          <w:tcPr>
+            <w:tcW w:type="dxa" w:w="1938"/>
+            <w:shd w:val="clear" w:color="auto" w:fill="B8B3D6"/>
+            <w:tcBorders>
+              <w:top w:val="single" w:sz="4" w:space="0" w:color="CBCBCB"/>
+              <w:left w:val="single" w:sz="4" w:space="0" w:color="CBCBCB"/>
+              <w:bottom w:val="single" w:sz="4" w:space="0" w:color="CBCBCB"/>
+              <w:right w:val="single" w:sz="4" w:space="0" w:color="CBCBCB"/>
+            </w:tcBorders>
+          </w:tcPr>
+          <w:p/>
+        </w:tc>
+      </w:tr>
+      <w:tr>
+        <w:tc>
+          <w:tcPr>
+            <w:tcW w:type="dxa" w:w="1938"/>
+            <w:tcBorders>
+              <w:top w:val="single" w:sz="4" w:space="0" w:color="CBCBCB"/>
+              <w:left w:val="single" w:sz="4" w:space="0" w:color="CBCBCB"/>
+              <w:bottom w:val="single" w:sz="4" w:space="0" w:color="CBCBCB"/>
+              <w:right w:val="single" w:sz="4" w:space="0" w:color="CBCBCB"/>
+            </w:tcBorders>
+          </w:tcPr>
+          <w:p>
+            <w:r>
+              <w:rPr>
+                <w:b/>
+                <w:sz w:val="20"/>
+              </w:rPr>
+              <w:t>Học từ đâu</w:t>
+            </w:r>
+          </w:p>
+        </w:tc>
+        <w:tc>
+          <w:tcPr>
+            <w:tcW w:type="dxa" w:w="1938"/>
+            <w:tcBorders>
+              <w:top w:val="single" w:sz="4" w:space="0" w:color="CBCBCB"/>
+              <w:left w:val="single" w:sz="4" w:space="0" w:color="CBCBCB"/>
+              <w:bottom w:val="single" w:sz="4" w:space="0" w:color="CBCBCB"/>
+              <w:right w:val="single" w:sz="4" w:space="0" w:color="CBCBCB"/>
+            </w:tcBorders>
+          </w:tcPr>
+          <w:p>
+            <w:r>
+              <w:rPr>
+                <w:rFonts w:ascii="Courier New" w:hAnsi="Courier New"/>
+                <w:color w:val="F05922"/>
+                <w:sz w:val="20"/>
+              </w:rPr>
+              <w:t>reflect.py</w:t>
+            </w:r>
+            <w:r>
+              <w:rPr>
+                <w:sz w:val="20"/>
+              </w:rPr>
+              <w:t xml:space="preserve"> — </w:t>
+            </w:r>
+            <w:r>
+              <w:rPr>
+                <w:rFonts w:ascii="Courier New" w:hAnsi="Courier New"/>
+                <w:color w:val="F05922"/>
+                <w:sz w:val="20"/>
+              </w:rPr>
+              <w:t>graphify reflect</w:t>
+            </w:r>
+            <w:r>
+              <w:rPr>
+                <w:sz w:val="20"/>
+              </w:rPr>
+              <w:t xml:space="preserve"> aggregate Q&amp;A memory từ các session làm việc với codebase → tổng hợp thành </w:t>
+            </w:r>
+            <w:r>
+              <w:rPr>
+                <w:rFonts w:ascii="Courier New" w:hAnsi="Courier New"/>
+                <w:color w:val="F05922"/>
+                <w:sz w:val="20"/>
+              </w:rPr>
+              <w:t>LESSONS.md</w:t>
+            </w:r>
+            <w:r>
+              <w:rPr>
+                <w:sz w:val="20"/>
+              </w:rPr>
+              <w:t xml:space="preserve">. Nguyên lý: mỗi session để lại Q&amp;A trace; </w:t>
+            </w:r>
+            <w:r>
+              <w:rPr>
+                <w:rFonts w:ascii="Courier New" w:hAnsi="Courier New"/>
+                <w:color w:val="F05922"/>
+                <w:sz w:val="20"/>
+              </w:rPr>
+              <w:t>reflect</w:t>
+            </w:r>
+            <w:r>
+              <w:rPr>
+                <w:sz w:val="20"/>
+              </w:rPr>
+              <w:t xml:space="preserve"> đọc traces và distill thành lessons cộng dồn có thể search được.</w:t>
+            </w:r>
+          </w:p>
+        </w:tc>
+        <w:tc>
+          <w:tcPr>
+            <w:tcW w:type="dxa" w:w="1938"/>
+            <w:tcBorders>
+              <w:top w:val="single" w:sz="4" w:space="0" w:color="CBCBCB"/>
+              <w:left w:val="single" w:sz="4" w:space="0" w:color="CBCBCB"/>
+              <w:bottom w:val="single" w:sz="4" w:space="0" w:color="CBCBCB"/>
+              <w:right w:val="single" w:sz="4" w:space="0" w:color="CBCBCB"/>
+            </w:tcBorders>
+          </w:tcPr>
+          <w:p/>
+        </w:tc>
+        <w:tc>
+          <w:tcPr>
+            <w:tcW w:type="dxa" w:w="1938"/>
+            <w:tcBorders>
+              <w:top w:val="single" w:sz="4" w:space="0" w:color="CBCBCB"/>
+              <w:left w:val="single" w:sz="4" w:space="0" w:color="CBCBCB"/>
+              <w:bottom w:val="single" w:sz="4" w:space="0" w:color="CBCBCB"/>
+              <w:right w:val="single" w:sz="4" w:space="0" w:color="CBCBCB"/>
+            </w:tcBorders>
+          </w:tcPr>
+          <w:p/>
+        </w:tc>
+        <w:tc>
+          <w:tcPr>
+            <w:tcW w:type="dxa" w:w="1938"/>
+            <w:tcBorders>
+              <w:top w:val="single" w:sz="4" w:space="0" w:color="CBCBCB"/>
+              <w:left w:val="single" w:sz="4" w:space="0" w:color="CBCBCB"/>
+              <w:bottom w:val="single" w:sz="4" w:space="0" w:color="CBCBCB"/>
+              <w:right w:val="single" w:sz="4" w:space="0" w:color="CBCBCB"/>
+            </w:tcBorders>
+          </w:tcPr>
+          <w:p/>
+        </w:tc>
+      </w:tr>
+      <w:tr>
+        <w:tc>
+          <w:tcPr>
+            <w:tcW w:type="dxa" w:w="1938"/>
+            <w:shd w:val="clear" w:color="auto" w:fill="B8B3D6"/>
+            <w:tcBorders>
+              <w:top w:val="single" w:sz="4" w:space="0" w:color="CBCBCB"/>
+              <w:left w:val="single" w:sz="4" w:space="0" w:color="CBCBCB"/>
+              <w:bottom w:val="single" w:sz="4" w:space="0" w:color="CBCBCB"/>
+              <w:right w:val="single" w:sz="4" w:space="0" w:color="CBCBCB"/>
+            </w:tcBorders>
+          </w:tcPr>
+          <w:p>
+            <w:r>
+              <w:rPr>
+                <w:b/>
+                <w:sz w:val="20"/>
+              </w:rPr>
+              <w:t>Lý do thay đổi</w:t>
+            </w:r>
+          </w:p>
+        </w:tc>
+        <w:tc>
+          <w:tcPr>
+            <w:tcW w:type="dxa" w:w="1938"/>
+            <w:shd w:val="clear" w:color="auto" w:fill="B8B3D6"/>
+            <w:tcBorders>
+              <w:top w:val="single" w:sz="4" w:space="0" w:color="CBCBCB"/>
+              <w:left w:val="single" w:sz="4" w:space="0" w:color="CBCBCB"/>
+              <w:bottom w:val="single" w:sz="4" w:space="0" w:color="CBCBCB"/>
+              <w:right w:val="single" w:sz="4" w:space="0" w:color="CBCBCB"/>
+            </w:tcBorders>
+          </w:tcPr>
+          <w:p>
+            <w:r>
+              <w:rPr>
+                <w:sz w:val="20"/>
+              </w:rPr>
+              <w:t>Khi bắt đầu WF-FEATURE mới, agents không có cách nhanh để biết "những gì đã học từ WF trước" ngoài đọc lại toàn bộ plan files (bị gitignored hoặc rất dài) — dẫn đến re-discovery các vấn đề đã gặp, tốn thêm 2–3 turns.</w:t>
+            </w:r>
+          </w:p>
+        </w:tc>
+        <w:tc>
+          <w:tcPr>
+            <w:tcW w:type="dxa" w:w="1938"/>
+            <w:shd w:val="clear" w:color="auto" w:fill="B8B3D6"/>
+            <w:tcBorders>
+              <w:top w:val="single" w:sz="4" w:space="0" w:color="CBCBCB"/>
+              <w:left w:val="single" w:sz="4" w:space="0" w:color="CBCBCB"/>
+              <w:bottom w:val="single" w:sz="4" w:space="0" w:color="CBCBCB"/>
+              <w:right w:val="single" w:sz="4" w:space="0" w:color="CBCBCB"/>
+            </w:tcBorders>
+          </w:tcPr>
+          <w:p/>
+        </w:tc>
+        <w:tc>
+          <w:tcPr>
+            <w:tcW w:type="dxa" w:w="1938"/>
+            <w:shd w:val="clear" w:color="auto" w:fill="B8B3D6"/>
+            <w:tcBorders>
+              <w:top w:val="single" w:sz="4" w:space="0" w:color="CBCBCB"/>
+              <w:left w:val="single" w:sz="4" w:space="0" w:color="CBCBCB"/>
+              <w:bottom w:val="single" w:sz="4" w:space="0" w:color="CBCBCB"/>
+              <w:right w:val="single" w:sz="4" w:space="0" w:color="CBCBCB"/>
+            </w:tcBorders>
+          </w:tcPr>
+          <w:p/>
+        </w:tc>
+        <w:tc>
+          <w:tcPr>
+            <w:tcW w:type="dxa" w:w="1938"/>
+            <w:shd w:val="clear" w:color="auto" w:fill="B8B3D6"/>
+            <w:tcBorders>
+              <w:top w:val="single" w:sz="4" w:space="0" w:color="CBCBCB"/>
+              <w:left w:val="single" w:sz="4" w:space="0" w:color="CBCBCB"/>
+              <w:bottom w:val="single" w:sz="4" w:space="0" w:color="CBCBCB"/>
+              <w:right w:val="single" w:sz="4" w:space="0" w:color="CBCBCB"/>
+            </w:tcBorders>
+          </w:tcPr>
+          <w:p/>
+        </w:tc>
+      </w:tr>
+      <w:tr>
+        <w:tc>
+          <w:tcPr>
+            <w:tcW w:type="dxa" w:w="1938"/>
+            <w:tcBorders>
+              <w:top w:val="single" w:sz="4" w:space="0" w:color="CBCBCB"/>
+              <w:left w:val="single" w:sz="4" w:space="0" w:color="CBCBCB"/>
+              <w:bottom w:val="single" w:sz="4" w:space="0" w:color="CBCBCB"/>
+              <w:right w:val="single" w:sz="4" w:space="0" w:color="CBCBCB"/>
+            </w:tcBorders>
+          </w:tcPr>
+          <w:p>
+            <w:r>
+              <w:rPr>
+                <w:b/>
+                <w:sz w:val="20"/>
+              </w:rPr>
+              <w:t>Áp dụng vào đâu</w:t>
+            </w:r>
+          </w:p>
+        </w:tc>
+        <w:tc>
+          <w:tcPr>
+            <w:tcW w:type="dxa" w:w="1938"/>
+            <w:tcBorders>
+              <w:top w:val="single" w:sz="4" w:space="0" w:color="CBCBCB"/>
+              <w:left w:val="single" w:sz="4" w:space="0" w:color="CBCBCB"/>
+              <w:bottom w:val="single" w:sz="4" w:space="0" w:color="CBCBCB"/>
+              <w:right w:val="single" w:sz="4" w:space="0" w:color="CBCBCB"/>
+            </w:tcBorders>
+          </w:tcPr>
+          <w:p>
+            <w:r>
+              <w:rPr>
+                <w:sz w:val="20"/>
+              </w:rPr>
+              <w:t xml:space="preserve">(1) Tạo file </w:t>
+            </w:r>
+            <w:r>
+              <w:rPr>
+                <w:rFonts w:ascii="Courier New" w:hAnsi="Courier New"/>
+                <w:color w:val="F05922"/>
+                <w:sz w:val="20"/>
+              </w:rPr>
+              <w:t>docs/LESSONS.md</w:t>
+            </w:r>
+            <w:r>
+              <w:rPr>
+                <w:sz w:val="20"/>
+              </w:rPr>
+              <w:t xml:space="preserve"> với template: `[date]</w:t>
+            </w:r>
+          </w:p>
+        </w:tc>
+        <w:tc>
+          <w:tcPr>
+            <w:tcW w:type="dxa" w:w="1938"/>
+            <w:tcBorders>
+              <w:top w:val="single" w:sz="4" w:space="0" w:color="CBCBCB"/>
+              <w:left w:val="single" w:sz="4" w:space="0" w:color="CBCBCB"/>
+              <w:bottom w:val="single" w:sz="4" w:space="0" w:color="CBCBCB"/>
+              <w:right w:val="single" w:sz="4" w:space="0" w:color="CBCBCB"/>
+            </w:tcBorders>
+          </w:tcPr>
+          <w:p>
+            <w:r>
+              <w:rPr>
+                <w:sz w:val="20"/>
+              </w:rPr>
+              <w:t>[workflow]</w:t>
+            </w:r>
+          </w:p>
+        </w:tc>
+        <w:tc>
+          <w:tcPr>
+            <w:tcW w:type="dxa" w:w="1938"/>
+            <w:tcBorders>
+              <w:top w:val="single" w:sz="4" w:space="0" w:color="CBCBCB"/>
+              <w:left w:val="single" w:sz="4" w:space="0" w:color="CBCBCB"/>
+              <w:bottom w:val="single" w:sz="4" w:space="0" w:color="CBCBCB"/>
+              <w:right w:val="single" w:sz="4" w:space="0" w:color="CBCBCB"/>
+            </w:tcBorders>
+          </w:tcPr>
+          <w:p>
+            <w:r>
+              <w:rPr>
+                <w:sz w:val="20"/>
+              </w:rPr>
+              <w:t>[tag]</w:t>
+            </w:r>
+          </w:p>
+        </w:tc>
+        <w:tc>
+          <w:tcPr>
+            <w:tcW w:type="dxa" w:w="1938"/>
+            <w:tcBorders>
+              <w:top w:val="single" w:sz="4" w:space="0" w:color="CBCBCB"/>
+              <w:left w:val="single" w:sz="4" w:space="0" w:color="CBCBCB"/>
+              <w:bottom w:val="single" w:sz="4" w:space="0" w:color="CBCBCB"/>
+              <w:right w:val="single" w:sz="4" w:space="0" w:color="CBCBCB"/>
+            </w:tcBorders>
+          </w:tcPr>
+          <w:p>
+            <w:r>
+              <w:rPr>
+                <w:sz w:val="20"/>
+              </w:rPr>
+              <w:t>[lesson 1–2 câu]</w:t>
+            </w:r>
+            <w:r>
+              <w:rPr>
+                <w:rFonts w:ascii="Courier New" w:hAnsi="Courier New"/>
+                <w:color w:val="F05922"/>
+                <w:sz w:val="20"/>
+              </w:rPr>
+              <w:t xml:space="preserve">. (2) CLAUDE.md §3.3 (Dispatcher tổng kết) — thêm bước cuối: "Có lesson nào đáng ghi vào </w:t>
+            </w:r>
+            <w:r>
+              <w:rPr>
+                <w:sz w:val="20"/>
+              </w:rPr>
+              <w:t>docs/LESSONS.md</w:t>
+            </w:r>
+            <w:r>
+              <w:rPr>
+                <w:rFonts w:ascii="Courier New" w:hAnsi="Courier New"/>
+                <w:color w:val="F05922"/>
+                <w:sz w:val="20"/>
+              </w:rPr>
+              <w:t xml:space="preserve"> từ workflow này không? (tùy chọn)". (3) CLAUDE.md §3.0 Pre-0 — thêm: "Nếu tồn tại </w:t>
+            </w:r>
+            <w:r>
+              <w:rPr>
+                <w:sz w:val="20"/>
+              </w:rPr>
+              <w:t>docs/LESSONS.md`, Read và scan qua lessons liên quan đến workflow hiện tại trước khi bắt đầu."</w:t>
+            </w:r>
+          </w:p>
+        </w:tc>
+      </w:tr>
+      <w:tr>
+        <w:tc>
+          <w:tcPr>
+            <w:tcW w:type="dxa" w:w="1938"/>
+            <w:shd w:val="clear" w:color="auto" w:fill="B8B3D6"/>
+            <w:tcBorders>
+              <w:top w:val="single" w:sz="4" w:space="0" w:color="CBCBCB"/>
+              <w:left w:val="single" w:sz="4" w:space="0" w:color="CBCBCB"/>
+              <w:bottom w:val="single" w:sz="4" w:space="0" w:color="CBCBCB"/>
+              <w:right w:val="single" w:sz="4" w:space="0" w:color="CBCBCB"/>
+            </w:tcBorders>
+          </w:tcPr>
+          <w:p>
+            <w:r>
+              <w:rPr>
+                <w:b/>
+                <w:sz w:val="20"/>
+              </w:rPr>
+              <w:t>Đạt được gì</w:t>
+            </w:r>
+          </w:p>
+        </w:tc>
+        <w:tc>
+          <w:tcPr>
+            <w:tcW w:type="dxa" w:w="1938"/>
+            <w:shd w:val="clear" w:color="auto" w:fill="B8B3D6"/>
+            <w:tcBorders>
+              <w:top w:val="single" w:sz="4" w:space="0" w:color="CBCBCB"/>
+              <w:left w:val="single" w:sz="4" w:space="0" w:color="CBCBCB"/>
+              <w:bottom w:val="single" w:sz="4" w:space="0" w:color="CBCBCB"/>
+              <w:right w:val="single" w:sz="4" w:space="0" w:color="CBCBCB"/>
+            </w:tcBorders>
+          </w:tcPr>
+          <w:p>
+            <w:r>
+              <w:rPr>
+                <w:sz w:val="20"/>
+              </w:rPr>
+              <w:t>Sau 3–5 WF cycles, agents đọc LESSONS.md trong Pre-0 và biết ngay các gotcha đã biết cho domain đó — ước tính tiết kiệm 1–2 turns/WF-FEATURE sau khi có ≥5 lessons tích lũy (quan sát được: agent không cần hỏi lại câu đã từng hỏi trong WF trước). Khác với GOTCHAS.md (lỗi kỹ thuật ngầm) — LESSONS.md ghi pattern nghiệp vụ và workflow decisions.</w:t>
+            </w:r>
+          </w:p>
+        </w:tc>
+        <w:tc>
+          <w:tcPr>
+            <w:tcW w:type="dxa" w:w="1938"/>
+            <w:shd w:val="clear" w:color="auto" w:fill="B8B3D6"/>
+            <w:tcBorders>
+              <w:top w:val="single" w:sz="4" w:space="0" w:color="CBCBCB"/>
+              <w:left w:val="single" w:sz="4" w:space="0" w:color="CBCBCB"/>
+              <w:bottom w:val="single" w:sz="4" w:space="0" w:color="CBCBCB"/>
+              <w:right w:val="single" w:sz="4" w:space="0" w:color="CBCBCB"/>
+            </w:tcBorders>
+          </w:tcPr>
+          <w:p/>
+        </w:tc>
+        <w:tc>
+          <w:tcPr>
+            <w:tcW w:type="dxa" w:w="1938"/>
+            <w:shd w:val="clear" w:color="auto" w:fill="B8B3D6"/>
+            <w:tcBorders>
+              <w:top w:val="single" w:sz="4" w:space="0" w:color="CBCBCB"/>
+              <w:left w:val="single" w:sz="4" w:space="0" w:color="CBCBCB"/>
+              <w:bottom w:val="single" w:sz="4" w:space="0" w:color="CBCBCB"/>
+              <w:right w:val="single" w:sz="4" w:space="0" w:color="CBCBCB"/>
+            </w:tcBorders>
+          </w:tcPr>
+          <w:p/>
+        </w:tc>
+        <w:tc>
+          <w:tcPr>
+            <w:tcW w:type="dxa" w:w="1938"/>
+            <w:shd w:val="clear" w:color="auto" w:fill="B8B3D6"/>
+            <w:tcBorders>
+              <w:top w:val="single" w:sz="4" w:space="0" w:color="CBCBCB"/>
+              <w:left w:val="single" w:sz="4" w:space="0" w:color="CBCBCB"/>
+              <w:bottom w:val="single" w:sz="4" w:space="0" w:color="CBCBCB"/>
+              <w:right w:val="single" w:sz="4" w:space="0" w:color="CBCBCB"/>
+            </w:tcBorders>
+          </w:tcPr>
+          <w:p/>
+        </w:tc>
+      </w:tr>
+      <w:tr>
+        <w:tc>
+          <w:tcPr>
+            <w:tcW w:type="dxa" w:w="1938"/>
+            <w:tcBorders>
+              <w:top w:val="single" w:sz="4" w:space="0" w:color="CBCBCB"/>
+              <w:left w:val="single" w:sz="4" w:space="0" w:color="CBCBCB"/>
+              <w:bottom w:val="single" w:sz="4" w:space="0" w:color="CBCBCB"/>
+              <w:right w:val="single" w:sz="4" w:space="0" w:color="CBCBCB"/>
+            </w:tcBorders>
+          </w:tcPr>
+          <w:p>
+            <w:r>
+              <w:rPr>
+                <w:b/>
+                <w:sz w:val="20"/>
+              </w:rPr>
+              <w:t>Rủi ro / Effort</w:t>
+            </w:r>
+          </w:p>
+        </w:tc>
+        <w:tc>
+          <w:tcPr>
+            <w:tcW w:type="dxa" w:w="1938"/>
+            <w:tcBorders>
+              <w:top w:val="single" w:sz="4" w:space="0" w:color="CBCBCB"/>
+              <w:left w:val="single" w:sz="4" w:space="0" w:color="CBCBCB"/>
+              <w:bottom w:val="single" w:sz="4" w:space="0" w:color="CBCBCB"/>
+              <w:right w:val="single" w:sz="4" w:space="0" w:color="CBCBCB"/>
+            </w:tcBorders>
+          </w:tcPr>
+          <w:p>
+            <w:r>
+              <w:rPr>
+                <w:sz w:val="20"/>
+              </w:rPr>
+              <w:t xml:space="preserve">Rủi ro: Thấp. Risk chính: agents ghi lesson quá generic → vô nghĩa. Cần template bắt buộc có </w:t>
+            </w:r>
+            <w:r>
+              <w:rPr>
+                <w:rFonts w:ascii="Courier New" w:hAnsi="Courier New"/>
+                <w:color w:val="F05922"/>
+                <w:sz w:val="20"/>
+              </w:rPr>
+              <w:t>context</w:t>
+            </w:r>
+            <w:r>
+              <w:rPr>
+                <w:sz w:val="20"/>
+              </w:rPr>
+              <w:t xml:space="preserve"> cụ thể (không chỉ "kiểm tra kỹ trước khi deploy"). Effort: </w:t>
+            </w:r>
+            <w:r>
+              <w:rPr>
+                <w:b/>
+                <w:sz w:val="20"/>
+              </w:rPr>
+              <w:t>Thấp</w:t>
+            </w:r>
+            <w:r>
+              <w:rPr>
+                <w:sz w:val="20"/>
+              </w:rPr>
+              <w:t xml:space="preserve"> — 4–6 giờ (tạo template </w:t>
+            </w:r>
+            <w:r>
+              <w:rPr>
+                <w:rFonts w:ascii="Courier New" w:hAnsi="Courier New"/>
+                <w:color w:val="F05922"/>
+                <w:sz w:val="20"/>
+              </w:rPr>
+              <w:t>docs/LESSONS.md</w:t>
+            </w:r>
+            <w:r>
+              <w:rPr>
+                <w:sz w:val="20"/>
+              </w:rPr>
+              <w:t>, cập nhật §3.0 và §3.3 trong CLAUDE.md và CORE.md).</w:t>
+            </w:r>
+          </w:p>
+        </w:tc>
+        <w:tc>
+          <w:tcPr>
+            <w:tcW w:type="dxa" w:w="1938"/>
+            <w:tcBorders>
+              <w:top w:val="single" w:sz="4" w:space="0" w:color="CBCBCB"/>
+              <w:left w:val="single" w:sz="4" w:space="0" w:color="CBCBCB"/>
+              <w:bottom w:val="single" w:sz="4" w:space="0" w:color="CBCBCB"/>
+              <w:right w:val="single" w:sz="4" w:space="0" w:color="CBCBCB"/>
+            </w:tcBorders>
+          </w:tcPr>
+          <w:p/>
+        </w:tc>
+        <w:tc>
+          <w:tcPr>
+            <w:tcW w:type="dxa" w:w="1938"/>
+            <w:tcBorders>
+              <w:top w:val="single" w:sz="4" w:space="0" w:color="CBCBCB"/>
+              <w:left w:val="single" w:sz="4" w:space="0" w:color="CBCBCB"/>
+              <w:bottom w:val="single" w:sz="4" w:space="0" w:color="CBCBCB"/>
+              <w:right w:val="single" w:sz="4" w:space="0" w:color="CBCBCB"/>
+            </w:tcBorders>
+          </w:tcPr>
+          <w:p/>
+        </w:tc>
+        <w:tc>
+          <w:tcPr>
+            <w:tcW w:type="dxa" w:w="1938"/>
+            <w:tcBorders>
+              <w:top w:val="single" w:sz="4" w:space="0" w:color="CBCBCB"/>
+              <w:left w:val="single" w:sz="4" w:space="0" w:color="CBCBCB"/>
+              <w:bottom w:val="single" w:sz="4" w:space="0" w:color="CBCBCB"/>
+              <w:right w:val="single" w:sz="4" w:space="0" w:color="CBCBCB"/>
+            </w:tcBorders>
+          </w:tcPr>
+          <w:p/>
+        </w:tc>
+      </w:tr>
+    </w:tbl>
+    <w:p/>
+    <w:p>
+      <w:pPr>
+        <w:pBdr>
+          <w:bottom w:val="single" w:sz="6" w:space="1" w:color="F05922"/>
+        </w:pBdr>
+        <w:spacing w:after="120"/>
+      </w:pPr>
+    </w:p>
+    <w:p>
+      <w:pPr>
+        <w:spacing w:before="40" w:after="40"/>
+        <w:ind w:left="567"/>
+        <w:pBdr>
+          <w:left w:val="single" w:sz="12" w:space="10" w:color="F05922"/>
+        </w:pBdr>
+      </w:pPr>
+      <w:r>
+        <w:rPr>
+          <w:b/>
+          <w:color w:val="4A3F8C"/>
+        </w:rPr>
+        <w:t>Lưu ý ưu tiên:</w:t>
+      </w:r>
+      <w:r>
+        <w:rPr>
+          <w:color w:val="4A3F8C"/>
+        </w:rPr>
+        <w:t xml:space="preserve"> P4 và P2 có effort thấp nhất và áp dụng được ngay. P1 có giá trị kỹ thuật cao nhất nhưng phụ thuộc vào việc có C# product codebase. P3 và P5 bổ sung chất lượng dài hạn cho quy trình.</w:t>
+      </w:r>
+    </w:p>
+    <w:p>
+      <w:pPr>
+        <w:spacing w:after="80"/>
+      </w:pPr>
+      <w:r>
+        <w:rPr>
+          <w:sz w:val="21"/>
+        </w:rPr>
+        <w:t>&gt;</w:t>
+      </w:r>
+    </w:p>
+    <w:p>
+      <w:pPr>
+        <w:spacing w:before="40" w:after="40"/>
+        <w:ind w:left="567"/>
+        <w:pBdr>
+          <w:left w:val="single" w:sz="12" w:space="10" w:color="F05922"/>
+        </w:pBdr>
+      </w:pPr>
+      <w:r>
+        <w:rPr>
+          <w:color w:val="4A3F8C"/>
+        </w:rPr>
+        <w:t>Đề xuất nào được chọn sẽ được áp dụng tại Bước 3A.3 (sau khi user xác nhận ở Bước 3A.2).</w:t>
       </w:r>
     </w:p>
     <w:sectPr>

</xml_diff>

<commit_message>
[PLAN-github-research-graphify] Bước 3A.2 + 3A.3: Áp dụng P1–P5 từ nghiên cứu Graphify-Labs/graphify
- P4: Thêm dòng "CODE-GRAPH impact" vào checklist §15.3 CLAUDE.md
- P5: Thêm Pre-0b (đọc LESSONS.md) vào §3.0, ghi chú LESSONS.md vào §3.3, tạo docs/LESSONS.md
- P2: Mở rộng §17.1 với query-first checklist 5 câu hỏi cụ thể + tiêu chí "≥3/5"
- P3: Thêm bảng Confidence labels vào §17.2 + cột Confidence vào CODE-GRAPH-template.md
- P1: Thêm §17.6 giới thiệu graphify CLI như công cụ tùy chọn build/update CODE-GRAPH
- Cập nhật RESEARCH-graphify bảng P1–P5 → trạng thái ✅
- Cập nhật plan STEP-3A.2 (done), STEP-3A.3 (done), PLAN-MASTER.md

Plan: docs/plans/PLAN-github-research-graphify-2026-07-29/steps/STEP-3A.3-ap-dung-de-xuat.md
</commit_message>
<xml_diff>
--- a/docs/research/RESEARCH-graphify-2026-07-29.docx
+++ b/docs/research/RESEARCH-graphify-2026-07-29.docx
@@ -4699,16 +4699,17 @@
         <w:tblLook w:firstColumn="1" w:firstRow="1" w:lastColumn="0" w:lastRow="0" w:noHBand="0" w:noVBand="1" w:val="04A0"/>
       </w:tblPr>
       <w:tblGrid>
-        <w:gridCol w:w="1938"/>
-        <w:gridCol w:w="1938"/>
-        <w:gridCol w:w="1938"/>
-        <w:gridCol w:w="1938"/>
-        <w:gridCol w:w="1938"/>
+        <w:gridCol w:w="1615"/>
+        <w:gridCol w:w="1615"/>
+        <w:gridCol w:w="1615"/>
+        <w:gridCol w:w="1615"/>
+        <w:gridCol w:w="1615"/>
+        <w:gridCol w:w="1615"/>
       </w:tblGrid>
       <w:tr>
         <w:tc>
           <w:tcPr>
-            <w:tcW w:type="dxa" w:w="1938"/>
+            <w:tcW w:type="dxa" w:w="1615"/>
             <w:shd w:val="clear" w:color="auto" w:fill="251C53"/>
             <w:tcBorders>
               <w:top w:val="single" w:sz="4" w:space="0" w:color="251C53"/>
@@ -4730,7 +4731,7 @@
         </w:tc>
         <w:tc>
           <w:tcPr>
-            <w:tcW w:type="dxa" w:w="1938"/>
+            <w:tcW w:type="dxa" w:w="1615"/>
             <w:shd w:val="clear" w:color="auto" w:fill="251C53"/>
             <w:tcBorders>
               <w:top w:val="single" w:sz="4" w:space="0" w:color="251C53"/>
@@ -4752,7 +4753,7 @@
         </w:tc>
         <w:tc>
           <w:tcPr>
-            <w:tcW w:type="dxa" w:w="1938"/>
+            <w:tcW w:type="dxa" w:w="1615"/>
             <w:shd w:val="clear" w:color="auto" w:fill="251C53"/>
             <w:tcBorders>
               <w:top w:val="single" w:sz="4" w:space="0" w:color="251C53"/>
@@ -4774,7 +4775,7 @@
         </w:tc>
         <w:tc>
           <w:tcPr>
-            <w:tcW w:type="dxa" w:w="1938"/>
+            <w:tcW w:type="dxa" w:w="1615"/>
             <w:shd w:val="clear" w:color="auto" w:fill="251C53"/>
             <w:tcBorders>
               <w:top w:val="single" w:sz="4" w:space="0" w:color="251C53"/>
@@ -4796,7 +4797,7 @@
         </w:tc>
         <w:tc>
           <w:tcPr>
-            <w:tcW w:type="dxa" w:w="1938"/>
+            <w:tcW w:type="dxa" w:w="1615"/>
             <w:shd w:val="clear" w:color="auto" w:fill="251C53"/>
             <w:tcBorders>
               <w:top w:val="single" w:sz="4" w:space="0" w:color="251C53"/>
@@ -4816,11 +4817,33 @@
             </w:r>
           </w:p>
         </w:tc>
+        <w:tc>
+          <w:tcPr>
+            <w:tcW w:type="dxa" w:w="1615"/>
+            <w:shd w:val="clear" w:color="auto" w:fill="251C53"/>
+            <w:tcBorders>
+              <w:top w:val="single" w:sz="4" w:space="0" w:color="251C53"/>
+              <w:left w:val="single" w:sz="4" w:space="0" w:color="251C53"/>
+              <w:bottom w:val="single" w:sz="4" w:space="0" w:color="251C53"/>
+              <w:right w:val="single" w:sz="4" w:space="0" w:color="251C53"/>
+            </w:tcBorders>
+          </w:tcPr>
+          <w:p>
+            <w:r>
+              <w:rPr>
+                <w:b/>
+                <w:color w:val="FFFFFF"/>
+                <w:sz w:val="20"/>
+              </w:rPr>
+              <w:t>Trạng thái</w:t>
+            </w:r>
+          </w:p>
+        </w:tc>
       </w:tr>
       <w:tr>
         <w:tc>
           <w:tcPr>
-            <w:tcW w:type="dxa" w:w="1938"/>
+            <w:tcW w:type="dxa" w:w="1615"/>
             <w:tcBorders>
               <w:top w:val="single" w:sz="4" w:space="0" w:color="CBCBCB"/>
               <w:left w:val="single" w:sz="4" w:space="0" w:color="CBCBCB"/>
@@ -4839,7 +4862,7 @@
         </w:tc>
         <w:tc>
           <w:tcPr>
-            <w:tcW w:type="dxa" w:w="1938"/>
+            <w:tcW w:type="dxa" w:w="1615"/>
             <w:tcBorders>
               <w:top w:val="single" w:sz="4" w:space="0" w:color="CBCBCB"/>
               <w:left w:val="single" w:sz="4" w:space="0" w:color="CBCBCB"/>
@@ -4858,7 +4881,7 @@
         </w:tc>
         <w:tc>
           <w:tcPr>
-            <w:tcW w:type="dxa" w:w="1938"/>
+            <w:tcW w:type="dxa" w:w="1615"/>
             <w:tcBorders>
               <w:top w:val="single" w:sz="4" w:space="0" w:color="CBCBCB"/>
               <w:left w:val="single" w:sz="4" w:space="0" w:color="CBCBCB"/>
@@ -4877,7 +4900,7 @@
         </w:tc>
         <w:tc>
           <w:tcPr>
-            <w:tcW w:type="dxa" w:w="1938"/>
+            <w:tcW w:type="dxa" w:w="1615"/>
             <w:tcBorders>
               <w:top w:val="single" w:sz="4" w:space="0" w:color="CBCBCB"/>
               <w:left w:val="single" w:sz="4" w:space="0" w:color="CBCBCB"/>
@@ -4896,7 +4919,7 @@
         </w:tc>
         <w:tc>
           <w:tcPr>
-            <w:tcW w:type="dxa" w:w="1938"/>
+            <w:tcW w:type="dxa" w:w="1615"/>
             <w:tcBorders>
               <w:top w:val="single" w:sz="4" w:space="0" w:color="CBCBCB"/>
               <w:left w:val="single" w:sz="4" w:space="0" w:color="CBCBCB"/>
@@ -4913,11 +4936,30 @@
             </w:r>
           </w:p>
         </w:tc>
+        <w:tc>
+          <w:tcPr>
+            <w:tcW w:type="dxa" w:w="1615"/>
+            <w:tcBorders>
+              <w:top w:val="single" w:sz="4" w:space="0" w:color="CBCBCB"/>
+              <w:left w:val="single" w:sz="4" w:space="0" w:color="CBCBCB"/>
+              <w:bottom w:val="single" w:sz="4" w:space="0" w:color="CBCBCB"/>
+              <w:right w:val="single" w:sz="4" w:space="0" w:color="CBCBCB"/>
+            </w:tcBorders>
+          </w:tcPr>
+          <w:p>
+            <w:r>
+              <w:rPr>
+                <w:sz w:val="20"/>
+              </w:rPr>
+              <w:t>------------</w:t>
+            </w:r>
+          </w:p>
+        </w:tc>
       </w:tr>
       <w:tr>
         <w:tc>
           <w:tcPr>
-            <w:tcW w:type="dxa" w:w="1938"/>
+            <w:tcW w:type="dxa" w:w="1615"/>
             <w:shd w:val="clear" w:color="auto" w:fill="B8B3D6"/>
             <w:tcBorders>
               <w:top w:val="single" w:sz="4" w:space="0" w:color="CBCBCB"/>
@@ -4937,7 +4979,7 @@
         </w:tc>
         <w:tc>
           <w:tcPr>
-            <w:tcW w:type="dxa" w:w="1938"/>
+            <w:tcW w:type="dxa" w:w="1615"/>
             <w:shd w:val="clear" w:color="auto" w:fill="B8B3D6"/>
             <w:tcBorders>
               <w:top w:val="single" w:sz="4" w:space="0" w:color="CBCBCB"/>
@@ -4957,7 +4999,7 @@
         </w:tc>
         <w:tc>
           <w:tcPr>
-            <w:tcW w:type="dxa" w:w="1938"/>
+            <w:tcW w:type="dxa" w:w="1615"/>
             <w:shd w:val="clear" w:color="auto" w:fill="B8B3D6"/>
             <w:tcBorders>
               <w:top w:val="single" w:sz="4" w:space="0" w:color="CBCBCB"/>
@@ -4977,7 +5019,7 @@
         </w:tc>
         <w:tc>
           <w:tcPr>
-            <w:tcW w:type="dxa" w:w="1938"/>
+            <w:tcW w:type="dxa" w:w="1615"/>
             <w:shd w:val="clear" w:color="auto" w:fill="B8B3D6"/>
             <w:tcBorders>
               <w:top w:val="single" w:sz="4" w:space="0" w:color="CBCBCB"/>
@@ -5005,7 +5047,7 @@
         </w:tc>
         <w:tc>
           <w:tcPr>
-            <w:tcW w:type="dxa" w:w="1938"/>
+            <w:tcW w:type="dxa" w:w="1615"/>
             <w:shd w:val="clear" w:color="auto" w:fill="B8B3D6"/>
             <w:tcBorders>
               <w:top w:val="single" w:sz="4" w:space="0" w:color="CBCBCB"/>
@@ -5023,108 +5065,9 @@
             </w:r>
           </w:p>
         </w:tc>
-      </w:tr>
-      <w:tr>
         <w:tc>
           <w:tcPr>
-            <w:tcW w:type="dxa" w:w="1938"/>
-            <w:tcBorders>
-              <w:top w:val="single" w:sz="4" w:space="0" w:color="CBCBCB"/>
-              <w:left w:val="single" w:sz="4" w:space="0" w:color="CBCBCB"/>
-              <w:bottom w:val="single" w:sz="4" w:space="0" w:color="CBCBCB"/>
-              <w:right w:val="single" w:sz="4" w:space="0" w:color="CBCBCB"/>
-            </w:tcBorders>
-          </w:tcPr>
-          <w:p>
-            <w:r>
-              <w:rPr>
-                <w:sz w:val="20"/>
-              </w:rPr>
-              <w:t>P2</w:t>
-            </w:r>
-          </w:p>
-        </w:tc>
-        <w:tc>
-          <w:tcPr>
-            <w:tcW w:type="dxa" w:w="1938"/>
-            <w:tcBorders>
-              <w:top w:val="single" w:sz="4" w:space="0" w:color="CBCBCB"/>
-              <w:left w:val="single" w:sz="4" w:space="0" w:color="CBCBCB"/>
-              <w:bottom w:val="single" w:sz="4" w:space="0" w:color="CBCBCB"/>
-              <w:right w:val="single" w:sz="4" w:space="0" w:color="CBCBCB"/>
-            </w:tcBorders>
-          </w:tcPr>
-          <w:p>
-            <w:r>
-              <w:rPr>
-                <w:sz w:val="20"/>
-              </w:rPr>
-              <w:t>Cải tiến §17: "Query-first checklist" có cấu trúc</w:t>
-            </w:r>
-          </w:p>
-        </w:tc>
-        <w:tc>
-          <w:tcPr>
-            <w:tcW w:type="dxa" w:w="1938"/>
-            <w:tcBorders>
-              <w:top w:val="single" w:sz="4" w:space="0" w:color="CBCBCB"/>
-              <w:left w:val="single" w:sz="4" w:space="0" w:color="CBCBCB"/>
-              <w:bottom w:val="single" w:sz="4" w:space="0" w:color="CBCBCB"/>
-              <w:right w:val="single" w:sz="4" w:space="0" w:color="CBCBCB"/>
-            </w:tcBorders>
-          </w:tcPr>
-          <w:p>
-            <w:r>
-              <w:rPr>
-                <w:sz w:val="20"/>
-              </w:rPr>
-              <w:t>Thấp (2–4 giờ)</w:t>
-            </w:r>
-          </w:p>
-        </w:tc>
-        <w:tc>
-          <w:tcPr>
-            <w:tcW w:type="dxa" w:w="1938"/>
-            <w:tcBorders>
-              <w:top w:val="single" w:sz="4" w:space="0" w:color="CBCBCB"/>
-              <w:left w:val="single" w:sz="4" w:space="0" w:color="CBCBCB"/>
-              <w:bottom w:val="single" w:sz="4" w:space="0" w:color="CBCBCB"/>
-              <w:right w:val="single" w:sz="4" w:space="0" w:color="CBCBCB"/>
-            </w:tcBorders>
-          </w:tcPr>
-          <w:p>
-            <w:r>
-              <w:rPr>
-                <w:sz w:val="20"/>
-              </w:rPr>
-              <w:t>Không có</w:t>
-            </w:r>
-          </w:p>
-        </w:tc>
-        <w:tc>
-          <w:tcPr>
-            <w:tcW w:type="dxa" w:w="1938"/>
-            <w:tcBorders>
-              <w:top w:val="single" w:sz="4" w:space="0" w:color="CBCBCB"/>
-              <w:left w:val="single" w:sz="4" w:space="0" w:color="CBCBCB"/>
-              <w:bottom w:val="single" w:sz="4" w:space="0" w:color="CBCBCB"/>
-              <w:right w:val="single" w:sz="4" w:space="0" w:color="CBCBCB"/>
-            </w:tcBorders>
-          </w:tcPr>
-          <w:p>
-            <w:r>
-              <w:rPr>
-                <w:sz w:val="20"/>
-              </w:rPr>
-              <w:t>Ngay — với cả markdown codebase hiện tại</w:t>
-            </w:r>
-          </w:p>
-        </w:tc>
-      </w:tr>
-      <w:tr>
-        <w:tc>
-          <w:tcPr>
-            <w:tcW w:type="dxa" w:w="1938"/>
+            <w:tcW w:type="dxa" w:w="1615"/>
             <w:shd w:val="clear" w:color="auto" w:fill="B8B3D6"/>
             <w:tcBorders>
               <w:top w:val="single" w:sz="4" w:space="0" w:color="CBCBCB"/>
@@ -5138,13 +5081,131 @@
               <w:rPr>
                 <w:sz w:val="20"/>
               </w:rPr>
-              <w:t>P3</w:t>
+              <w:t>✅ Đã áp dụng (2026-07-29)</w:t>
+            </w:r>
+          </w:p>
+        </w:tc>
+      </w:tr>
+      <w:tr>
+        <w:tc>
+          <w:tcPr>
+            <w:tcW w:type="dxa" w:w="1615"/>
+            <w:tcBorders>
+              <w:top w:val="single" w:sz="4" w:space="0" w:color="CBCBCB"/>
+              <w:left w:val="single" w:sz="4" w:space="0" w:color="CBCBCB"/>
+              <w:bottom w:val="single" w:sz="4" w:space="0" w:color="CBCBCB"/>
+              <w:right w:val="single" w:sz="4" w:space="0" w:color="CBCBCB"/>
+            </w:tcBorders>
+          </w:tcPr>
+          <w:p>
+            <w:r>
+              <w:rPr>
+                <w:sz w:val="20"/>
+              </w:rPr>
+              <w:t>P2</w:t>
             </w:r>
           </w:p>
         </w:tc>
         <w:tc>
           <w:tcPr>
-            <w:tcW w:type="dxa" w:w="1938"/>
+            <w:tcW w:type="dxa" w:w="1615"/>
+            <w:tcBorders>
+              <w:top w:val="single" w:sz="4" w:space="0" w:color="CBCBCB"/>
+              <w:left w:val="single" w:sz="4" w:space="0" w:color="CBCBCB"/>
+              <w:bottom w:val="single" w:sz="4" w:space="0" w:color="CBCBCB"/>
+              <w:right w:val="single" w:sz="4" w:space="0" w:color="CBCBCB"/>
+            </w:tcBorders>
+          </w:tcPr>
+          <w:p>
+            <w:r>
+              <w:rPr>
+                <w:sz w:val="20"/>
+              </w:rPr>
+              <w:t>Cải tiến §17: "Query-first checklist" có cấu trúc</w:t>
+            </w:r>
+          </w:p>
+        </w:tc>
+        <w:tc>
+          <w:tcPr>
+            <w:tcW w:type="dxa" w:w="1615"/>
+            <w:tcBorders>
+              <w:top w:val="single" w:sz="4" w:space="0" w:color="CBCBCB"/>
+              <w:left w:val="single" w:sz="4" w:space="0" w:color="CBCBCB"/>
+              <w:bottom w:val="single" w:sz="4" w:space="0" w:color="CBCBCB"/>
+              <w:right w:val="single" w:sz="4" w:space="0" w:color="CBCBCB"/>
+            </w:tcBorders>
+          </w:tcPr>
+          <w:p>
+            <w:r>
+              <w:rPr>
+                <w:sz w:val="20"/>
+              </w:rPr>
+              <w:t>Thấp (2–4 giờ)</w:t>
+            </w:r>
+          </w:p>
+        </w:tc>
+        <w:tc>
+          <w:tcPr>
+            <w:tcW w:type="dxa" w:w="1615"/>
+            <w:tcBorders>
+              <w:top w:val="single" w:sz="4" w:space="0" w:color="CBCBCB"/>
+              <w:left w:val="single" w:sz="4" w:space="0" w:color="CBCBCB"/>
+              <w:bottom w:val="single" w:sz="4" w:space="0" w:color="CBCBCB"/>
+              <w:right w:val="single" w:sz="4" w:space="0" w:color="CBCBCB"/>
+            </w:tcBorders>
+          </w:tcPr>
+          <w:p>
+            <w:r>
+              <w:rPr>
+                <w:sz w:val="20"/>
+              </w:rPr>
+              <w:t>Không có</w:t>
+            </w:r>
+          </w:p>
+        </w:tc>
+        <w:tc>
+          <w:tcPr>
+            <w:tcW w:type="dxa" w:w="1615"/>
+            <w:tcBorders>
+              <w:top w:val="single" w:sz="4" w:space="0" w:color="CBCBCB"/>
+              <w:left w:val="single" w:sz="4" w:space="0" w:color="CBCBCB"/>
+              <w:bottom w:val="single" w:sz="4" w:space="0" w:color="CBCBCB"/>
+              <w:right w:val="single" w:sz="4" w:space="0" w:color="CBCBCB"/>
+            </w:tcBorders>
+          </w:tcPr>
+          <w:p>
+            <w:r>
+              <w:rPr>
+                <w:sz w:val="20"/>
+              </w:rPr>
+              <w:t>Ngay — với cả markdown codebase hiện tại</w:t>
+            </w:r>
+          </w:p>
+        </w:tc>
+        <w:tc>
+          <w:tcPr>
+            <w:tcW w:type="dxa" w:w="1615"/>
+            <w:tcBorders>
+              <w:top w:val="single" w:sz="4" w:space="0" w:color="CBCBCB"/>
+              <w:left w:val="single" w:sz="4" w:space="0" w:color="CBCBCB"/>
+              <w:bottom w:val="single" w:sz="4" w:space="0" w:color="CBCBCB"/>
+              <w:right w:val="single" w:sz="4" w:space="0" w:color="CBCBCB"/>
+            </w:tcBorders>
+          </w:tcPr>
+          <w:p>
+            <w:r>
+              <w:rPr>
+                <w:sz w:val="20"/>
+              </w:rPr>
+              <w:t>✅ Đã áp dụng (2026-07-29)</w:t>
+            </w:r>
+          </w:p>
+        </w:tc>
+      </w:tr>
+      <w:tr>
+        <w:tc>
+          <w:tcPr>
+            <w:tcW w:type="dxa" w:w="1615"/>
             <w:shd w:val="clear" w:color="auto" w:fill="B8B3D6"/>
             <w:tcBorders>
               <w:top w:val="single" w:sz="4" w:space="0" w:color="CBCBCB"/>
@@ -5158,13 +5219,13 @@
               <w:rPr>
                 <w:sz w:val="20"/>
               </w:rPr>
-              <w:t>Confidence labels trong CODE-GRAPH.md</w:t>
+              <w:t>P3</w:t>
             </w:r>
           </w:p>
         </w:tc>
         <w:tc>
           <w:tcPr>
-            <w:tcW w:type="dxa" w:w="1938"/>
+            <w:tcW w:type="dxa" w:w="1615"/>
             <w:shd w:val="clear" w:color="auto" w:fill="B8B3D6"/>
             <w:tcBorders>
               <w:top w:val="single" w:sz="4" w:space="0" w:color="CBCBCB"/>
@@ -5178,13 +5239,13 @@
               <w:rPr>
                 <w:sz w:val="20"/>
               </w:rPr>
-              <w:t>Thấp (4–8 giờ)</w:t>
+              <w:t>Confidence labels trong CODE-GRAPH.md</w:t>
             </w:r>
           </w:p>
         </w:tc>
         <w:tc>
           <w:tcPr>
-            <w:tcW w:type="dxa" w:w="1938"/>
+            <w:tcW w:type="dxa" w:w="1615"/>
             <w:shd w:val="clear" w:color="auto" w:fill="B8B3D6"/>
             <w:tcBorders>
               <w:top w:val="single" w:sz="4" w:space="0" w:color="CBCBCB"/>
@@ -5198,13 +5259,13 @@
               <w:rPr>
                 <w:sz w:val="20"/>
               </w:rPr>
-              <w:t>Không có</w:t>
+              <w:t>Thấp (4–8 giờ)</w:t>
             </w:r>
           </w:p>
         </w:tc>
         <w:tc>
           <w:tcPr>
-            <w:tcW w:type="dxa" w:w="1938"/>
+            <w:tcW w:type="dxa" w:w="1615"/>
             <w:shd w:val="clear" w:color="auto" w:fill="B8B3D6"/>
             <w:tcBorders>
               <w:top w:val="single" w:sz="4" w:space="0" w:color="CBCBCB"/>
@@ -5218,112 +5279,13 @@
               <w:rPr>
                 <w:sz w:val="20"/>
               </w:rPr>
-              <w:t>Ngay</w:t>
-            </w:r>
-          </w:p>
-        </w:tc>
-      </w:tr>
-      <w:tr>
-        <w:tc>
-          <w:tcPr>
-            <w:tcW w:type="dxa" w:w="1938"/>
-            <w:tcBorders>
-              <w:top w:val="single" w:sz="4" w:space="0" w:color="CBCBCB"/>
-              <w:left w:val="single" w:sz="4" w:space="0" w:color="CBCBCB"/>
-              <w:bottom w:val="single" w:sz="4" w:space="0" w:color="CBCBCB"/>
-              <w:right w:val="single" w:sz="4" w:space="0" w:color="CBCBCB"/>
-            </w:tcBorders>
-          </w:tcPr>
-          <w:p>
-            <w:r>
-              <w:rPr>
-                <w:sz w:val="20"/>
-              </w:rPr>
-              <w:t>P4</w:t>
+              <w:t>Không có</w:t>
             </w:r>
           </w:p>
         </w:tc>
         <w:tc>
           <w:tcPr>
-            <w:tcW w:type="dxa" w:w="1938"/>
-            <w:tcBorders>
-              <w:top w:val="single" w:sz="4" w:space="0" w:color="CBCBCB"/>
-              <w:left w:val="single" w:sz="4" w:space="0" w:color="CBCBCB"/>
-              <w:bottom w:val="single" w:sz="4" w:space="0" w:color="CBCBCB"/>
-              <w:right w:val="single" w:sz="4" w:space="0" w:color="CBCBCB"/>
-            </w:tcBorders>
-          </w:tcPr>
-          <w:p>
-            <w:r>
-              <w:rPr>
-                <w:sz w:val="20"/>
-              </w:rPr>
-              <w:t>"CODE-GRAPH impact" field trong PR checklist §15.3</w:t>
-            </w:r>
-          </w:p>
-        </w:tc>
-        <w:tc>
-          <w:tcPr>
-            <w:tcW w:type="dxa" w:w="1938"/>
-            <w:tcBorders>
-              <w:top w:val="single" w:sz="4" w:space="0" w:color="CBCBCB"/>
-              <w:left w:val="single" w:sz="4" w:space="0" w:color="CBCBCB"/>
-              <w:bottom w:val="single" w:sz="4" w:space="0" w:color="CBCBCB"/>
-              <w:right w:val="single" w:sz="4" w:space="0" w:color="CBCBCB"/>
-            </w:tcBorders>
-          </w:tcPr>
-          <w:p>
-            <w:r>
-              <w:rPr>
-                <w:sz w:val="20"/>
-              </w:rPr>
-              <w:t>Rất thấp (1–2 giờ)</w:t>
-            </w:r>
-          </w:p>
-        </w:tc>
-        <w:tc>
-          <w:tcPr>
-            <w:tcW w:type="dxa" w:w="1938"/>
-            <w:tcBorders>
-              <w:top w:val="single" w:sz="4" w:space="0" w:color="CBCBCB"/>
-              <w:left w:val="single" w:sz="4" w:space="0" w:color="CBCBCB"/>
-              <w:bottom w:val="single" w:sz="4" w:space="0" w:color="CBCBCB"/>
-              <w:right w:val="single" w:sz="4" w:space="0" w:color="CBCBCB"/>
-            </w:tcBorders>
-          </w:tcPr>
-          <w:p>
-            <w:r>
-              <w:rPr>
-                <w:sz w:val="20"/>
-              </w:rPr>
-              <w:t>Không có</w:t>
-            </w:r>
-          </w:p>
-        </w:tc>
-        <w:tc>
-          <w:tcPr>
-            <w:tcW w:type="dxa" w:w="1938"/>
-            <w:tcBorders>
-              <w:top w:val="single" w:sz="4" w:space="0" w:color="CBCBCB"/>
-              <w:left w:val="single" w:sz="4" w:space="0" w:color="CBCBCB"/>
-              <w:bottom w:val="single" w:sz="4" w:space="0" w:color="CBCBCB"/>
-              <w:right w:val="single" w:sz="4" w:space="0" w:color="CBCBCB"/>
-            </w:tcBorders>
-          </w:tcPr>
-          <w:p>
-            <w:r>
-              <w:rPr>
-                <w:sz w:val="20"/>
-              </w:rPr>
-              <w:t>Ngay</w:t>
-            </w:r>
-          </w:p>
-        </w:tc>
-      </w:tr>
-      <w:tr>
-        <w:tc>
-          <w:tcPr>
-            <w:tcW w:type="dxa" w:w="1938"/>
+            <w:tcW w:type="dxa" w:w="1615"/>
             <w:shd w:val="clear" w:color="auto" w:fill="B8B3D6"/>
             <w:tcBorders>
               <w:top w:val="single" w:sz="4" w:space="0" w:color="CBCBCB"/>
@@ -5337,13 +5299,13 @@
               <w:rPr>
                 <w:sz w:val="20"/>
               </w:rPr>
-              <w:t>P5</w:t>
+              <w:t>Ngay</w:t>
             </w:r>
           </w:p>
         </w:tc>
         <w:tc>
           <w:tcPr>
-            <w:tcW w:type="dxa" w:w="1938"/>
+            <w:tcW w:type="dxa" w:w="1615"/>
             <w:shd w:val="clear" w:color="auto" w:fill="B8B3D6"/>
             <w:tcBorders>
               <w:top w:val="single" w:sz="4" w:space="0" w:color="CBCBCB"/>
@@ -5357,13 +5319,131 @@
               <w:rPr>
                 <w:sz w:val="20"/>
               </w:rPr>
-              <w:t>LESSONS.md — Tích lũy institutional knowledge</w:t>
+              <w:t>✅ Đã áp dụng (2026-07-29)</w:t>
+            </w:r>
+          </w:p>
+        </w:tc>
+      </w:tr>
+      <w:tr>
+        <w:tc>
+          <w:tcPr>
+            <w:tcW w:type="dxa" w:w="1615"/>
+            <w:tcBorders>
+              <w:top w:val="single" w:sz="4" w:space="0" w:color="CBCBCB"/>
+              <w:left w:val="single" w:sz="4" w:space="0" w:color="CBCBCB"/>
+              <w:bottom w:val="single" w:sz="4" w:space="0" w:color="CBCBCB"/>
+              <w:right w:val="single" w:sz="4" w:space="0" w:color="CBCBCB"/>
+            </w:tcBorders>
+          </w:tcPr>
+          <w:p>
+            <w:r>
+              <w:rPr>
+                <w:sz w:val="20"/>
+              </w:rPr>
+              <w:t>P4</w:t>
             </w:r>
           </w:p>
         </w:tc>
         <w:tc>
           <w:tcPr>
-            <w:tcW w:type="dxa" w:w="1938"/>
+            <w:tcW w:type="dxa" w:w="1615"/>
+            <w:tcBorders>
+              <w:top w:val="single" w:sz="4" w:space="0" w:color="CBCBCB"/>
+              <w:left w:val="single" w:sz="4" w:space="0" w:color="CBCBCB"/>
+              <w:bottom w:val="single" w:sz="4" w:space="0" w:color="CBCBCB"/>
+              <w:right w:val="single" w:sz="4" w:space="0" w:color="CBCBCB"/>
+            </w:tcBorders>
+          </w:tcPr>
+          <w:p>
+            <w:r>
+              <w:rPr>
+                <w:sz w:val="20"/>
+              </w:rPr>
+              <w:t>"CODE-GRAPH impact" field trong PR checklist §15.3</w:t>
+            </w:r>
+          </w:p>
+        </w:tc>
+        <w:tc>
+          <w:tcPr>
+            <w:tcW w:type="dxa" w:w="1615"/>
+            <w:tcBorders>
+              <w:top w:val="single" w:sz="4" w:space="0" w:color="CBCBCB"/>
+              <w:left w:val="single" w:sz="4" w:space="0" w:color="CBCBCB"/>
+              <w:bottom w:val="single" w:sz="4" w:space="0" w:color="CBCBCB"/>
+              <w:right w:val="single" w:sz="4" w:space="0" w:color="CBCBCB"/>
+            </w:tcBorders>
+          </w:tcPr>
+          <w:p>
+            <w:r>
+              <w:rPr>
+                <w:sz w:val="20"/>
+              </w:rPr>
+              <w:t>Rất thấp (1–2 giờ)</w:t>
+            </w:r>
+          </w:p>
+        </w:tc>
+        <w:tc>
+          <w:tcPr>
+            <w:tcW w:type="dxa" w:w="1615"/>
+            <w:tcBorders>
+              <w:top w:val="single" w:sz="4" w:space="0" w:color="CBCBCB"/>
+              <w:left w:val="single" w:sz="4" w:space="0" w:color="CBCBCB"/>
+              <w:bottom w:val="single" w:sz="4" w:space="0" w:color="CBCBCB"/>
+              <w:right w:val="single" w:sz="4" w:space="0" w:color="CBCBCB"/>
+            </w:tcBorders>
+          </w:tcPr>
+          <w:p>
+            <w:r>
+              <w:rPr>
+                <w:sz w:val="20"/>
+              </w:rPr>
+              <w:t>Không có</w:t>
+            </w:r>
+          </w:p>
+        </w:tc>
+        <w:tc>
+          <w:tcPr>
+            <w:tcW w:type="dxa" w:w="1615"/>
+            <w:tcBorders>
+              <w:top w:val="single" w:sz="4" w:space="0" w:color="CBCBCB"/>
+              <w:left w:val="single" w:sz="4" w:space="0" w:color="CBCBCB"/>
+              <w:bottom w:val="single" w:sz="4" w:space="0" w:color="CBCBCB"/>
+              <w:right w:val="single" w:sz="4" w:space="0" w:color="CBCBCB"/>
+            </w:tcBorders>
+          </w:tcPr>
+          <w:p>
+            <w:r>
+              <w:rPr>
+                <w:sz w:val="20"/>
+              </w:rPr>
+              <w:t>Ngay</w:t>
+            </w:r>
+          </w:p>
+        </w:tc>
+        <w:tc>
+          <w:tcPr>
+            <w:tcW w:type="dxa" w:w="1615"/>
+            <w:tcBorders>
+              <w:top w:val="single" w:sz="4" w:space="0" w:color="CBCBCB"/>
+              <w:left w:val="single" w:sz="4" w:space="0" w:color="CBCBCB"/>
+              <w:bottom w:val="single" w:sz="4" w:space="0" w:color="CBCBCB"/>
+              <w:right w:val="single" w:sz="4" w:space="0" w:color="CBCBCB"/>
+            </w:tcBorders>
+          </w:tcPr>
+          <w:p>
+            <w:r>
+              <w:rPr>
+                <w:sz w:val="20"/>
+              </w:rPr>
+              <w:t>✅ Đã áp dụng (2026-07-29)</w:t>
+            </w:r>
+          </w:p>
+        </w:tc>
+      </w:tr>
+      <w:tr>
+        <w:tc>
+          <w:tcPr>
+            <w:tcW w:type="dxa" w:w="1615"/>
             <w:shd w:val="clear" w:color="auto" w:fill="B8B3D6"/>
             <w:tcBorders>
               <w:top w:val="single" w:sz="4" w:space="0" w:color="CBCBCB"/>
@@ -5377,13 +5457,13 @@
               <w:rPr>
                 <w:sz w:val="20"/>
               </w:rPr>
-              <w:t>Thấp (4–6 giờ)</w:t>
+              <w:t>P5</w:t>
             </w:r>
           </w:p>
         </w:tc>
         <w:tc>
           <w:tcPr>
-            <w:tcW w:type="dxa" w:w="1938"/>
+            <w:tcW w:type="dxa" w:w="1615"/>
             <w:shd w:val="clear" w:color="auto" w:fill="B8B3D6"/>
             <w:tcBorders>
               <w:top w:val="single" w:sz="4" w:space="0" w:color="CBCBCB"/>
@@ -5397,13 +5477,13 @@
               <w:rPr>
                 <w:sz w:val="20"/>
               </w:rPr>
-              <w:t>Không có</w:t>
+              <w:t>LESSONS.md — Tích lũy institutional knowledge</w:t>
             </w:r>
           </w:p>
         </w:tc>
         <w:tc>
           <w:tcPr>
-            <w:tcW w:type="dxa" w:w="1938"/>
+            <w:tcW w:type="dxa" w:w="1615"/>
             <w:shd w:val="clear" w:color="auto" w:fill="B8B3D6"/>
             <w:tcBorders>
               <w:top w:val="single" w:sz="4" w:space="0" w:color="CBCBCB"/>
@@ -5417,7 +5497,67 @@
               <w:rPr>
                 <w:sz w:val="20"/>
               </w:rPr>
+              <w:t>Thấp (4–6 giờ)</w:t>
+            </w:r>
+          </w:p>
+        </w:tc>
+        <w:tc>
+          <w:tcPr>
+            <w:tcW w:type="dxa" w:w="1615"/>
+            <w:shd w:val="clear" w:color="auto" w:fill="B8B3D6"/>
+            <w:tcBorders>
+              <w:top w:val="single" w:sz="4" w:space="0" w:color="CBCBCB"/>
+              <w:left w:val="single" w:sz="4" w:space="0" w:color="CBCBCB"/>
+              <w:bottom w:val="single" w:sz="4" w:space="0" w:color="CBCBCB"/>
+              <w:right w:val="single" w:sz="4" w:space="0" w:color="CBCBCB"/>
+            </w:tcBorders>
+          </w:tcPr>
+          <w:p>
+            <w:r>
+              <w:rPr>
+                <w:sz w:val="20"/>
+              </w:rPr>
+              <w:t>Không có</w:t>
+            </w:r>
+          </w:p>
+        </w:tc>
+        <w:tc>
+          <w:tcPr>
+            <w:tcW w:type="dxa" w:w="1615"/>
+            <w:shd w:val="clear" w:color="auto" w:fill="B8B3D6"/>
+            <w:tcBorders>
+              <w:top w:val="single" w:sz="4" w:space="0" w:color="CBCBCB"/>
+              <w:left w:val="single" w:sz="4" w:space="0" w:color="CBCBCB"/>
+              <w:bottom w:val="single" w:sz="4" w:space="0" w:color="CBCBCB"/>
+              <w:right w:val="single" w:sz="4" w:space="0" w:color="CBCBCB"/>
+            </w:tcBorders>
+          </w:tcPr>
+          <w:p>
+            <w:r>
+              <w:rPr>
+                <w:sz w:val="20"/>
+              </w:rPr>
               <w:t>Ngay</w:t>
+            </w:r>
+          </w:p>
+        </w:tc>
+        <w:tc>
+          <w:tcPr>
+            <w:tcW w:type="dxa" w:w="1615"/>
+            <w:shd w:val="clear" w:color="auto" w:fill="B8B3D6"/>
+            <w:tcBorders>
+              <w:top w:val="single" w:sz="4" w:space="0" w:color="CBCBCB"/>
+              <w:left w:val="single" w:sz="4" w:space="0" w:color="CBCBCB"/>
+              <w:bottom w:val="single" w:sz="4" w:space="0" w:color="CBCBCB"/>
+              <w:right w:val="single" w:sz="4" w:space="0" w:color="CBCBCB"/>
+            </w:tcBorders>
+          </w:tcPr>
+          <w:p>
+            <w:r>
+              <w:rPr>
+                <w:sz w:val="20"/>
+              </w:rPr>
+              <w:t>✅ Đã áp dụng (2026-07-29)</w:t>
             </w:r>
           </w:p>
         </w:tc>
@@ -8561,9 +8701,30 @@
       </w:pPr>
       <w:r>
         <w:rPr>
+          <w:b/>
           <w:color w:val="4A3F8C"/>
         </w:rPr>
-        <w:t>Đề xuất nào được chọn sẽ được áp dụng tại Bước 3A.3 (sau khi user xác nhận ở Bước 3A.2).</w:t>
+        <w:t>Trạng thái áp dụng (2026-07-29 — Bước 3A.3):</w:t>
+      </w:r>
+      <w:r>
+        <w:rPr>
+          <w:color w:val="4A3F8C"/>
+        </w:rPr>
+        <w:t xml:space="preserve"> User xác nhận áp dụng CẢ 5 đề xuất P1–P5. Đã hoàn thành tất cả. Chi tiết thay đổi: xem </w:t>
+      </w:r>
+      <w:r>
+        <w:rPr>
+          <w:rFonts w:ascii="Courier New" w:hAnsi="Courier New"/>
+          <w:color w:val="F05922"/>
+          <w:sz w:val="18"/>
+        </w:rPr>
+        <w:t>docs/plans/PLAN-github-research-graphify-2026-07-29/steps/STEP-3A.3-ap-dung-de-xuat.md</w:t>
+      </w:r>
+      <w:r>
+        <w:rPr>
+          <w:color w:val="4A3F8C"/>
+        </w:rPr>
+        <w:t>.</w:t>
       </w:r>
     </w:p>
     <w:sectPr>

</xml_diff>